<commit_message>
style(report): fix column widths, text wrapping, and alignment in executive report
</commit_message>
<xml_diff>
--- a/TrinhHaiDang_Day26_dashboard.docx
+++ b/TrinhHaiDang_Day26_dashboard.docx
@@ -19,7 +19,7 @@
     </w:p>
     <w:p>
       <w:pPr>
-        <w:spacing w:before="0" w:after="60" w:line="264" w:lineRule="auto"/>
+        <w:spacing w:before="0" w:after="60"/>
       </w:pPr>
       <w:r>
         <w:rPr>
@@ -79,7 +79,7 @@
           <w:color w:val="1F2937"/>
           <w:sz w:val="15"/>
         </w:rPr>
-        <w:t xml:space="preserve">B2B (Higher Education)  |  </w:t>
+        <w:t xml:space="preserve">B2B Higher Education  |  </w:t>
       </w:r>
       <w:r>
         <w:rPr>
@@ -130,12 +130,12 @@
         <w:tblLook w:firstColumn="1" w:firstRow="1" w:lastColumn="0" w:lastRow="0" w:noHBand="0" w:noVBand="1" w:val="04A0"/>
       </w:tblPr>
       <w:tblGrid>
-        <w:gridCol w:w="10757"/>
+        <w:gridCol w:w="10814"/>
       </w:tblGrid>
       <w:tr>
         <w:tc>
           <w:tcPr>
-            <w:tcW w:type="dxa" w:w="10757"/>
+            <w:tcW w:type="dxa" w:w="10815"/>
             <w:tcMar>
               <w:top w:w="50" w:type="dxa"/>
               <w:bottom w:w="50" w:type="dxa"/>
@@ -215,12 +215,7 @@
     </w:tbl>
     <w:p>
       <w:pPr>
-        <w:spacing w:before="40" w:after="20"/>
-      </w:pPr>
-    </w:p>
-    <w:p>
-      <w:pPr>
-        <w:spacing w:before="0" w:after="40"/>
+        <w:spacing w:before="60" w:after="40"/>
       </w:pPr>
       <w:r>
         <w:rPr>
@@ -248,33 +243,33 @@
         </w:tblBorders>
       </w:tblPr>
       <w:tblGrid>
-        <w:gridCol w:w="1195"/>
-        <w:gridCol w:w="1195"/>
-        <w:gridCol w:w="1195"/>
-        <w:gridCol w:w="1195"/>
-        <w:gridCol w:w="1195"/>
-        <w:gridCol w:w="1195"/>
-        <w:gridCol w:w="1195"/>
-        <w:gridCol w:w="1195"/>
-        <w:gridCol w:w="1195"/>
+        <w:gridCol w:w="1202"/>
+        <w:gridCol w:w="1202"/>
+        <w:gridCol w:w="1202"/>
+        <w:gridCol w:w="1202"/>
+        <w:gridCol w:w="1202"/>
+        <w:gridCol w:w="1202"/>
+        <w:gridCol w:w="1202"/>
+        <w:gridCol w:w="1202"/>
+        <w:gridCol w:w="1202"/>
       </w:tblGrid>
       <w:tr>
         <w:tc>
           <w:tcPr>
-            <w:tcW w:type="dxa" w:w="576"/>
+            <w:tcW w:type="dxa" w:w="432"/>
             <w:tcMar>
               <w:top w:w="40" w:type="dxa"/>
               <w:bottom w:w="40" w:type="dxa"/>
-              <w:left w:w="80" w:type="dxa"/>
-              <w:right w:w="80" w:type="dxa"/>
+              <w:left w:w="70" w:type="dxa"/>
+              <w:right w:w="70" w:type="dxa"/>
             </w:tcMar>
             <w:shd w:fill="0F294A"/>
             <w:vAlign w:val="center"/>
           </w:tcPr>
           <w:p>
             <w:pPr>
-              <w:spacing w:before="0" w:after="0" w:line="252" w:lineRule="auto"/>
-              <w:jc w:val="left"/>
+              <w:spacing w:before="0" w:after="0" w:line="259" w:lineRule="auto"/>
+              <w:jc w:val="center"/>
             </w:pPr>
             <w:r>
               <w:rPr>
@@ -290,20 +285,20 @@
         </w:tc>
         <w:tc>
           <w:tcPr>
-            <w:tcW w:type="dxa" w:w="576"/>
+            <w:tcW w:type="dxa" w:w="605"/>
             <w:tcMar>
               <w:top w:w="40" w:type="dxa"/>
               <w:bottom w:w="40" w:type="dxa"/>
-              <w:left w:w="80" w:type="dxa"/>
-              <w:right w:w="80" w:type="dxa"/>
+              <w:left w:w="70" w:type="dxa"/>
+              <w:right w:w="70" w:type="dxa"/>
             </w:tcMar>
             <w:shd w:fill="0F294A"/>
             <w:vAlign w:val="center"/>
           </w:tcPr>
           <w:p>
             <w:pPr>
-              <w:spacing w:before="0" w:after="0" w:line="252" w:lineRule="auto"/>
-              <w:jc w:val="left"/>
+              <w:spacing w:before="0" w:after="0" w:line="259" w:lineRule="auto"/>
+              <w:jc w:val="center"/>
             </w:pPr>
             <w:r>
               <w:rPr>
@@ -313,25 +308,25 @@
                 <w:color w:val="FFFFFF"/>
                 <w:sz w:val="13"/>
               </w:rPr>
-              <w:t>ID</w:t>
+              <w:t>Mã</w:t>
             </w:r>
           </w:p>
         </w:tc>
         <w:tc>
           <w:tcPr>
-            <w:tcW w:type="dxa" w:w="2664"/>
+            <w:tcW w:type="dxa" w:w="2808"/>
             <w:tcMar>
               <w:top w:w="40" w:type="dxa"/>
               <w:bottom w:w="40" w:type="dxa"/>
-              <w:left w:w="80" w:type="dxa"/>
-              <w:right w:w="80" w:type="dxa"/>
+              <w:left w:w="70" w:type="dxa"/>
+              <w:right w:w="70" w:type="dxa"/>
             </w:tcMar>
             <w:shd w:fill="0F294A"/>
             <w:vAlign w:val="center"/>
           </w:tcPr>
           <w:p>
             <w:pPr>
-              <w:spacing w:before="0" w:after="0" w:line="252" w:lineRule="auto"/>
+              <w:spacing w:before="0" w:after="0" w:line="259" w:lineRule="auto"/>
               <w:jc w:val="left"/>
             </w:pPr>
             <w:r>
@@ -348,19 +343,19 @@
         </w:tc>
         <w:tc>
           <w:tcPr>
-            <w:tcW w:type="dxa" w:w="1368"/>
+            <w:tcW w:type="dxa" w:w="1325"/>
             <w:tcMar>
               <w:top w:w="40" w:type="dxa"/>
               <w:bottom w:w="40" w:type="dxa"/>
-              <w:left w:w="80" w:type="dxa"/>
-              <w:right w:w="80" w:type="dxa"/>
+              <w:left w:w="70" w:type="dxa"/>
+              <w:right w:w="70" w:type="dxa"/>
             </w:tcMar>
             <w:shd w:fill="0F294A"/>
             <w:vAlign w:val="center"/>
           </w:tcPr>
           <w:p>
             <w:pPr>
-              <w:spacing w:before="0" w:after="0" w:line="252" w:lineRule="auto"/>
+              <w:spacing w:before="0" w:after="0" w:line="259" w:lineRule="auto"/>
               <w:jc w:val="left"/>
             </w:pPr>
             <w:r>
@@ -377,19 +372,19 @@
         </w:tc>
         <w:tc>
           <w:tcPr>
-            <w:tcW w:type="dxa" w:w="1008"/>
+            <w:tcW w:type="dxa" w:w="1037"/>
             <w:tcMar>
               <w:top w:w="40" w:type="dxa"/>
               <w:bottom w:w="40" w:type="dxa"/>
-              <w:left w:w="80" w:type="dxa"/>
-              <w:right w:w="80" w:type="dxa"/>
+              <w:left w:w="70" w:type="dxa"/>
+              <w:right w:w="70" w:type="dxa"/>
             </w:tcMar>
             <w:shd w:fill="0F294A"/>
             <w:vAlign w:val="center"/>
           </w:tcPr>
           <w:p>
             <w:pPr>
-              <w:spacing w:before="0" w:after="0" w:line="252" w:lineRule="auto"/>
+              <w:spacing w:before="0" w:after="0" w:line="259" w:lineRule="auto"/>
               <w:jc w:val="left"/>
             </w:pPr>
             <w:r>
@@ -406,19 +401,19 @@
         </w:tc>
         <w:tc>
           <w:tcPr>
-            <w:tcW w:type="dxa" w:w="1080"/>
+            <w:tcW w:type="dxa" w:w="1094"/>
             <w:tcMar>
               <w:top w:w="40" w:type="dxa"/>
               <w:bottom w:w="40" w:type="dxa"/>
-              <w:left w:w="80" w:type="dxa"/>
-              <w:right w:w="80" w:type="dxa"/>
+              <w:left w:w="70" w:type="dxa"/>
+              <w:right w:w="70" w:type="dxa"/>
             </w:tcMar>
             <w:shd w:fill="0F294A"/>
             <w:vAlign w:val="center"/>
           </w:tcPr>
           <w:p>
             <w:pPr>
-              <w:spacing w:before="0" w:after="0" w:line="252" w:lineRule="auto"/>
+              <w:spacing w:before="0" w:after="0" w:line="259" w:lineRule="auto"/>
               <w:jc w:val="left"/>
             </w:pPr>
             <w:r>
@@ -435,19 +430,19 @@
         </w:tc>
         <w:tc>
           <w:tcPr>
-            <w:tcW w:type="dxa" w:w="936"/>
+            <w:tcW w:type="dxa" w:w="950"/>
             <w:tcMar>
               <w:top w:w="40" w:type="dxa"/>
               <w:bottom w:w="40" w:type="dxa"/>
-              <w:left w:w="80" w:type="dxa"/>
-              <w:right w:w="80" w:type="dxa"/>
+              <w:left w:w="70" w:type="dxa"/>
+              <w:right w:w="70" w:type="dxa"/>
             </w:tcMar>
             <w:shd w:fill="0F294A"/>
             <w:vAlign w:val="center"/>
           </w:tcPr>
           <w:p>
             <w:pPr>
-              <w:spacing w:before="0" w:after="0" w:line="252" w:lineRule="auto"/>
+              <w:spacing w:before="0" w:after="0" w:line="259" w:lineRule="auto"/>
               <w:jc w:val="left"/>
             </w:pPr>
             <w:r>
@@ -464,19 +459,19 @@
         </w:tc>
         <w:tc>
           <w:tcPr>
-            <w:tcW w:type="dxa" w:w="1224"/>
+            <w:tcW w:type="dxa" w:w="1238"/>
             <w:tcMar>
               <w:top w:w="40" w:type="dxa"/>
               <w:bottom w:w="40" w:type="dxa"/>
-              <w:left w:w="80" w:type="dxa"/>
-              <w:right w:w="80" w:type="dxa"/>
+              <w:left w:w="70" w:type="dxa"/>
+              <w:right w:w="70" w:type="dxa"/>
             </w:tcMar>
             <w:shd w:fill="0F294A"/>
             <w:vAlign w:val="center"/>
           </w:tcPr>
           <w:p>
             <w:pPr>
-              <w:spacing w:before="0" w:after="0" w:line="252" w:lineRule="auto"/>
+              <w:spacing w:before="0" w:after="0" w:line="259" w:lineRule="auto"/>
               <w:jc w:val="left"/>
             </w:pPr>
             <w:r>
@@ -497,15 +492,15 @@
             <w:tcMar>
               <w:top w:w="40" w:type="dxa"/>
               <w:bottom w:w="40" w:type="dxa"/>
-              <w:left w:w="80" w:type="dxa"/>
-              <w:right w:w="80" w:type="dxa"/>
+              <w:left w:w="70" w:type="dxa"/>
+              <w:right w:w="70" w:type="dxa"/>
             </w:tcMar>
             <w:shd w:fill="0F294A"/>
             <w:vAlign w:val="center"/>
           </w:tcPr>
           <w:p>
             <w:pPr>
-              <w:spacing w:before="0" w:after="0" w:line="252" w:lineRule="auto"/>
+              <w:spacing w:before="0" w:after="0" w:line="259" w:lineRule="auto"/>
               <w:jc w:val="left"/>
             </w:pPr>
             <w:r>
@@ -524,49 +519,49 @@
       <w:tr>
         <w:tc>
           <w:tcPr>
-            <w:tcW w:type="dxa" w:w="576"/>
+            <w:tcW w:type="dxa" w:w="432"/>
             <w:tcMar>
               <w:top w:w="40" w:type="dxa"/>
               <w:bottom w:w="40" w:type="dxa"/>
-              <w:left w:w="80" w:type="dxa"/>
-              <w:right w:w="80" w:type="dxa"/>
+              <w:left w:w="70" w:type="dxa"/>
+              <w:right w:w="70" w:type="dxa"/>
             </w:tcMar>
             <w:shd w:fill="FFFFFF"/>
             <w:vAlign w:val="center"/>
           </w:tcPr>
           <w:p>
             <w:pPr>
-              <w:spacing w:before="0" w:after="0" w:line="252" w:lineRule="auto"/>
-              <w:jc w:val="left"/>
+              <w:spacing w:before="0" w:after="0" w:line="259" w:lineRule="auto"/>
+              <w:jc w:val="center"/>
             </w:pPr>
             <w:r>
               <w:rPr>
                 <w:rFonts w:ascii="Arial" w:hAnsi="Arial"/>
-                <w:b w:val="0"/>
+                <w:b/>
                 <w:i w:val="0"/>
-                <w:color w:val="4B5563"/>
-                <w:sz w:val="13"/>
+                <w:color w:val="0F294A"/>
+                <w:sz w:val="14"/>
               </w:rPr>
-              <w:t>Leading</w:t>
+              <w:t>L</w:t>
             </w:r>
           </w:p>
         </w:tc>
         <w:tc>
           <w:tcPr>
-            <w:tcW w:type="dxa" w:w="576"/>
+            <w:tcW w:type="dxa" w:w="605"/>
             <w:tcMar>
               <w:top w:w="40" w:type="dxa"/>
               <w:bottom w:w="40" w:type="dxa"/>
-              <w:left w:w="80" w:type="dxa"/>
-              <w:right w:w="80" w:type="dxa"/>
+              <w:left w:w="70" w:type="dxa"/>
+              <w:right w:w="70" w:type="dxa"/>
             </w:tcMar>
             <w:shd w:fill="FFFFFF"/>
             <w:vAlign w:val="center"/>
           </w:tcPr>
           <w:p>
             <w:pPr>
-              <w:spacing w:before="0" w:after="0" w:line="252" w:lineRule="auto"/>
-              <w:jc w:val="left"/>
+              <w:spacing w:before="0" w:after="0" w:line="259" w:lineRule="auto"/>
+              <w:jc w:val="center"/>
             </w:pPr>
             <w:r>
               <w:rPr>
@@ -582,19 +577,19 @@
         </w:tc>
         <w:tc>
           <w:tcPr>
-            <w:tcW w:type="dxa" w:w="2664"/>
+            <w:tcW w:type="dxa" w:w="2808"/>
             <w:tcMar>
               <w:top w:w="40" w:type="dxa"/>
               <w:bottom w:w="40" w:type="dxa"/>
-              <w:left w:w="80" w:type="dxa"/>
-              <w:right w:w="80" w:type="dxa"/>
+              <w:left w:w="70" w:type="dxa"/>
+              <w:right w:w="70" w:type="dxa"/>
             </w:tcMar>
             <w:shd w:fill="FFFFFF"/>
             <w:vAlign w:val="center"/>
           </w:tcPr>
           <w:p>
             <w:pPr>
-              <w:spacing w:before="0" w:after="0" w:line="252" w:lineRule="auto"/>
+              <w:spacing w:before="0" w:after="0" w:line="259" w:lineRule="auto"/>
               <w:jc w:val="left"/>
             </w:pPr>
             <w:r>
@@ -622,19 +617,19 @@
         </w:tc>
         <w:tc>
           <w:tcPr>
-            <w:tcW w:type="dxa" w:w="1368"/>
+            <w:tcW w:type="dxa" w:w="1325"/>
             <w:tcMar>
               <w:top w:w="40" w:type="dxa"/>
               <w:bottom w:w="40" w:type="dxa"/>
-              <w:left w:w="80" w:type="dxa"/>
-              <w:right w:w="80" w:type="dxa"/>
+              <w:left w:w="70" w:type="dxa"/>
+              <w:right w:w="70" w:type="dxa"/>
             </w:tcMar>
             <w:shd w:fill="FFFFFF"/>
             <w:vAlign w:val="center"/>
           </w:tcPr>
           <w:p>
             <w:pPr>
-              <w:spacing w:before="0" w:after="0" w:line="252" w:lineRule="auto"/>
+              <w:spacing w:before="0" w:after="0" w:line="259" w:lineRule="auto"/>
               <w:jc w:val="left"/>
             </w:pPr>
             <w:r>
@@ -653,19 +648,19 @@
         </w:tc>
         <w:tc>
           <w:tcPr>
-            <w:tcW w:type="dxa" w:w="1008"/>
+            <w:tcW w:type="dxa" w:w="1037"/>
             <w:tcMar>
               <w:top w:w="40" w:type="dxa"/>
               <w:bottom w:w="40" w:type="dxa"/>
-              <w:left w:w="80" w:type="dxa"/>
-              <w:right w:w="80" w:type="dxa"/>
+              <w:left w:w="70" w:type="dxa"/>
+              <w:right w:w="70" w:type="dxa"/>
             </w:tcMar>
             <w:shd w:fill="FFFFFF"/>
             <w:vAlign w:val="center"/>
           </w:tcPr>
           <w:p>
             <w:pPr>
-              <w:spacing w:before="0" w:after="0" w:line="252" w:lineRule="auto"/>
+              <w:spacing w:before="0" w:after="0" w:line="259" w:lineRule="auto"/>
               <w:jc w:val="left"/>
             </w:pPr>
             <w:r>
@@ -682,19 +677,19 @@
         </w:tc>
         <w:tc>
           <w:tcPr>
-            <w:tcW w:type="dxa" w:w="1080"/>
+            <w:tcW w:type="dxa" w:w="1094"/>
             <w:tcMar>
               <w:top w:w="40" w:type="dxa"/>
               <w:bottom w:w="40" w:type="dxa"/>
-              <w:left w:w="80" w:type="dxa"/>
-              <w:right w:w="80" w:type="dxa"/>
+              <w:left w:w="70" w:type="dxa"/>
+              <w:right w:w="70" w:type="dxa"/>
             </w:tcMar>
             <w:shd w:fill="FFFFFF"/>
             <w:vAlign w:val="center"/>
           </w:tcPr>
           <w:p>
             <w:pPr>
-              <w:spacing w:before="0" w:after="0" w:line="252" w:lineRule="auto"/>
+              <w:spacing w:before="0" w:after="0" w:line="259" w:lineRule="auto"/>
               <w:jc w:val="left"/>
             </w:pPr>
             <w:r>
@@ -711,19 +706,19 @@
         </w:tc>
         <w:tc>
           <w:tcPr>
-            <w:tcW w:type="dxa" w:w="936"/>
+            <w:tcW w:type="dxa" w:w="950"/>
             <w:tcMar>
               <w:top w:w="40" w:type="dxa"/>
               <w:bottom w:w="40" w:type="dxa"/>
-              <w:left w:w="80" w:type="dxa"/>
-              <w:right w:w="80" w:type="dxa"/>
+              <w:left w:w="70" w:type="dxa"/>
+              <w:right w:w="70" w:type="dxa"/>
             </w:tcMar>
             <w:shd w:fill="FFFFFF"/>
             <w:vAlign w:val="center"/>
           </w:tcPr>
           <w:p>
             <w:pPr>
-              <w:spacing w:before="0" w:after="0" w:line="252" w:lineRule="auto"/>
+              <w:spacing w:before="0" w:after="0" w:line="259" w:lineRule="auto"/>
               <w:jc w:val="left"/>
             </w:pPr>
             <w:r>
@@ -740,19 +735,19 @@
         </w:tc>
         <w:tc>
           <w:tcPr>
-            <w:tcW w:type="dxa" w:w="1224"/>
+            <w:tcW w:type="dxa" w:w="1238"/>
             <w:tcMar>
               <w:top w:w="40" w:type="dxa"/>
               <w:bottom w:w="40" w:type="dxa"/>
-              <w:left w:w="80" w:type="dxa"/>
-              <w:right w:w="80" w:type="dxa"/>
+              <w:left w:w="70" w:type="dxa"/>
+              <w:right w:w="70" w:type="dxa"/>
             </w:tcMar>
             <w:shd w:fill="FFFFFF"/>
             <w:vAlign w:val="center"/>
           </w:tcPr>
           <w:p>
             <w:pPr>
-              <w:spacing w:before="0" w:after="0" w:line="252" w:lineRule="auto"/>
+              <w:spacing w:before="0" w:after="0" w:line="259" w:lineRule="auto"/>
               <w:jc w:val="left"/>
             </w:pPr>
             <w:r>
@@ -775,15 +770,15 @@
             <w:tcMar>
               <w:top w:w="40" w:type="dxa"/>
               <w:bottom w:w="40" w:type="dxa"/>
-              <w:left w:w="80" w:type="dxa"/>
-              <w:right w:w="80" w:type="dxa"/>
+              <w:left w:w="70" w:type="dxa"/>
+              <w:right w:w="70" w:type="dxa"/>
             </w:tcMar>
             <w:shd w:fill="FFFFFF"/>
             <w:vAlign w:val="center"/>
           </w:tcPr>
           <w:p>
             <w:pPr>
-              <w:spacing w:before="0" w:after="0" w:line="252" w:lineRule="auto"/>
+              <w:spacing w:before="0" w:after="0" w:line="259" w:lineRule="auto"/>
               <w:jc w:val="left"/>
             </w:pPr>
             <w:r>
@@ -804,49 +799,49 @@
       <w:tr>
         <w:tc>
           <w:tcPr>
-            <w:tcW w:type="dxa" w:w="576"/>
+            <w:tcW w:type="dxa" w:w="432"/>
             <w:tcMar>
               <w:top w:w="40" w:type="dxa"/>
               <w:bottom w:w="40" w:type="dxa"/>
-              <w:left w:w="80" w:type="dxa"/>
-              <w:right w:w="80" w:type="dxa"/>
+              <w:left w:w="70" w:type="dxa"/>
+              <w:right w:w="70" w:type="dxa"/>
             </w:tcMar>
             <w:shd w:fill="F8FAFC"/>
             <w:vAlign w:val="center"/>
           </w:tcPr>
           <w:p>
             <w:pPr>
-              <w:spacing w:before="0" w:after="0" w:line="252" w:lineRule="auto"/>
-              <w:jc w:val="left"/>
+              <w:spacing w:before="0" w:after="0" w:line="259" w:lineRule="auto"/>
+              <w:jc w:val="center"/>
             </w:pPr>
             <w:r>
               <w:rPr>
                 <w:rFonts w:ascii="Arial" w:hAnsi="Arial"/>
-                <w:b w:val="0"/>
+                <w:b/>
                 <w:i w:val="0"/>
-                <w:color w:val="4B5563"/>
-                <w:sz w:val="13"/>
+                <w:color w:val="0F294A"/>
+                <w:sz w:val="14"/>
               </w:rPr>
-              <w:t>Leading</w:t>
+              <w:t>L</w:t>
             </w:r>
           </w:p>
         </w:tc>
         <w:tc>
           <w:tcPr>
-            <w:tcW w:type="dxa" w:w="576"/>
+            <w:tcW w:type="dxa" w:w="605"/>
             <w:tcMar>
               <w:top w:w="40" w:type="dxa"/>
               <w:bottom w:w="40" w:type="dxa"/>
-              <w:left w:w="80" w:type="dxa"/>
-              <w:right w:w="80" w:type="dxa"/>
+              <w:left w:w="70" w:type="dxa"/>
+              <w:right w:w="70" w:type="dxa"/>
             </w:tcMar>
             <w:shd w:fill="F8FAFC"/>
             <w:vAlign w:val="center"/>
           </w:tcPr>
           <w:p>
             <w:pPr>
-              <w:spacing w:before="0" w:after="0" w:line="252" w:lineRule="auto"/>
-              <w:jc w:val="left"/>
+              <w:spacing w:before="0" w:after="0" w:line="259" w:lineRule="auto"/>
+              <w:jc w:val="center"/>
             </w:pPr>
             <w:r>
               <w:rPr>
@@ -862,19 +857,19 @@
         </w:tc>
         <w:tc>
           <w:tcPr>
-            <w:tcW w:type="dxa" w:w="2664"/>
+            <w:tcW w:type="dxa" w:w="2808"/>
             <w:tcMar>
               <w:top w:w="40" w:type="dxa"/>
               <w:bottom w:w="40" w:type="dxa"/>
-              <w:left w:w="80" w:type="dxa"/>
-              <w:right w:w="80" w:type="dxa"/>
+              <w:left w:w="70" w:type="dxa"/>
+              <w:right w:w="70" w:type="dxa"/>
             </w:tcMar>
             <w:shd w:fill="F8FAFC"/>
             <w:vAlign w:val="center"/>
           </w:tcPr>
           <w:p>
             <w:pPr>
-              <w:spacing w:before="0" w:after="0" w:line="252" w:lineRule="auto"/>
+              <w:spacing w:before="0" w:after="0" w:line="259" w:lineRule="auto"/>
               <w:jc w:val="left"/>
             </w:pPr>
             <w:r>
@@ -902,19 +897,19 @@
         </w:tc>
         <w:tc>
           <w:tcPr>
-            <w:tcW w:type="dxa" w:w="1368"/>
+            <w:tcW w:type="dxa" w:w="1325"/>
             <w:tcMar>
               <w:top w:w="40" w:type="dxa"/>
               <w:bottom w:w="40" w:type="dxa"/>
-              <w:left w:w="80" w:type="dxa"/>
-              <w:right w:w="80" w:type="dxa"/>
+              <w:left w:w="70" w:type="dxa"/>
+              <w:right w:w="70" w:type="dxa"/>
             </w:tcMar>
             <w:shd w:fill="F8FAFC"/>
             <w:vAlign w:val="center"/>
           </w:tcPr>
           <w:p>
             <w:pPr>
-              <w:spacing w:before="0" w:after="0" w:line="252" w:lineRule="auto"/>
+              <w:spacing w:before="0" w:after="0" w:line="259" w:lineRule="auto"/>
               <w:jc w:val="left"/>
             </w:pPr>
             <w:r>
@@ -933,19 +928,19 @@
         </w:tc>
         <w:tc>
           <w:tcPr>
-            <w:tcW w:type="dxa" w:w="1008"/>
+            <w:tcW w:type="dxa" w:w="1037"/>
             <w:tcMar>
               <w:top w:w="40" w:type="dxa"/>
               <w:bottom w:w="40" w:type="dxa"/>
-              <w:left w:w="80" w:type="dxa"/>
-              <w:right w:w="80" w:type="dxa"/>
+              <w:left w:w="70" w:type="dxa"/>
+              <w:right w:w="70" w:type="dxa"/>
             </w:tcMar>
             <w:shd w:fill="F8FAFC"/>
             <w:vAlign w:val="center"/>
           </w:tcPr>
           <w:p>
             <w:pPr>
-              <w:spacing w:before="0" w:after="0" w:line="252" w:lineRule="auto"/>
+              <w:spacing w:before="0" w:after="0" w:line="259" w:lineRule="auto"/>
               <w:jc w:val="left"/>
             </w:pPr>
             <w:r>
@@ -962,19 +957,19 @@
         </w:tc>
         <w:tc>
           <w:tcPr>
-            <w:tcW w:type="dxa" w:w="1080"/>
+            <w:tcW w:type="dxa" w:w="1094"/>
             <w:tcMar>
               <w:top w:w="40" w:type="dxa"/>
               <w:bottom w:w="40" w:type="dxa"/>
-              <w:left w:w="80" w:type="dxa"/>
-              <w:right w:w="80" w:type="dxa"/>
+              <w:left w:w="70" w:type="dxa"/>
+              <w:right w:w="70" w:type="dxa"/>
             </w:tcMar>
             <w:shd w:fill="F8FAFC"/>
             <w:vAlign w:val="center"/>
           </w:tcPr>
           <w:p>
             <w:pPr>
-              <w:spacing w:before="0" w:after="0" w:line="252" w:lineRule="auto"/>
+              <w:spacing w:before="0" w:after="0" w:line="259" w:lineRule="auto"/>
               <w:jc w:val="left"/>
             </w:pPr>
             <w:r>
@@ -991,19 +986,19 @@
         </w:tc>
         <w:tc>
           <w:tcPr>
-            <w:tcW w:type="dxa" w:w="936"/>
+            <w:tcW w:type="dxa" w:w="950"/>
             <w:tcMar>
               <w:top w:w="40" w:type="dxa"/>
               <w:bottom w:w="40" w:type="dxa"/>
-              <w:left w:w="80" w:type="dxa"/>
-              <w:right w:w="80" w:type="dxa"/>
+              <w:left w:w="70" w:type="dxa"/>
+              <w:right w:w="70" w:type="dxa"/>
             </w:tcMar>
             <w:shd w:fill="F8FAFC"/>
             <w:vAlign w:val="center"/>
           </w:tcPr>
           <w:p>
             <w:pPr>
-              <w:spacing w:before="0" w:after="0" w:line="252" w:lineRule="auto"/>
+              <w:spacing w:before="0" w:after="0" w:line="259" w:lineRule="auto"/>
               <w:jc w:val="left"/>
             </w:pPr>
             <w:r>
@@ -1020,19 +1015,19 @@
         </w:tc>
         <w:tc>
           <w:tcPr>
-            <w:tcW w:type="dxa" w:w="1224"/>
+            <w:tcW w:type="dxa" w:w="1238"/>
             <w:tcMar>
               <w:top w:w="40" w:type="dxa"/>
               <w:bottom w:w="40" w:type="dxa"/>
-              <w:left w:w="80" w:type="dxa"/>
-              <w:right w:w="80" w:type="dxa"/>
+              <w:left w:w="70" w:type="dxa"/>
+              <w:right w:w="70" w:type="dxa"/>
             </w:tcMar>
             <w:shd w:fill="F8FAFC"/>
             <w:vAlign w:val="center"/>
           </w:tcPr>
           <w:p>
             <w:pPr>
-              <w:spacing w:before="0" w:after="0" w:line="252" w:lineRule="auto"/>
+              <w:spacing w:before="0" w:after="0" w:line="259" w:lineRule="auto"/>
               <w:jc w:val="left"/>
             </w:pPr>
             <w:r>
@@ -1055,15 +1050,15 @@
             <w:tcMar>
               <w:top w:w="40" w:type="dxa"/>
               <w:bottom w:w="40" w:type="dxa"/>
-              <w:left w:w="80" w:type="dxa"/>
-              <w:right w:w="80" w:type="dxa"/>
+              <w:left w:w="70" w:type="dxa"/>
+              <w:right w:w="70" w:type="dxa"/>
             </w:tcMar>
             <w:shd w:fill="F8FAFC"/>
             <w:vAlign w:val="center"/>
           </w:tcPr>
           <w:p>
             <w:pPr>
-              <w:spacing w:before="0" w:after="0" w:line="252" w:lineRule="auto"/>
+              <w:spacing w:before="0" w:after="0" w:line="259" w:lineRule="auto"/>
               <w:jc w:val="left"/>
             </w:pPr>
             <w:r>
@@ -1084,49 +1079,49 @@
       <w:tr>
         <w:tc>
           <w:tcPr>
-            <w:tcW w:type="dxa" w:w="576"/>
+            <w:tcW w:type="dxa" w:w="432"/>
             <w:tcMar>
               <w:top w:w="40" w:type="dxa"/>
               <w:bottom w:w="40" w:type="dxa"/>
-              <w:left w:w="80" w:type="dxa"/>
-              <w:right w:w="80" w:type="dxa"/>
+              <w:left w:w="70" w:type="dxa"/>
+              <w:right w:w="70" w:type="dxa"/>
             </w:tcMar>
             <w:shd w:fill="FFFFFF"/>
             <w:vAlign w:val="center"/>
           </w:tcPr>
           <w:p>
             <w:pPr>
-              <w:spacing w:before="0" w:after="0" w:line="252" w:lineRule="auto"/>
-              <w:jc w:val="left"/>
+              <w:spacing w:before="0" w:after="0" w:line="259" w:lineRule="auto"/>
+              <w:jc w:val="center"/>
             </w:pPr>
             <w:r>
               <w:rPr>
                 <w:rFonts w:ascii="Arial" w:hAnsi="Arial"/>
-                <w:b w:val="0"/>
+                <w:b/>
                 <w:i w:val="0"/>
-                <w:color w:val="4B5563"/>
-                <w:sz w:val="13"/>
+                <w:color w:val="0F294A"/>
+                <w:sz w:val="14"/>
               </w:rPr>
-              <w:t>Operating</w:t>
+              <w:t>O</w:t>
             </w:r>
           </w:p>
         </w:tc>
         <w:tc>
           <w:tcPr>
-            <w:tcW w:type="dxa" w:w="576"/>
+            <w:tcW w:type="dxa" w:w="605"/>
             <w:tcMar>
               <w:top w:w="40" w:type="dxa"/>
               <w:bottom w:w="40" w:type="dxa"/>
-              <w:left w:w="80" w:type="dxa"/>
-              <w:right w:w="80" w:type="dxa"/>
+              <w:left w:w="70" w:type="dxa"/>
+              <w:right w:w="70" w:type="dxa"/>
             </w:tcMar>
             <w:shd w:fill="FFFFFF"/>
             <w:vAlign w:val="center"/>
           </w:tcPr>
           <w:p>
             <w:pPr>
-              <w:spacing w:before="0" w:after="0" w:line="252" w:lineRule="auto"/>
-              <w:jc w:val="left"/>
+              <w:spacing w:before="0" w:after="0" w:line="259" w:lineRule="auto"/>
+              <w:jc w:val="center"/>
             </w:pPr>
             <w:r>
               <w:rPr>
@@ -1142,19 +1137,19 @@
         </w:tc>
         <w:tc>
           <w:tcPr>
-            <w:tcW w:type="dxa" w:w="2664"/>
+            <w:tcW w:type="dxa" w:w="2808"/>
             <w:tcMar>
               <w:top w:w="40" w:type="dxa"/>
               <w:bottom w:w="40" w:type="dxa"/>
-              <w:left w:w="80" w:type="dxa"/>
-              <w:right w:w="80" w:type="dxa"/>
+              <w:left w:w="70" w:type="dxa"/>
+              <w:right w:w="70" w:type="dxa"/>
             </w:tcMar>
             <w:shd w:fill="FFFFFF"/>
             <w:vAlign w:val="center"/>
           </w:tcPr>
           <w:p>
             <w:pPr>
-              <w:spacing w:before="0" w:after="0" w:line="252" w:lineRule="auto"/>
+              <w:spacing w:before="0" w:after="0" w:line="259" w:lineRule="auto"/>
               <w:jc w:val="left"/>
             </w:pPr>
             <w:r>
@@ -1182,19 +1177,19 @@
         </w:tc>
         <w:tc>
           <w:tcPr>
-            <w:tcW w:type="dxa" w:w="1368"/>
+            <w:tcW w:type="dxa" w:w="1325"/>
             <w:tcMar>
               <w:top w:w="40" w:type="dxa"/>
               <w:bottom w:w="40" w:type="dxa"/>
-              <w:left w:w="80" w:type="dxa"/>
-              <w:right w:w="80" w:type="dxa"/>
+              <w:left w:w="70" w:type="dxa"/>
+              <w:right w:w="70" w:type="dxa"/>
             </w:tcMar>
             <w:shd w:fill="FFFFFF"/>
             <w:vAlign w:val="center"/>
           </w:tcPr>
           <w:p>
             <w:pPr>
-              <w:spacing w:before="0" w:after="0" w:line="252" w:lineRule="auto"/>
+              <w:spacing w:before="0" w:after="0" w:line="259" w:lineRule="auto"/>
               <w:jc w:val="left"/>
             </w:pPr>
             <w:r>
@@ -1213,19 +1208,19 @@
         </w:tc>
         <w:tc>
           <w:tcPr>
-            <w:tcW w:type="dxa" w:w="1008"/>
+            <w:tcW w:type="dxa" w:w="1037"/>
             <w:tcMar>
               <w:top w:w="40" w:type="dxa"/>
               <w:bottom w:w="40" w:type="dxa"/>
-              <w:left w:w="80" w:type="dxa"/>
-              <w:right w:w="80" w:type="dxa"/>
+              <w:left w:w="70" w:type="dxa"/>
+              <w:right w:w="70" w:type="dxa"/>
             </w:tcMar>
             <w:shd w:fill="FFFFFF"/>
             <w:vAlign w:val="center"/>
           </w:tcPr>
           <w:p>
             <w:pPr>
-              <w:spacing w:before="0" w:after="0" w:line="252" w:lineRule="auto"/>
+              <w:spacing w:before="0" w:after="0" w:line="259" w:lineRule="auto"/>
               <w:jc w:val="left"/>
             </w:pPr>
             <w:r>
@@ -1242,19 +1237,19 @@
         </w:tc>
         <w:tc>
           <w:tcPr>
-            <w:tcW w:type="dxa" w:w="1080"/>
+            <w:tcW w:type="dxa" w:w="1094"/>
             <w:tcMar>
               <w:top w:w="40" w:type="dxa"/>
               <w:bottom w:w="40" w:type="dxa"/>
-              <w:left w:w="80" w:type="dxa"/>
-              <w:right w:w="80" w:type="dxa"/>
+              <w:left w:w="70" w:type="dxa"/>
+              <w:right w:w="70" w:type="dxa"/>
             </w:tcMar>
             <w:shd w:fill="FFFFFF"/>
             <w:vAlign w:val="center"/>
           </w:tcPr>
           <w:p>
             <w:pPr>
-              <w:spacing w:before="0" w:after="0" w:line="252" w:lineRule="auto"/>
+              <w:spacing w:before="0" w:after="0" w:line="259" w:lineRule="auto"/>
               <w:jc w:val="left"/>
             </w:pPr>
             <w:r>
@@ -1271,19 +1266,19 @@
         </w:tc>
         <w:tc>
           <w:tcPr>
-            <w:tcW w:type="dxa" w:w="936"/>
+            <w:tcW w:type="dxa" w:w="950"/>
             <w:tcMar>
               <w:top w:w="40" w:type="dxa"/>
               <w:bottom w:w="40" w:type="dxa"/>
-              <w:left w:w="80" w:type="dxa"/>
-              <w:right w:w="80" w:type="dxa"/>
+              <w:left w:w="70" w:type="dxa"/>
+              <w:right w:w="70" w:type="dxa"/>
             </w:tcMar>
             <w:shd w:fill="FFFFFF"/>
             <w:vAlign w:val="center"/>
           </w:tcPr>
           <w:p>
             <w:pPr>
-              <w:spacing w:before="0" w:after="0" w:line="252" w:lineRule="auto"/>
+              <w:spacing w:before="0" w:after="0" w:line="259" w:lineRule="auto"/>
               <w:jc w:val="left"/>
             </w:pPr>
             <w:r>
@@ -1300,19 +1295,19 @@
         </w:tc>
         <w:tc>
           <w:tcPr>
-            <w:tcW w:type="dxa" w:w="1224"/>
+            <w:tcW w:type="dxa" w:w="1238"/>
             <w:tcMar>
               <w:top w:w="40" w:type="dxa"/>
               <w:bottom w:w="40" w:type="dxa"/>
-              <w:left w:w="80" w:type="dxa"/>
-              <w:right w:w="80" w:type="dxa"/>
+              <w:left w:w="70" w:type="dxa"/>
+              <w:right w:w="70" w:type="dxa"/>
             </w:tcMar>
             <w:shd w:fill="FFFFFF"/>
             <w:vAlign w:val="center"/>
           </w:tcPr>
           <w:p>
             <w:pPr>
-              <w:spacing w:before="0" w:after="0" w:line="252" w:lineRule="auto"/>
+              <w:spacing w:before="0" w:after="0" w:line="259" w:lineRule="auto"/>
               <w:jc w:val="left"/>
             </w:pPr>
             <w:r>
@@ -1335,15 +1330,15 @@
             <w:tcMar>
               <w:top w:w="40" w:type="dxa"/>
               <w:bottom w:w="40" w:type="dxa"/>
-              <w:left w:w="80" w:type="dxa"/>
-              <w:right w:w="80" w:type="dxa"/>
+              <w:left w:w="70" w:type="dxa"/>
+              <w:right w:w="70" w:type="dxa"/>
             </w:tcMar>
             <w:shd w:fill="FFFFFF"/>
             <w:vAlign w:val="center"/>
           </w:tcPr>
           <w:p>
             <w:pPr>
-              <w:spacing w:before="0" w:after="0" w:line="252" w:lineRule="auto"/>
+              <w:spacing w:before="0" w:after="0" w:line="259" w:lineRule="auto"/>
               <w:jc w:val="left"/>
             </w:pPr>
             <w:r>
@@ -1364,49 +1359,49 @@
       <w:tr>
         <w:tc>
           <w:tcPr>
-            <w:tcW w:type="dxa" w:w="576"/>
+            <w:tcW w:type="dxa" w:w="432"/>
             <w:tcMar>
               <w:top w:w="40" w:type="dxa"/>
               <w:bottom w:w="40" w:type="dxa"/>
-              <w:left w:w="80" w:type="dxa"/>
-              <w:right w:w="80" w:type="dxa"/>
+              <w:left w:w="70" w:type="dxa"/>
+              <w:right w:w="70" w:type="dxa"/>
             </w:tcMar>
             <w:shd w:fill="F8FAFC"/>
             <w:vAlign w:val="center"/>
           </w:tcPr>
           <w:p>
             <w:pPr>
-              <w:spacing w:before="0" w:after="0" w:line="252" w:lineRule="auto"/>
-              <w:jc w:val="left"/>
+              <w:spacing w:before="0" w:after="0" w:line="259" w:lineRule="auto"/>
+              <w:jc w:val="center"/>
             </w:pPr>
             <w:r>
               <w:rPr>
                 <w:rFonts w:ascii="Arial" w:hAnsi="Arial"/>
-                <w:b w:val="0"/>
+                <w:b/>
                 <w:i w:val="0"/>
-                <w:color w:val="4B5563"/>
-                <w:sz w:val="13"/>
+                <w:color w:val="0F294A"/>
+                <w:sz w:val="14"/>
               </w:rPr>
-              <w:t>Operating</w:t>
+              <w:t>O</w:t>
             </w:r>
           </w:p>
         </w:tc>
         <w:tc>
           <w:tcPr>
-            <w:tcW w:type="dxa" w:w="576"/>
+            <w:tcW w:type="dxa" w:w="605"/>
             <w:tcMar>
               <w:top w:w="40" w:type="dxa"/>
               <w:bottom w:w="40" w:type="dxa"/>
-              <w:left w:w="80" w:type="dxa"/>
-              <w:right w:w="80" w:type="dxa"/>
+              <w:left w:w="70" w:type="dxa"/>
+              <w:right w:w="70" w:type="dxa"/>
             </w:tcMar>
             <w:shd w:fill="F8FAFC"/>
             <w:vAlign w:val="center"/>
           </w:tcPr>
           <w:p>
             <w:pPr>
-              <w:spacing w:before="0" w:after="0" w:line="252" w:lineRule="auto"/>
-              <w:jc w:val="left"/>
+              <w:spacing w:before="0" w:after="0" w:line="259" w:lineRule="auto"/>
+              <w:jc w:val="center"/>
             </w:pPr>
             <w:r>
               <w:rPr>
@@ -1422,19 +1417,19 @@
         </w:tc>
         <w:tc>
           <w:tcPr>
-            <w:tcW w:type="dxa" w:w="2664"/>
+            <w:tcW w:type="dxa" w:w="2808"/>
             <w:tcMar>
               <w:top w:w="40" w:type="dxa"/>
               <w:bottom w:w="40" w:type="dxa"/>
-              <w:left w:w="80" w:type="dxa"/>
-              <w:right w:w="80" w:type="dxa"/>
+              <w:left w:w="70" w:type="dxa"/>
+              <w:right w:w="70" w:type="dxa"/>
             </w:tcMar>
             <w:shd w:fill="F8FAFC"/>
             <w:vAlign w:val="center"/>
           </w:tcPr>
           <w:p>
             <w:pPr>
-              <w:spacing w:before="0" w:after="0" w:line="252" w:lineRule="auto"/>
+              <w:spacing w:before="0" w:after="0" w:line="259" w:lineRule="auto"/>
               <w:jc w:val="left"/>
             </w:pPr>
             <w:r>
@@ -1462,19 +1457,19 @@
         </w:tc>
         <w:tc>
           <w:tcPr>
-            <w:tcW w:type="dxa" w:w="1368"/>
+            <w:tcW w:type="dxa" w:w="1325"/>
             <w:tcMar>
               <w:top w:w="40" w:type="dxa"/>
               <w:bottom w:w="40" w:type="dxa"/>
-              <w:left w:w="80" w:type="dxa"/>
-              <w:right w:w="80" w:type="dxa"/>
+              <w:left w:w="70" w:type="dxa"/>
+              <w:right w:w="70" w:type="dxa"/>
             </w:tcMar>
             <w:shd w:fill="F8FAFC"/>
             <w:vAlign w:val="center"/>
           </w:tcPr>
           <w:p>
             <w:pPr>
-              <w:spacing w:before="0" w:after="0" w:line="252" w:lineRule="auto"/>
+              <w:spacing w:before="0" w:after="0" w:line="259" w:lineRule="auto"/>
               <w:jc w:val="left"/>
             </w:pPr>
             <w:r>
@@ -1493,19 +1488,19 @@
         </w:tc>
         <w:tc>
           <w:tcPr>
-            <w:tcW w:type="dxa" w:w="1008"/>
+            <w:tcW w:type="dxa" w:w="1037"/>
             <w:tcMar>
               <w:top w:w="40" w:type="dxa"/>
               <w:bottom w:w="40" w:type="dxa"/>
-              <w:left w:w="80" w:type="dxa"/>
-              <w:right w:w="80" w:type="dxa"/>
+              <w:left w:w="70" w:type="dxa"/>
+              <w:right w:w="70" w:type="dxa"/>
             </w:tcMar>
             <w:shd w:fill="F8FAFC"/>
             <w:vAlign w:val="center"/>
           </w:tcPr>
           <w:p>
             <w:pPr>
-              <w:spacing w:before="0" w:after="0" w:line="252" w:lineRule="auto"/>
+              <w:spacing w:before="0" w:after="0" w:line="259" w:lineRule="auto"/>
               <w:jc w:val="left"/>
             </w:pPr>
             <w:r>
@@ -1522,19 +1517,19 @@
         </w:tc>
         <w:tc>
           <w:tcPr>
-            <w:tcW w:type="dxa" w:w="1080"/>
+            <w:tcW w:type="dxa" w:w="1094"/>
             <w:tcMar>
               <w:top w:w="40" w:type="dxa"/>
               <w:bottom w:w="40" w:type="dxa"/>
-              <w:left w:w="80" w:type="dxa"/>
-              <w:right w:w="80" w:type="dxa"/>
+              <w:left w:w="70" w:type="dxa"/>
+              <w:right w:w="70" w:type="dxa"/>
             </w:tcMar>
             <w:shd w:fill="F8FAFC"/>
             <w:vAlign w:val="center"/>
           </w:tcPr>
           <w:p>
             <w:pPr>
-              <w:spacing w:before="0" w:after="0" w:line="252" w:lineRule="auto"/>
+              <w:spacing w:before="0" w:after="0" w:line="259" w:lineRule="auto"/>
               <w:jc w:val="left"/>
             </w:pPr>
             <w:r>
@@ -1551,19 +1546,19 @@
         </w:tc>
         <w:tc>
           <w:tcPr>
-            <w:tcW w:type="dxa" w:w="936"/>
+            <w:tcW w:type="dxa" w:w="950"/>
             <w:tcMar>
               <w:top w:w="40" w:type="dxa"/>
               <w:bottom w:w="40" w:type="dxa"/>
-              <w:left w:w="80" w:type="dxa"/>
-              <w:right w:w="80" w:type="dxa"/>
+              <w:left w:w="70" w:type="dxa"/>
+              <w:right w:w="70" w:type="dxa"/>
             </w:tcMar>
             <w:shd w:fill="F8FAFC"/>
             <w:vAlign w:val="center"/>
           </w:tcPr>
           <w:p>
             <w:pPr>
-              <w:spacing w:before="0" w:after="0" w:line="252" w:lineRule="auto"/>
+              <w:spacing w:before="0" w:after="0" w:line="259" w:lineRule="auto"/>
               <w:jc w:val="left"/>
             </w:pPr>
             <w:r>
@@ -1580,19 +1575,19 @@
         </w:tc>
         <w:tc>
           <w:tcPr>
-            <w:tcW w:type="dxa" w:w="1224"/>
+            <w:tcW w:type="dxa" w:w="1238"/>
             <w:tcMar>
               <w:top w:w="40" w:type="dxa"/>
               <w:bottom w:w="40" w:type="dxa"/>
-              <w:left w:w="80" w:type="dxa"/>
-              <w:right w:w="80" w:type="dxa"/>
+              <w:left w:w="70" w:type="dxa"/>
+              <w:right w:w="70" w:type="dxa"/>
             </w:tcMar>
             <w:shd w:fill="F8FAFC"/>
             <w:vAlign w:val="center"/>
           </w:tcPr>
           <w:p>
             <w:pPr>
-              <w:spacing w:before="0" w:after="0" w:line="252" w:lineRule="auto"/>
+              <w:spacing w:before="0" w:after="0" w:line="259" w:lineRule="auto"/>
               <w:jc w:val="left"/>
             </w:pPr>
             <w:r>
@@ -1615,15 +1610,15 @@
             <w:tcMar>
               <w:top w:w="40" w:type="dxa"/>
               <w:bottom w:w="40" w:type="dxa"/>
-              <w:left w:w="80" w:type="dxa"/>
-              <w:right w:w="80" w:type="dxa"/>
+              <w:left w:w="70" w:type="dxa"/>
+              <w:right w:w="70" w:type="dxa"/>
             </w:tcMar>
             <w:shd w:fill="F8FAFC"/>
             <w:vAlign w:val="center"/>
           </w:tcPr>
           <w:p>
             <w:pPr>
-              <w:spacing w:before="0" w:after="0" w:line="252" w:lineRule="auto"/>
+              <w:spacing w:before="0" w:after="0" w:line="259" w:lineRule="auto"/>
               <w:jc w:val="left"/>
             </w:pPr>
             <w:r>
@@ -1644,49 +1639,49 @@
       <w:tr>
         <w:tc>
           <w:tcPr>
-            <w:tcW w:type="dxa" w:w="576"/>
+            <w:tcW w:type="dxa" w:w="432"/>
             <w:tcMar>
               <w:top w:w="40" w:type="dxa"/>
               <w:bottom w:w="40" w:type="dxa"/>
-              <w:left w:w="80" w:type="dxa"/>
-              <w:right w:w="80" w:type="dxa"/>
+              <w:left w:w="70" w:type="dxa"/>
+              <w:right w:w="70" w:type="dxa"/>
             </w:tcMar>
             <w:shd w:fill="FFFFFF"/>
             <w:vAlign w:val="center"/>
           </w:tcPr>
           <w:p>
             <w:pPr>
-              <w:spacing w:before="0" w:after="0" w:line="252" w:lineRule="auto"/>
-              <w:jc w:val="left"/>
+              <w:spacing w:before="0" w:after="0" w:line="259" w:lineRule="auto"/>
+              <w:jc w:val="center"/>
             </w:pPr>
             <w:r>
               <w:rPr>
                 <w:rFonts w:ascii="Arial" w:hAnsi="Arial"/>
-                <w:b w:val="0"/>
+                <w:b/>
                 <w:i w:val="0"/>
-                <w:color w:val="4B5563"/>
-                <w:sz w:val="13"/>
+                <w:color w:val="0F294A"/>
+                <w:sz w:val="14"/>
               </w:rPr>
-              <w:t>Operating</w:t>
+              <w:t>O</w:t>
             </w:r>
           </w:p>
         </w:tc>
         <w:tc>
           <w:tcPr>
-            <w:tcW w:type="dxa" w:w="576"/>
+            <w:tcW w:type="dxa" w:w="605"/>
             <w:tcMar>
               <w:top w:w="40" w:type="dxa"/>
               <w:bottom w:w="40" w:type="dxa"/>
-              <w:left w:w="80" w:type="dxa"/>
-              <w:right w:w="80" w:type="dxa"/>
+              <w:left w:w="70" w:type="dxa"/>
+              <w:right w:w="70" w:type="dxa"/>
             </w:tcMar>
             <w:shd w:fill="FFFFFF"/>
             <w:vAlign w:val="center"/>
           </w:tcPr>
           <w:p>
             <w:pPr>
-              <w:spacing w:before="0" w:after="0" w:line="252" w:lineRule="auto"/>
-              <w:jc w:val="left"/>
+              <w:spacing w:before="0" w:after="0" w:line="259" w:lineRule="auto"/>
+              <w:jc w:val="center"/>
             </w:pPr>
             <w:r>
               <w:rPr>
@@ -1702,19 +1697,19 @@
         </w:tc>
         <w:tc>
           <w:tcPr>
-            <w:tcW w:type="dxa" w:w="2664"/>
+            <w:tcW w:type="dxa" w:w="2808"/>
             <w:tcMar>
               <w:top w:w="40" w:type="dxa"/>
               <w:bottom w:w="40" w:type="dxa"/>
-              <w:left w:w="80" w:type="dxa"/>
-              <w:right w:w="80" w:type="dxa"/>
+              <w:left w:w="70" w:type="dxa"/>
+              <w:right w:w="70" w:type="dxa"/>
             </w:tcMar>
             <w:shd w:fill="FFFFFF"/>
             <w:vAlign w:val="center"/>
           </w:tcPr>
           <w:p>
             <w:pPr>
-              <w:spacing w:before="0" w:after="0" w:line="252" w:lineRule="auto"/>
+              <w:spacing w:before="0" w:after="0" w:line="259" w:lineRule="auto"/>
               <w:jc w:val="left"/>
             </w:pPr>
             <w:r>
@@ -1742,19 +1737,19 @@
         </w:tc>
         <w:tc>
           <w:tcPr>
-            <w:tcW w:type="dxa" w:w="1368"/>
+            <w:tcW w:type="dxa" w:w="1325"/>
             <w:tcMar>
               <w:top w:w="40" w:type="dxa"/>
               <w:bottom w:w="40" w:type="dxa"/>
-              <w:left w:w="80" w:type="dxa"/>
-              <w:right w:w="80" w:type="dxa"/>
+              <w:left w:w="70" w:type="dxa"/>
+              <w:right w:w="70" w:type="dxa"/>
             </w:tcMar>
             <w:shd w:fill="FFFFFF"/>
             <w:vAlign w:val="center"/>
           </w:tcPr>
           <w:p>
             <w:pPr>
-              <w:spacing w:before="0" w:after="0" w:line="252" w:lineRule="auto"/>
+              <w:spacing w:before="0" w:after="0" w:line="259" w:lineRule="auto"/>
               <w:jc w:val="left"/>
             </w:pPr>
             <w:r>
@@ -1773,19 +1768,19 @@
         </w:tc>
         <w:tc>
           <w:tcPr>
-            <w:tcW w:type="dxa" w:w="1008"/>
+            <w:tcW w:type="dxa" w:w="1037"/>
             <w:tcMar>
               <w:top w:w="40" w:type="dxa"/>
               <w:bottom w:w="40" w:type="dxa"/>
-              <w:left w:w="80" w:type="dxa"/>
-              <w:right w:w="80" w:type="dxa"/>
+              <w:left w:w="70" w:type="dxa"/>
+              <w:right w:w="70" w:type="dxa"/>
             </w:tcMar>
             <w:shd w:fill="FFFFFF"/>
             <w:vAlign w:val="center"/>
           </w:tcPr>
           <w:p>
             <w:pPr>
-              <w:spacing w:before="0" w:after="0" w:line="252" w:lineRule="auto"/>
+              <w:spacing w:before="0" w:after="0" w:line="259" w:lineRule="auto"/>
               <w:jc w:val="left"/>
             </w:pPr>
             <w:r>
@@ -1802,19 +1797,19 @@
         </w:tc>
         <w:tc>
           <w:tcPr>
-            <w:tcW w:type="dxa" w:w="1080"/>
+            <w:tcW w:type="dxa" w:w="1094"/>
             <w:tcMar>
               <w:top w:w="40" w:type="dxa"/>
               <w:bottom w:w="40" w:type="dxa"/>
-              <w:left w:w="80" w:type="dxa"/>
-              <w:right w:w="80" w:type="dxa"/>
+              <w:left w:w="70" w:type="dxa"/>
+              <w:right w:w="70" w:type="dxa"/>
             </w:tcMar>
             <w:shd w:fill="FFFFFF"/>
             <w:vAlign w:val="center"/>
           </w:tcPr>
           <w:p>
             <w:pPr>
-              <w:spacing w:before="0" w:after="0" w:line="252" w:lineRule="auto"/>
+              <w:spacing w:before="0" w:after="0" w:line="259" w:lineRule="auto"/>
               <w:jc w:val="left"/>
             </w:pPr>
             <w:r>
@@ -1831,19 +1826,19 @@
         </w:tc>
         <w:tc>
           <w:tcPr>
-            <w:tcW w:type="dxa" w:w="936"/>
+            <w:tcW w:type="dxa" w:w="950"/>
             <w:tcMar>
               <w:top w:w="40" w:type="dxa"/>
               <w:bottom w:w="40" w:type="dxa"/>
-              <w:left w:w="80" w:type="dxa"/>
-              <w:right w:w="80" w:type="dxa"/>
+              <w:left w:w="70" w:type="dxa"/>
+              <w:right w:w="70" w:type="dxa"/>
             </w:tcMar>
             <w:shd w:fill="FFFFFF"/>
             <w:vAlign w:val="center"/>
           </w:tcPr>
           <w:p>
             <w:pPr>
-              <w:spacing w:before="0" w:after="0" w:line="252" w:lineRule="auto"/>
+              <w:spacing w:before="0" w:after="0" w:line="259" w:lineRule="auto"/>
               <w:jc w:val="left"/>
             </w:pPr>
             <w:r>
@@ -1860,19 +1855,19 @@
         </w:tc>
         <w:tc>
           <w:tcPr>
-            <w:tcW w:type="dxa" w:w="1224"/>
+            <w:tcW w:type="dxa" w:w="1238"/>
             <w:tcMar>
               <w:top w:w="40" w:type="dxa"/>
               <w:bottom w:w="40" w:type="dxa"/>
-              <w:left w:w="80" w:type="dxa"/>
-              <w:right w:w="80" w:type="dxa"/>
+              <w:left w:w="70" w:type="dxa"/>
+              <w:right w:w="70" w:type="dxa"/>
             </w:tcMar>
             <w:shd w:fill="FFFFFF"/>
             <w:vAlign w:val="center"/>
           </w:tcPr>
           <w:p>
             <w:pPr>
-              <w:spacing w:before="0" w:after="0" w:line="252" w:lineRule="auto"/>
+              <w:spacing w:before="0" w:after="0" w:line="259" w:lineRule="auto"/>
               <w:jc w:val="left"/>
             </w:pPr>
             <w:r>
@@ -1895,15 +1890,15 @@
             <w:tcMar>
               <w:top w:w="40" w:type="dxa"/>
               <w:bottom w:w="40" w:type="dxa"/>
-              <w:left w:w="80" w:type="dxa"/>
-              <w:right w:w="80" w:type="dxa"/>
+              <w:left w:w="70" w:type="dxa"/>
+              <w:right w:w="70" w:type="dxa"/>
             </w:tcMar>
             <w:shd w:fill="FFFFFF"/>
             <w:vAlign w:val="center"/>
           </w:tcPr>
           <w:p>
             <w:pPr>
-              <w:spacing w:before="0" w:after="0" w:line="252" w:lineRule="auto"/>
+              <w:spacing w:before="0" w:after="0" w:line="259" w:lineRule="auto"/>
               <w:jc w:val="left"/>
             </w:pPr>
             <w:r>
@@ -1924,49 +1919,49 @@
       <w:tr>
         <w:tc>
           <w:tcPr>
-            <w:tcW w:type="dxa" w:w="576"/>
+            <w:tcW w:type="dxa" w:w="432"/>
             <w:tcMar>
               <w:top w:w="40" w:type="dxa"/>
               <w:bottom w:w="40" w:type="dxa"/>
-              <w:left w:w="80" w:type="dxa"/>
-              <w:right w:w="80" w:type="dxa"/>
+              <w:left w:w="70" w:type="dxa"/>
+              <w:right w:w="70" w:type="dxa"/>
             </w:tcMar>
             <w:shd w:fill="F8FAFC"/>
             <w:vAlign w:val="center"/>
           </w:tcPr>
           <w:p>
             <w:pPr>
-              <w:spacing w:before="0" w:after="0" w:line="252" w:lineRule="auto"/>
-              <w:jc w:val="left"/>
+              <w:spacing w:before="0" w:after="0" w:line="259" w:lineRule="auto"/>
+              <w:jc w:val="center"/>
             </w:pPr>
             <w:r>
               <w:rPr>
                 <w:rFonts w:ascii="Arial" w:hAnsi="Arial"/>
-                <w:b w:val="0"/>
+                <w:b/>
                 <w:i w:val="0"/>
-                <w:color w:val="4B5563"/>
-                <w:sz w:val="13"/>
+                <w:color w:val="0F294A"/>
+                <w:sz w:val="14"/>
               </w:rPr>
-              <w:t>Lagging</w:t>
+              <w:t>G</w:t>
             </w:r>
           </w:p>
         </w:tc>
         <w:tc>
           <w:tcPr>
-            <w:tcW w:type="dxa" w:w="576"/>
+            <w:tcW w:type="dxa" w:w="605"/>
             <w:tcMar>
               <w:top w:w="40" w:type="dxa"/>
               <w:bottom w:w="40" w:type="dxa"/>
-              <w:left w:w="80" w:type="dxa"/>
-              <w:right w:w="80" w:type="dxa"/>
+              <w:left w:w="70" w:type="dxa"/>
+              <w:right w:w="70" w:type="dxa"/>
             </w:tcMar>
             <w:shd w:fill="F8FAFC"/>
             <w:vAlign w:val="center"/>
           </w:tcPr>
           <w:p>
             <w:pPr>
-              <w:spacing w:before="0" w:after="0" w:line="252" w:lineRule="auto"/>
-              <w:jc w:val="left"/>
+              <w:spacing w:before="0" w:after="0" w:line="259" w:lineRule="auto"/>
+              <w:jc w:val="center"/>
             </w:pPr>
             <w:r>
               <w:rPr>
@@ -1982,19 +1977,19 @@
         </w:tc>
         <w:tc>
           <w:tcPr>
-            <w:tcW w:type="dxa" w:w="2664"/>
+            <w:tcW w:type="dxa" w:w="2808"/>
             <w:tcMar>
               <w:top w:w="40" w:type="dxa"/>
               <w:bottom w:w="40" w:type="dxa"/>
-              <w:left w:w="80" w:type="dxa"/>
-              <w:right w:w="80" w:type="dxa"/>
+              <w:left w:w="70" w:type="dxa"/>
+              <w:right w:w="70" w:type="dxa"/>
             </w:tcMar>
             <w:shd w:fill="F8FAFC"/>
             <w:vAlign w:val="center"/>
           </w:tcPr>
           <w:p>
             <w:pPr>
-              <w:spacing w:before="0" w:after="0" w:line="252" w:lineRule="auto"/>
+              <w:spacing w:before="0" w:after="0" w:line="259" w:lineRule="auto"/>
               <w:jc w:val="left"/>
             </w:pPr>
             <w:r>
@@ -2022,19 +2017,19 @@
         </w:tc>
         <w:tc>
           <w:tcPr>
-            <w:tcW w:type="dxa" w:w="1368"/>
+            <w:tcW w:type="dxa" w:w="1325"/>
             <w:tcMar>
               <w:top w:w="40" w:type="dxa"/>
               <w:bottom w:w="40" w:type="dxa"/>
-              <w:left w:w="80" w:type="dxa"/>
-              <w:right w:w="80" w:type="dxa"/>
+              <w:left w:w="70" w:type="dxa"/>
+              <w:right w:w="70" w:type="dxa"/>
             </w:tcMar>
             <w:shd w:fill="F8FAFC"/>
             <w:vAlign w:val="center"/>
           </w:tcPr>
           <w:p>
             <w:pPr>
-              <w:spacing w:before="0" w:after="0" w:line="252" w:lineRule="auto"/>
+              <w:spacing w:before="0" w:after="0" w:line="259" w:lineRule="auto"/>
               <w:jc w:val="left"/>
             </w:pPr>
             <w:r>
@@ -2053,19 +2048,19 @@
         </w:tc>
         <w:tc>
           <w:tcPr>
-            <w:tcW w:type="dxa" w:w="1008"/>
+            <w:tcW w:type="dxa" w:w="1037"/>
             <w:tcMar>
               <w:top w:w="40" w:type="dxa"/>
               <w:bottom w:w="40" w:type="dxa"/>
-              <w:left w:w="80" w:type="dxa"/>
-              <w:right w:w="80" w:type="dxa"/>
+              <w:left w:w="70" w:type="dxa"/>
+              <w:right w:w="70" w:type="dxa"/>
             </w:tcMar>
             <w:shd w:fill="F8FAFC"/>
             <w:vAlign w:val="center"/>
           </w:tcPr>
           <w:p>
             <w:pPr>
-              <w:spacing w:before="0" w:after="0" w:line="252" w:lineRule="auto"/>
+              <w:spacing w:before="0" w:after="0" w:line="259" w:lineRule="auto"/>
               <w:jc w:val="left"/>
             </w:pPr>
             <w:r>
@@ -2082,19 +2077,19 @@
         </w:tc>
         <w:tc>
           <w:tcPr>
-            <w:tcW w:type="dxa" w:w="1080"/>
+            <w:tcW w:type="dxa" w:w="1094"/>
             <w:tcMar>
               <w:top w:w="40" w:type="dxa"/>
               <w:bottom w:w="40" w:type="dxa"/>
-              <w:left w:w="80" w:type="dxa"/>
-              <w:right w:w="80" w:type="dxa"/>
+              <w:left w:w="70" w:type="dxa"/>
+              <w:right w:w="70" w:type="dxa"/>
             </w:tcMar>
             <w:shd w:fill="F8FAFC"/>
             <w:vAlign w:val="center"/>
           </w:tcPr>
           <w:p>
             <w:pPr>
-              <w:spacing w:before="0" w:after="0" w:line="252" w:lineRule="auto"/>
+              <w:spacing w:before="0" w:after="0" w:line="259" w:lineRule="auto"/>
               <w:jc w:val="left"/>
             </w:pPr>
             <w:r>
@@ -2111,19 +2106,19 @@
         </w:tc>
         <w:tc>
           <w:tcPr>
-            <w:tcW w:type="dxa" w:w="936"/>
+            <w:tcW w:type="dxa" w:w="950"/>
             <w:tcMar>
               <w:top w:w="40" w:type="dxa"/>
               <w:bottom w:w="40" w:type="dxa"/>
-              <w:left w:w="80" w:type="dxa"/>
-              <w:right w:w="80" w:type="dxa"/>
+              <w:left w:w="70" w:type="dxa"/>
+              <w:right w:w="70" w:type="dxa"/>
             </w:tcMar>
             <w:shd w:fill="F8FAFC"/>
             <w:vAlign w:val="center"/>
           </w:tcPr>
           <w:p>
             <w:pPr>
-              <w:spacing w:before="0" w:after="0" w:line="252" w:lineRule="auto"/>
+              <w:spacing w:before="0" w:after="0" w:line="259" w:lineRule="auto"/>
               <w:jc w:val="left"/>
             </w:pPr>
             <w:r>
@@ -2140,19 +2135,19 @@
         </w:tc>
         <w:tc>
           <w:tcPr>
-            <w:tcW w:type="dxa" w:w="1224"/>
+            <w:tcW w:type="dxa" w:w="1238"/>
             <w:tcMar>
               <w:top w:w="40" w:type="dxa"/>
               <w:bottom w:w="40" w:type="dxa"/>
-              <w:left w:w="80" w:type="dxa"/>
-              <w:right w:w="80" w:type="dxa"/>
+              <w:left w:w="70" w:type="dxa"/>
+              <w:right w:w="70" w:type="dxa"/>
             </w:tcMar>
             <w:shd w:fill="F8FAFC"/>
             <w:vAlign w:val="center"/>
           </w:tcPr>
           <w:p>
             <w:pPr>
-              <w:spacing w:before="0" w:after="0" w:line="252" w:lineRule="auto"/>
+              <w:spacing w:before="0" w:after="0" w:line="259" w:lineRule="auto"/>
               <w:jc w:val="left"/>
             </w:pPr>
             <w:r>
@@ -2175,15 +2170,15 @@
             <w:tcMar>
               <w:top w:w="40" w:type="dxa"/>
               <w:bottom w:w="40" w:type="dxa"/>
-              <w:left w:w="80" w:type="dxa"/>
-              <w:right w:w="80" w:type="dxa"/>
+              <w:left w:w="70" w:type="dxa"/>
+              <w:right w:w="70" w:type="dxa"/>
             </w:tcMar>
             <w:shd w:fill="F8FAFC"/>
             <w:vAlign w:val="center"/>
           </w:tcPr>
           <w:p>
             <w:pPr>
-              <w:spacing w:before="0" w:after="0" w:line="252" w:lineRule="auto"/>
+              <w:spacing w:before="0" w:after="0" w:line="259" w:lineRule="auto"/>
               <w:jc w:val="left"/>
             </w:pPr>
             <w:r>
@@ -2204,49 +2199,49 @@
       <w:tr>
         <w:tc>
           <w:tcPr>
-            <w:tcW w:type="dxa" w:w="576"/>
+            <w:tcW w:type="dxa" w:w="432"/>
             <w:tcMar>
               <w:top w:w="40" w:type="dxa"/>
               <w:bottom w:w="40" w:type="dxa"/>
-              <w:left w:w="80" w:type="dxa"/>
-              <w:right w:w="80" w:type="dxa"/>
+              <w:left w:w="70" w:type="dxa"/>
+              <w:right w:w="70" w:type="dxa"/>
             </w:tcMar>
             <w:shd w:fill="FFFFFF"/>
             <w:vAlign w:val="center"/>
           </w:tcPr>
           <w:p>
             <w:pPr>
-              <w:spacing w:before="0" w:after="0" w:line="252" w:lineRule="auto"/>
-              <w:jc w:val="left"/>
+              <w:spacing w:before="0" w:after="0" w:line="259" w:lineRule="auto"/>
+              <w:jc w:val="center"/>
             </w:pPr>
             <w:r>
               <w:rPr>
                 <w:rFonts w:ascii="Arial" w:hAnsi="Arial"/>
-                <w:b w:val="0"/>
+                <w:b/>
                 <w:i w:val="0"/>
-                <w:color w:val="4B5563"/>
-                <w:sz w:val="13"/>
+                <w:color w:val="0F294A"/>
+                <w:sz w:val="14"/>
               </w:rPr>
-              <w:t>Lagging</w:t>
+              <w:t>G</w:t>
             </w:r>
           </w:p>
         </w:tc>
         <w:tc>
           <w:tcPr>
-            <w:tcW w:type="dxa" w:w="576"/>
+            <w:tcW w:type="dxa" w:w="605"/>
             <w:tcMar>
               <w:top w:w="40" w:type="dxa"/>
               <w:bottom w:w="40" w:type="dxa"/>
-              <w:left w:w="80" w:type="dxa"/>
-              <w:right w:w="80" w:type="dxa"/>
+              <w:left w:w="70" w:type="dxa"/>
+              <w:right w:w="70" w:type="dxa"/>
             </w:tcMar>
             <w:shd w:fill="FFFFFF"/>
             <w:vAlign w:val="center"/>
           </w:tcPr>
           <w:p>
             <w:pPr>
-              <w:spacing w:before="0" w:after="0" w:line="252" w:lineRule="auto"/>
-              <w:jc w:val="left"/>
+              <w:spacing w:before="0" w:after="0" w:line="259" w:lineRule="auto"/>
+              <w:jc w:val="center"/>
             </w:pPr>
             <w:r>
               <w:rPr>
@@ -2262,19 +2257,19 @@
         </w:tc>
         <w:tc>
           <w:tcPr>
-            <w:tcW w:type="dxa" w:w="2664"/>
+            <w:tcW w:type="dxa" w:w="2808"/>
             <w:tcMar>
               <w:top w:w="40" w:type="dxa"/>
               <w:bottom w:w="40" w:type="dxa"/>
-              <w:left w:w="80" w:type="dxa"/>
-              <w:right w:w="80" w:type="dxa"/>
+              <w:left w:w="70" w:type="dxa"/>
+              <w:right w:w="70" w:type="dxa"/>
             </w:tcMar>
             <w:shd w:fill="FFFFFF"/>
             <w:vAlign w:val="center"/>
           </w:tcPr>
           <w:p>
             <w:pPr>
-              <w:spacing w:before="0" w:after="0" w:line="252" w:lineRule="auto"/>
+              <w:spacing w:before="0" w:after="0" w:line="259" w:lineRule="auto"/>
               <w:jc w:val="left"/>
             </w:pPr>
             <w:r>
@@ -2302,19 +2297,19 @@
         </w:tc>
         <w:tc>
           <w:tcPr>
-            <w:tcW w:type="dxa" w:w="1368"/>
+            <w:tcW w:type="dxa" w:w="1325"/>
             <w:tcMar>
               <w:top w:w="40" w:type="dxa"/>
               <w:bottom w:w="40" w:type="dxa"/>
-              <w:left w:w="80" w:type="dxa"/>
-              <w:right w:w="80" w:type="dxa"/>
+              <w:left w:w="70" w:type="dxa"/>
+              <w:right w:w="70" w:type="dxa"/>
             </w:tcMar>
             <w:shd w:fill="FFFFFF"/>
             <w:vAlign w:val="center"/>
           </w:tcPr>
           <w:p>
             <w:pPr>
-              <w:spacing w:before="0" w:after="0" w:line="252" w:lineRule="auto"/>
+              <w:spacing w:before="0" w:after="0" w:line="259" w:lineRule="auto"/>
               <w:jc w:val="left"/>
             </w:pPr>
             <w:r>
@@ -2333,19 +2328,19 @@
         </w:tc>
         <w:tc>
           <w:tcPr>
-            <w:tcW w:type="dxa" w:w="1008"/>
+            <w:tcW w:type="dxa" w:w="1037"/>
             <w:tcMar>
               <w:top w:w="40" w:type="dxa"/>
               <w:bottom w:w="40" w:type="dxa"/>
-              <w:left w:w="80" w:type="dxa"/>
-              <w:right w:w="80" w:type="dxa"/>
+              <w:left w:w="70" w:type="dxa"/>
+              <w:right w:w="70" w:type="dxa"/>
             </w:tcMar>
             <w:shd w:fill="FFFFFF"/>
             <w:vAlign w:val="center"/>
           </w:tcPr>
           <w:p>
             <w:pPr>
-              <w:spacing w:before="0" w:after="0" w:line="252" w:lineRule="auto"/>
+              <w:spacing w:before="0" w:after="0" w:line="259" w:lineRule="auto"/>
               <w:jc w:val="left"/>
             </w:pPr>
             <w:r>
@@ -2362,19 +2357,19 @@
         </w:tc>
         <w:tc>
           <w:tcPr>
-            <w:tcW w:type="dxa" w:w="1080"/>
+            <w:tcW w:type="dxa" w:w="1094"/>
             <w:tcMar>
               <w:top w:w="40" w:type="dxa"/>
               <w:bottom w:w="40" w:type="dxa"/>
-              <w:left w:w="80" w:type="dxa"/>
-              <w:right w:w="80" w:type="dxa"/>
+              <w:left w:w="70" w:type="dxa"/>
+              <w:right w:w="70" w:type="dxa"/>
             </w:tcMar>
             <w:shd w:fill="FFFFFF"/>
             <w:vAlign w:val="center"/>
           </w:tcPr>
           <w:p>
             <w:pPr>
-              <w:spacing w:before="0" w:after="0" w:line="252" w:lineRule="auto"/>
+              <w:spacing w:before="0" w:after="0" w:line="259" w:lineRule="auto"/>
               <w:jc w:val="left"/>
             </w:pPr>
             <w:r>
@@ -2391,19 +2386,19 @@
         </w:tc>
         <w:tc>
           <w:tcPr>
-            <w:tcW w:type="dxa" w:w="936"/>
+            <w:tcW w:type="dxa" w:w="950"/>
             <w:tcMar>
               <w:top w:w="40" w:type="dxa"/>
               <w:bottom w:w="40" w:type="dxa"/>
-              <w:left w:w="80" w:type="dxa"/>
-              <w:right w:w="80" w:type="dxa"/>
+              <w:left w:w="70" w:type="dxa"/>
+              <w:right w:w="70" w:type="dxa"/>
             </w:tcMar>
             <w:shd w:fill="FFFFFF"/>
             <w:vAlign w:val="center"/>
           </w:tcPr>
           <w:p>
             <w:pPr>
-              <w:spacing w:before="0" w:after="0" w:line="252" w:lineRule="auto"/>
+              <w:spacing w:before="0" w:after="0" w:line="259" w:lineRule="auto"/>
               <w:jc w:val="left"/>
             </w:pPr>
             <w:r>
@@ -2420,19 +2415,19 @@
         </w:tc>
         <w:tc>
           <w:tcPr>
-            <w:tcW w:type="dxa" w:w="1224"/>
+            <w:tcW w:type="dxa" w:w="1238"/>
             <w:tcMar>
               <w:top w:w="40" w:type="dxa"/>
               <w:bottom w:w="40" w:type="dxa"/>
-              <w:left w:w="80" w:type="dxa"/>
-              <w:right w:w="80" w:type="dxa"/>
+              <w:left w:w="70" w:type="dxa"/>
+              <w:right w:w="70" w:type="dxa"/>
             </w:tcMar>
             <w:shd w:fill="FFFFFF"/>
             <w:vAlign w:val="center"/>
           </w:tcPr>
           <w:p>
             <w:pPr>
-              <w:spacing w:before="0" w:after="0" w:line="252" w:lineRule="auto"/>
+              <w:spacing w:before="0" w:after="0" w:line="259" w:lineRule="auto"/>
               <w:jc w:val="left"/>
             </w:pPr>
             <w:r>
@@ -2455,15 +2450,15 @@
             <w:tcMar>
               <w:top w:w="40" w:type="dxa"/>
               <w:bottom w:w="40" w:type="dxa"/>
-              <w:left w:w="80" w:type="dxa"/>
-              <w:right w:w="80" w:type="dxa"/>
+              <w:left w:w="70" w:type="dxa"/>
+              <w:right w:w="70" w:type="dxa"/>
             </w:tcMar>
             <w:shd w:fill="FFFFFF"/>
             <w:vAlign w:val="center"/>
           </w:tcPr>
           <w:p>
             <w:pPr>
-              <w:spacing w:before="0" w:after="0" w:line="252" w:lineRule="auto"/>
+              <w:spacing w:before="0" w:after="0" w:line="259" w:lineRule="auto"/>
               <w:jc w:val="left"/>
             </w:pPr>
             <w:r>
@@ -2512,29 +2507,29 @@
         </w:tblBorders>
       </w:tblPr>
       <w:tblGrid>
-        <w:gridCol w:w="2151"/>
-        <w:gridCol w:w="2151"/>
-        <w:gridCol w:w="2151"/>
-        <w:gridCol w:w="2151"/>
-        <w:gridCol w:w="2151"/>
+        <w:gridCol w:w="2163"/>
+        <w:gridCol w:w="2163"/>
+        <w:gridCol w:w="2163"/>
+        <w:gridCol w:w="2163"/>
+        <w:gridCol w:w="2163"/>
       </w:tblGrid>
       <w:tr>
         <w:tc>
           <w:tcPr>
-            <w:tcW w:type="dxa" w:w="576"/>
+            <w:tcW w:type="dxa" w:w="605"/>
             <w:tcMar>
               <w:top w:w="40" w:type="dxa"/>
               <w:bottom w:w="40" w:type="dxa"/>
-              <w:left w:w="80" w:type="dxa"/>
-              <w:right w:w="80" w:type="dxa"/>
+              <w:left w:w="70" w:type="dxa"/>
+              <w:right w:w="70" w:type="dxa"/>
             </w:tcMar>
             <w:shd w:fill="0F294A"/>
             <w:vAlign w:val="center"/>
           </w:tcPr>
           <w:p>
             <w:pPr>
-              <w:spacing w:before="0" w:after="0" w:line="252" w:lineRule="auto"/>
-              <w:jc w:val="left"/>
+              <w:spacing w:before="0" w:after="0" w:line="259" w:lineRule="auto"/>
+              <w:jc w:val="center"/>
             </w:pPr>
             <w:r>
               <w:rPr>
@@ -2554,15 +2549,15 @@
             <w:tcMar>
               <w:top w:w="40" w:type="dxa"/>
               <w:bottom w:w="40" w:type="dxa"/>
-              <w:left w:w="80" w:type="dxa"/>
-              <w:right w:w="80" w:type="dxa"/>
+              <w:left w:w="70" w:type="dxa"/>
+              <w:right w:w="70" w:type="dxa"/>
             </w:tcMar>
             <w:shd w:fill="0F294A"/>
             <w:vAlign w:val="center"/>
           </w:tcPr>
           <w:p>
             <w:pPr>
-              <w:spacing w:before="0" w:after="0" w:line="252" w:lineRule="auto"/>
+              <w:spacing w:before="0" w:after="0" w:line="259" w:lineRule="auto"/>
               <w:jc w:val="left"/>
             </w:pPr>
             <w:r>
@@ -2583,15 +2578,15 @@
             <w:tcMar>
               <w:top w:w="40" w:type="dxa"/>
               <w:bottom w:w="40" w:type="dxa"/>
-              <w:left w:w="80" w:type="dxa"/>
-              <w:right w:w="80" w:type="dxa"/>
+              <w:left w:w="70" w:type="dxa"/>
+              <w:right w:w="70" w:type="dxa"/>
             </w:tcMar>
             <w:shd w:fill="0F294A"/>
             <w:vAlign w:val="center"/>
           </w:tcPr>
           <w:p>
             <w:pPr>
-              <w:spacing w:before="0" w:after="0" w:line="252" w:lineRule="auto"/>
+              <w:spacing w:before="0" w:after="0" w:line="259" w:lineRule="auto"/>
               <w:jc w:val="left"/>
             </w:pPr>
             <w:r>
@@ -2612,15 +2607,15 @@
             <w:tcMar>
               <w:top w:w="40" w:type="dxa"/>
               <w:bottom w:w="40" w:type="dxa"/>
-              <w:left w:w="80" w:type="dxa"/>
-              <w:right w:w="80" w:type="dxa"/>
+              <w:left w:w="70" w:type="dxa"/>
+              <w:right w:w="70" w:type="dxa"/>
             </w:tcMar>
             <w:shd w:fill="0F294A"/>
             <w:vAlign w:val="center"/>
           </w:tcPr>
           <w:p>
             <w:pPr>
-              <w:spacing w:before="0" w:after="0" w:line="252" w:lineRule="auto"/>
+              <w:spacing w:before="0" w:after="0" w:line="259" w:lineRule="auto"/>
               <w:jc w:val="left"/>
             </w:pPr>
             <w:r>
@@ -2637,20 +2632,20 @@
         </w:tc>
         <w:tc>
           <w:tcPr>
-            <w:tcW w:type="dxa" w:w="893"/>
+            <w:tcW w:type="dxa" w:w="922"/>
             <w:tcMar>
               <w:top w:w="40" w:type="dxa"/>
               <w:bottom w:w="40" w:type="dxa"/>
-              <w:left w:w="80" w:type="dxa"/>
-              <w:right w:w="80" w:type="dxa"/>
+              <w:left w:w="70" w:type="dxa"/>
+              <w:right w:w="70" w:type="dxa"/>
             </w:tcMar>
             <w:shd w:fill="0F294A"/>
             <w:vAlign w:val="center"/>
           </w:tcPr>
           <w:p>
             <w:pPr>
-              <w:spacing w:before="0" w:after="0" w:line="252" w:lineRule="auto"/>
-              <w:jc w:val="left"/>
+              <w:spacing w:before="0" w:after="0" w:line="259" w:lineRule="auto"/>
+              <w:jc w:val="center"/>
             </w:pPr>
             <w:r>
               <w:rPr>
@@ -2668,20 +2663,20 @@
       <w:tr>
         <w:tc>
           <w:tcPr>
-            <w:tcW w:type="dxa" w:w="576"/>
+            <w:tcW w:type="dxa" w:w="605"/>
             <w:tcMar>
               <w:top w:w="40" w:type="dxa"/>
               <w:bottom w:w="40" w:type="dxa"/>
-              <w:left w:w="80" w:type="dxa"/>
-              <w:right w:w="80" w:type="dxa"/>
+              <w:left w:w="70" w:type="dxa"/>
+              <w:right w:w="70" w:type="dxa"/>
             </w:tcMar>
             <w:shd w:fill="FFFFFF"/>
             <w:vAlign w:val="center"/>
           </w:tcPr>
           <w:p>
             <w:pPr>
-              <w:spacing w:before="0" w:after="0" w:line="252" w:lineRule="auto"/>
-              <w:jc w:val="left"/>
+              <w:spacing w:before="0" w:after="0" w:line="259" w:lineRule="auto"/>
+              <w:jc w:val="center"/>
             </w:pPr>
             <w:r>
               <w:rPr>
@@ -2701,15 +2696,15 @@
             <w:tcMar>
               <w:top w:w="40" w:type="dxa"/>
               <w:bottom w:w="40" w:type="dxa"/>
-              <w:left w:w="80" w:type="dxa"/>
-              <w:right w:w="80" w:type="dxa"/>
+              <w:left w:w="70" w:type="dxa"/>
+              <w:right w:w="70" w:type="dxa"/>
             </w:tcMar>
             <w:shd w:fill="FFFFFF"/>
             <w:vAlign w:val="center"/>
           </w:tcPr>
           <w:p>
             <w:pPr>
-              <w:spacing w:before="0" w:after="0" w:line="252" w:lineRule="auto"/>
+              <w:spacing w:before="0" w:after="0" w:line="259" w:lineRule="auto"/>
               <w:jc w:val="left"/>
             </w:pPr>
             <w:r>
@@ -2782,15 +2777,15 @@
             <w:tcMar>
               <w:top w:w="40" w:type="dxa"/>
               <w:bottom w:w="40" w:type="dxa"/>
-              <w:left w:w="80" w:type="dxa"/>
-              <w:right w:w="80" w:type="dxa"/>
+              <w:left w:w="70" w:type="dxa"/>
+              <w:right w:w="70" w:type="dxa"/>
             </w:tcMar>
             <w:shd w:fill="FFFFFF"/>
             <w:vAlign w:val="center"/>
           </w:tcPr>
           <w:p>
             <w:pPr>
-              <w:spacing w:before="0" w:after="0" w:line="252" w:lineRule="auto"/>
+              <w:spacing w:before="0" w:after="0" w:line="259" w:lineRule="auto"/>
               <w:jc w:val="left"/>
             </w:pPr>
             <w:r>
@@ -2821,15 +2816,15 @@
             <w:tcMar>
               <w:top w:w="40" w:type="dxa"/>
               <w:bottom w:w="40" w:type="dxa"/>
-              <w:left w:w="80" w:type="dxa"/>
-              <w:right w:w="80" w:type="dxa"/>
+              <w:left w:w="70" w:type="dxa"/>
+              <w:right w:w="70" w:type="dxa"/>
             </w:tcMar>
             <w:shd w:fill="FFFFFF"/>
             <w:vAlign w:val="center"/>
           </w:tcPr>
           <w:p>
             <w:pPr>
-              <w:spacing w:before="0" w:after="0" w:line="252" w:lineRule="auto"/>
+              <w:spacing w:before="0" w:after="0" w:line="259" w:lineRule="auto"/>
               <w:jc w:val="left"/>
             </w:pPr>
             <w:r>
@@ -2856,20 +2851,20 @@
         </w:tc>
         <w:tc>
           <w:tcPr>
-            <w:tcW w:type="dxa" w:w="893"/>
+            <w:tcW w:type="dxa" w:w="922"/>
             <w:tcMar>
               <w:top w:w="40" w:type="dxa"/>
               <w:bottom w:w="40" w:type="dxa"/>
-              <w:left w:w="80" w:type="dxa"/>
-              <w:right w:w="80" w:type="dxa"/>
+              <w:left w:w="70" w:type="dxa"/>
+              <w:right w:w="70" w:type="dxa"/>
             </w:tcMar>
             <w:shd w:fill="FFFFFF"/>
             <w:vAlign w:val="center"/>
           </w:tcPr>
           <w:p>
             <w:pPr>
-              <w:spacing w:before="0" w:after="0" w:line="252" w:lineRule="auto"/>
-              <w:jc w:val="left"/>
+              <w:spacing w:before="0" w:after="0" w:line="259" w:lineRule="auto"/>
+              <w:jc w:val="center"/>
             </w:pPr>
             <w:r>
               <w:rPr>
@@ -2887,20 +2882,20 @@
       <w:tr>
         <w:tc>
           <w:tcPr>
-            <w:tcW w:type="dxa" w:w="576"/>
+            <w:tcW w:type="dxa" w:w="605"/>
             <w:tcMar>
               <w:top w:w="40" w:type="dxa"/>
               <w:bottom w:w="40" w:type="dxa"/>
-              <w:left w:w="80" w:type="dxa"/>
-              <w:right w:w="80" w:type="dxa"/>
+              <w:left w:w="70" w:type="dxa"/>
+              <w:right w:w="70" w:type="dxa"/>
             </w:tcMar>
             <w:shd w:fill="F8FAFC"/>
             <w:vAlign w:val="center"/>
           </w:tcPr>
           <w:p>
             <w:pPr>
-              <w:spacing w:before="0" w:after="0" w:line="252" w:lineRule="auto"/>
-              <w:jc w:val="left"/>
+              <w:spacing w:before="0" w:after="0" w:line="259" w:lineRule="auto"/>
+              <w:jc w:val="center"/>
             </w:pPr>
             <w:r>
               <w:rPr>
@@ -2920,15 +2915,15 @@
             <w:tcMar>
               <w:top w:w="40" w:type="dxa"/>
               <w:bottom w:w="40" w:type="dxa"/>
-              <w:left w:w="80" w:type="dxa"/>
-              <w:right w:w="80" w:type="dxa"/>
+              <w:left w:w="70" w:type="dxa"/>
+              <w:right w:w="70" w:type="dxa"/>
             </w:tcMar>
             <w:shd w:fill="F8FAFC"/>
             <w:vAlign w:val="center"/>
           </w:tcPr>
           <w:p>
             <w:pPr>
-              <w:spacing w:before="0" w:after="0" w:line="252" w:lineRule="auto"/>
+              <w:spacing w:before="0" w:after="0" w:line="259" w:lineRule="auto"/>
               <w:jc w:val="left"/>
             </w:pPr>
             <w:r>
@@ -3001,15 +2996,15 @@
             <w:tcMar>
               <w:top w:w="40" w:type="dxa"/>
               <w:bottom w:w="40" w:type="dxa"/>
-              <w:left w:w="80" w:type="dxa"/>
-              <w:right w:w="80" w:type="dxa"/>
+              <w:left w:w="70" w:type="dxa"/>
+              <w:right w:w="70" w:type="dxa"/>
             </w:tcMar>
             <w:shd w:fill="F8FAFC"/>
             <w:vAlign w:val="center"/>
           </w:tcPr>
           <w:p>
             <w:pPr>
-              <w:spacing w:before="0" w:after="0" w:line="252" w:lineRule="auto"/>
+              <w:spacing w:before="0" w:after="0" w:line="259" w:lineRule="auto"/>
               <w:jc w:val="left"/>
             </w:pPr>
             <w:r>
@@ -3040,15 +3035,15 @@
             <w:tcMar>
               <w:top w:w="40" w:type="dxa"/>
               <w:bottom w:w="40" w:type="dxa"/>
-              <w:left w:w="80" w:type="dxa"/>
-              <w:right w:w="80" w:type="dxa"/>
+              <w:left w:w="70" w:type="dxa"/>
+              <w:right w:w="70" w:type="dxa"/>
             </w:tcMar>
             <w:shd w:fill="F8FAFC"/>
             <w:vAlign w:val="center"/>
           </w:tcPr>
           <w:p>
             <w:pPr>
-              <w:spacing w:before="0" w:after="0" w:line="252" w:lineRule="auto"/>
+              <w:spacing w:before="0" w:after="0" w:line="259" w:lineRule="auto"/>
               <w:jc w:val="left"/>
             </w:pPr>
             <w:r>
@@ -3075,20 +3070,20 @@
         </w:tc>
         <w:tc>
           <w:tcPr>
-            <w:tcW w:type="dxa" w:w="893"/>
+            <w:tcW w:type="dxa" w:w="922"/>
             <w:tcMar>
               <w:top w:w="40" w:type="dxa"/>
               <w:bottom w:w="40" w:type="dxa"/>
-              <w:left w:w="80" w:type="dxa"/>
-              <w:right w:w="80" w:type="dxa"/>
+              <w:left w:w="70" w:type="dxa"/>
+              <w:right w:w="70" w:type="dxa"/>
             </w:tcMar>
             <w:shd w:fill="F8FAFC"/>
             <w:vAlign w:val="center"/>
           </w:tcPr>
           <w:p>
             <w:pPr>
-              <w:spacing w:before="0" w:after="0" w:line="252" w:lineRule="auto"/>
-              <w:jc w:val="left"/>
+              <w:spacing w:before="0" w:after="0" w:line="259" w:lineRule="auto"/>
+              <w:jc w:val="center"/>
             </w:pPr>
             <w:r>
               <w:rPr>
@@ -3106,20 +3101,20 @@
       <w:tr>
         <w:tc>
           <w:tcPr>
-            <w:tcW w:type="dxa" w:w="576"/>
+            <w:tcW w:type="dxa" w:w="605"/>
             <w:tcMar>
               <w:top w:w="40" w:type="dxa"/>
               <w:bottom w:w="40" w:type="dxa"/>
-              <w:left w:w="80" w:type="dxa"/>
-              <w:right w:w="80" w:type="dxa"/>
+              <w:left w:w="70" w:type="dxa"/>
+              <w:right w:w="70" w:type="dxa"/>
             </w:tcMar>
             <w:shd w:fill="FFFFFF"/>
             <w:vAlign w:val="center"/>
           </w:tcPr>
           <w:p>
             <w:pPr>
-              <w:spacing w:before="0" w:after="0" w:line="252" w:lineRule="auto"/>
-              <w:jc w:val="left"/>
+              <w:spacing w:before="0" w:after="0" w:line="259" w:lineRule="auto"/>
+              <w:jc w:val="center"/>
             </w:pPr>
             <w:r>
               <w:rPr>
@@ -3139,15 +3134,15 @@
             <w:tcMar>
               <w:top w:w="40" w:type="dxa"/>
               <w:bottom w:w="40" w:type="dxa"/>
-              <w:left w:w="80" w:type="dxa"/>
-              <w:right w:w="80" w:type="dxa"/>
+              <w:left w:w="70" w:type="dxa"/>
+              <w:right w:w="70" w:type="dxa"/>
             </w:tcMar>
             <w:shd w:fill="FFFFFF"/>
             <w:vAlign w:val="center"/>
           </w:tcPr>
           <w:p>
             <w:pPr>
-              <w:spacing w:before="0" w:after="0" w:line="252" w:lineRule="auto"/>
+              <w:spacing w:before="0" w:after="0" w:line="259" w:lineRule="auto"/>
               <w:jc w:val="left"/>
             </w:pPr>
             <w:r>
@@ -3220,15 +3215,15 @@
             <w:tcMar>
               <w:top w:w="40" w:type="dxa"/>
               <w:bottom w:w="40" w:type="dxa"/>
-              <w:left w:w="80" w:type="dxa"/>
-              <w:right w:w="80" w:type="dxa"/>
+              <w:left w:w="70" w:type="dxa"/>
+              <w:right w:w="70" w:type="dxa"/>
             </w:tcMar>
             <w:shd w:fill="FFFFFF"/>
             <w:vAlign w:val="center"/>
           </w:tcPr>
           <w:p>
             <w:pPr>
-              <w:spacing w:before="0" w:after="0" w:line="252" w:lineRule="auto"/>
+              <w:spacing w:before="0" w:after="0" w:line="259" w:lineRule="auto"/>
               <w:jc w:val="left"/>
             </w:pPr>
             <w:r>
@@ -3259,15 +3254,15 @@
             <w:tcMar>
               <w:top w:w="40" w:type="dxa"/>
               <w:bottom w:w="40" w:type="dxa"/>
-              <w:left w:w="80" w:type="dxa"/>
-              <w:right w:w="80" w:type="dxa"/>
+              <w:left w:w="70" w:type="dxa"/>
+              <w:right w:w="70" w:type="dxa"/>
             </w:tcMar>
             <w:shd w:fill="FFFFFF"/>
             <w:vAlign w:val="center"/>
           </w:tcPr>
           <w:p>
             <w:pPr>
-              <w:spacing w:before="0" w:after="0" w:line="252" w:lineRule="auto"/>
+              <w:spacing w:before="0" w:after="0" w:line="259" w:lineRule="auto"/>
               <w:jc w:val="left"/>
             </w:pPr>
             <w:r>
@@ -3294,20 +3289,20 @@
         </w:tc>
         <w:tc>
           <w:tcPr>
-            <w:tcW w:type="dxa" w:w="893"/>
+            <w:tcW w:type="dxa" w:w="922"/>
             <w:tcMar>
               <w:top w:w="40" w:type="dxa"/>
               <w:bottom w:w="40" w:type="dxa"/>
-              <w:left w:w="80" w:type="dxa"/>
-              <w:right w:w="80" w:type="dxa"/>
+              <w:left w:w="70" w:type="dxa"/>
+              <w:right w:w="70" w:type="dxa"/>
             </w:tcMar>
             <w:shd w:fill="FFFFFF"/>
             <w:vAlign w:val="center"/>
           </w:tcPr>
           <w:p>
             <w:pPr>
-              <w:spacing w:before="0" w:after="0" w:line="252" w:lineRule="auto"/>
-              <w:jc w:val="left"/>
+              <w:spacing w:before="0" w:after="0" w:line="259" w:lineRule="auto"/>
+              <w:jc w:val="center"/>
             </w:pPr>
             <w:r>
               <w:rPr>
@@ -3325,20 +3320,20 @@
       <w:tr>
         <w:tc>
           <w:tcPr>
-            <w:tcW w:type="dxa" w:w="576"/>
+            <w:tcW w:type="dxa" w:w="605"/>
             <w:tcMar>
               <w:top w:w="40" w:type="dxa"/>
               <w:bottom w:w="40" w:type="dxa"/>
-              <w:left w:w="80" w:type="dxa"/>
-              <w:right w:w="80" w:type="dxa"/>
+              <w:left w:w="70" w:type="dxa"/>
+              <w:right w:w="70" w:type="dxa"/>
             </w:tcMar>
             <w:shd w:fill="F8FAFC"/>
             <w:vAlign w:val="center"/>
           </w:tcPr>
           <w:p>
             <w:pPr>
-              <w:spacing w:before="0" w:after="0" w:line="252" w:lineRule="auto"/>
-              <w:jc w:val="left"/>
+              <w:spacing w:before="0" w:after="0" w:line="259" w:lineRule="auto"/>
+              <w:jc w:val="center"/>
             </w:pPr>
             <w:r>
               <w:rPr>
@@ -3358,15 +3353,15 @@
             <w:tcMar>
               <w:top w:w="40" w:type="dxa"/>
               <w:bottom w:w="40" w:type="dxa"/>
-              <w:left w:w="80" w:type="dxa"/>
-              <w:right w:w="80" w:type="dxa"/>
+              <w:left w:w="70" w:type="dxa"/>
+              <w:right w:w="70" w:type="dxa"/>
             </w:tcMar>
             <w:shd w:fill="F8FAFC"/>
             <w:vAlign w:val="center"/>
           </w:tcPr>
           <w:p>
             <w:pPr>
-              <w:spacing w:before="0" w:after="0" w:line="252" w:lineRule="auto"/>
+              <w:spacing w:before="0" w:after="0" w:line="259" w:lineRule="auto"/>
               <w:jc w:val="left"/>
             </w:pPr>
             <w:r>
@@ -3439,15 +3434,15 @@
             <w:tcMar>
               <w:top w:w="40" w:type="dxa"/>
               <w:bottom w:w="40" w:type="dxa"/>
-              <w:left w:w="80" w:type="dxa"/>
-              <w:right w:w="80" w:type="dxa"/>
+              <w:left w:w="70" w:type="dxa"/>
+              <w:right w:w="70" w:type="dxa"/>
             </w:tcMar>
             <w:shd w:fill="F8FAFC"/>
             <w:vAlign w:val="center"/>
           </w:tcPr>
           <w:p>
             <w:pPr>
-              <w:spacing w:before="0" w:after="0" w:line="252" w:lineRule="auto"/>
+              <w:spacing w:before="0" w:after="0" w:line="259" w:lineRule="auto"/>
               <w:jc w:val="left"/>
             </w:pPr>
             <w:r>
@@ -3478,15 +3473,15 @@
             <w:tcMar>
               <w:top w:w="40" w:type="dxa"/>
               <w:bottom w:w="40" w:type="dxa"/>
-              <w:left w:w="80" w:type="dxa"/>
-              <w:right w:w="80" w:type="dxa"/>
+              <w:left w:w="70" w:type="dxa"/>
+              <w:right w:w="70" w:type="dxa"/>
             </w:tcMar>
             <w:shd w:fill="F8FAFC"/>
             <w:vAlign w:val="center"/>
           </w:tcPr>
           <w:p>
             <w:pPr>
-              <w:spacing w:before="0" w:after="0" w:line="252" w:lineRule="auto"/>
+              <w:spacing w:before="0" w:after="0" w:line="259" w:lineRule="auto"/>
               <w:jc w:val="left"/>
             </w:pPr>
             <w:r>
@@ -3513,20 +3508,20 @@
         </w:tc>
         <w:tc>
           <w:tcPr>
-            <w:tcW w:type="dxa" w:w="893"/>
+            <w:tcW w:type="dxa" w:w="922"/>
             <w:tcMar>
               <w:top w:w="40" w:type="dxa"/>
               <w:bottom w:w="40" w:type="dxa"/>
-              <w:left w:w="80" w:type="dxa"/>
-              <w:right w:w="80" w:type="dxa"/>
+              <w:left w:w="70" w:type="dxa"/>
+              <w:right w:w="70" w:type="dxa"/>
             </w:tcMar>
             <w:shd w:fill="F8FAFC"/>
             <w:vAlign w:val="center"/>
           </w:tcPr>
           <w:p>
             <w:pPr>
-              <w:spacing w:before="0" w:after="0" w:line="252" w:lineRule="auto"/>
-              <w:jc w:val="left"/>
+              <w:spacing w:before="0" w:after="0" w:line="259" w:lineRule="auto"/>
+              <w:jc w:val="center"/>
             </w:pPr>
             <w:r>
               <w:rPr>
@@ -3544,20 +3539,20 @@
       <w:tr>
         <w:tc>
           <w:tcPr>
-            <w:tcW w:type="dxa" w:w="576"/>
+            <w:tcW w:type="dxa" w:w="605"/>
             <w:tcMar>
               <w:top w:w="40" w:type="dxa"/>
               <w:bottom w:w="40" w:type="dxa"/>
-              <w:left w:w="80" w:type="dxa"/>
-              <w:right w:w="80" w:type="dxa"/>
+              <w:left w:w="70" w:type="dxa"/>
+              <w:right w:w="70" w:type="dxa"/>
             </w:tcMar>
             <w:shd w:fill="FFFFFF"/>
             <w:vAlign w:val="center"/>
           </w:tcPr>
           <w:p>
             <w:pPr>
-              <w:spacing w:before="0" w:after="0" w:line="252" w:lineRule="auto"/>
-              <w:jc w:val="left"/>
+              <w:spacing w:before="0" w:after="0" w:line="259" w:lineRule="auto"/>
+              <w:jc w:val="center"/>
             </w:pPr>
             <w:r>
               <w:rPr>
@@ -3577,15 +3572,15 @@
             <w:tcMar>
               <w:top w:w="40" w:type="dxa"/>
               <w:bottom w:w="40" w:type="dxa"/>
-              <w:left w:w="80" w:type="dxa"/>
-              <w:right w:w="80" w:type="dxa"/>
+              <w:left w:w="70" w:type="dxa"/>
+              <w:right w:w="70" w:type="dxa"/>
             </w:tcMar>
             <w:shd w:fill="FFFFFF"/>
             <w:vAlign w:val="center"/>
           </w:tcPr>
           <w:p>
             <w:pPr>
-              <w:spacing w:before="0" w:after="0" w:line="252" w:lineRule="auto"/>
+              <w:spacing w:before="0" w:after="0" w:line="259" w:lineRule="auto"/>
               <w:jc w:val="left"/>
             </w:pPr>
             <w:r>
@@ -3658,15 +3653,15 @@
             <w:tcMar>
               <w:top w:w="40" w:type="dxa"/>
               <w:bottom w:w="40" w:type="dxa"/>
-              <w:left w:w="80" w:type="dxa"/>
-              <w:right w:w="80" w:type="dxa"/>
+              <w:left w:w="70" w:type="dxa"/>
+              <w:right w:w="70" w:type="dxa"/>
             </w:tcMar>
             <w:shd w:fill="FFFFFF"/>
             <w:vAlign w:val="center"/>
           </w:tcPr>
           <w:p>
             <w:pPr>
-              <w:spacing w:before="0" w:after="0" w:line="252" w:lineRule="auto"/>
+              <w:spacing w:before="0" w:after="0" w:line="259" w:lineRule="auto"/>
               <w:jc w:val="left"/>
             </w:pPr>
             <w:r>
@@ -3697,15 +3692,15 @@
             <w:tcMar>
               <w:top w:w="40" w:type="dxa"/>
               <w:bottom w:w="40" w:type="dxa"/>
-              <w:left w:w="80" w:type="dxa"/>
-              <w:right w:w="80" w:type="dxa"/>
+              <w:left w:w="70" w:type="dxa"/>
+              <w:right w:w="70" w:type="dxa"/>
             </w:tcMar>
             <w:shd w:fill="FFFFFF"/>
             <w:vAlign w:val="center"/>
           </w:tcPr>
           <w:p>
             <w:pPr>
-              <w:spacing w:before="0" w:after="0" w:line="252" w:lineRule="auto"/>
+              <w:spacing w:before="0" w:after="0" w:line="259" w:lineRule="auto"/>
               <w:jc w:val="left"/>
             </w:pPr>
             <w:r>
@@ -3732,20 +3727,20 @@
         </w:tc>
         <w:tc>
           <w:tcPr>
-            <w:tcW w:type="dxa" w:w="893"/>
+            <w:tcW w:type="dxa" w:w="922"/>
             <w:tcMar>
               <w:top w:w="40" w:type="dxa"/>
               <w:bottom w:w="40" w:type="dxa"/>
-              <w:left w:w="80" w:type="dxa"/>
-              <w:right w:w="80" w:type="dxa"/>
+              <w:left w:w="70" w:type="dxa"/>
+              <w:right w:w="70" w:type="dxa"/>
             </w:tcMar>
             <w:shd w:fill="FFFFFF"/>
             <w:vAlign w:val="center"/>
           </w:tcPr>
           <w:p>
             <w:pPr>
-              <w:spacing w:before="0" w:after="0" w:line="252" w:lineRule="auto"/>
-              <w:jc w:val="left"/>
+              <w:spacing w:before="0" w:after="0" w:line="259" w:lineRule="auto"/>
+              <w:jc w:val="center"/>
             </w:pPr>
             <w:r>
               <w:rPr>
@@ -3791,12 +3786,12 @@
         </w:tblBorders>
       </w:tblPr>
       <w:tblGrid>
-        <w:gridCol w:w="1793"/>
-        <w:gridCol w:w="1793"/>
-        <w:gridCol w:w="1793"/>
-        <w:gridCol w:w="1793"/>
-        <w:gridCol w:w="1793"/>
-        <w:gridCol w:w="1793"/>
+        <w:gridCol w:w="1802"/>
+        <w:gridCol w:w="1802"/>
+        <w:gridCol w:w="1802"/>
+        <w:gridCol w:w="1802"/>
+        <w:gridCol w:w="1802"/>
+        <w:gridCol w:w="1802"/>
       </w:tblGrid>
       <w:tr>
         <w:tc>
@@ -3805,16 +3800,16 @@
             <w:tcMar>
               <w:top w:w="40" w:type="dxa"/>
               <w:bottom w:w="40" w:type="dxa"/>
-              <w:left w:w="80" w:type="dxa"/>
-              <w:right w:w="80" w:type="dxa"/>
+              <w:left w:w="70" w:type="dxa"/>
+              <w:right w:w="70" w:type="dxa"/>
             </w:tcMar>
             <w:shd w:fill="0F294A"/>
             <w:vAlign w:val="center"/>
           </w:tcPr>
           <w:p>
             <w:pPr>
-              <w:spacing w:before="0" w:after="0" w:line="252" w:lineRule="auto"/>
-              <w:jc w:val="left"/>
+              <w:spacing w:before="0" w:after="0" w:line="259" w:lineRule="auto"/>
+              <w:jc w:val="center"/>
             </w:pPr>
             <w:r>
               <w:rPr>
@@ -3834,16 +3829,16 @@
             <w:tcMar>
               <w:top w:w="40" w:type="dxa"/>
               <w:bottom w:w="40" w:type="dxa"/>
-              <w:left w:w="80" w:type="dxa"/>
-              <w:right w:w="80" w:type="dxa"/>
+              <w:left w:w="70" w:type="dxa"/>
+              <w:right w:w="70" w:type="dxa"/>
             </w:tcMar>
             <w:shd w:fill="0F294A"/>
             <w:vAlign w:val="center"/>
           </w:tcPr>
           <w:p>
             <w:pPr>
-              <w:spacing w:before="0" w:after="0" w:line="252" w:lineRule="auto"/>
-              <w:jc w:val="left"/>
+              <w:spacing w:before="0" w:after="0" w:line="259" w:lineRule="auto"/>
+              <w:jc w:val="center"/>
             </w:pPr>
             <w:r>
               <w:rPr>
@@ -3863,15 +3858,15 @@
             <w:tcMar>
               <w:top w:w="40" w:type="dxa"/>
               <w:bottom w:w="40" w:type="dxa"/>
-              <w:left w:w="80" w:type="dxa"/>
-              <w:right w:w="80" w:type="dxa"/>
+              <w:left w:w="70" w:type="dxa"/>
+              <w:right w:w="70" w:type="dxa"/>
             </w:tcMar>
             <w:shd w:fill="0F294A"/>
             <w:vAlign w:val="center"/>
           </w:tcPr>
           <w:p>
             <w:pPr>
-              <w:spacing w:before="0" w:after="0" w:line="252" w:lineRule="auto"/>
+              <w:spacing w:before="0" w:after="0" w:line="259" w:lineRule="auto"/>
               <w:jc w:val="left"/>
             </w:pPr>
             <w:r>
@@ -3892,15 +3887,15 @@
             <w:tcMar>
               <w:top w:w="40" w:type="dxa"/>
               <w:bottom w:w="40" w:type="dxa"/>
-              <w:left w:w="80" w:type="dxa"/>
-              <w:right w:w="80" w:type="dxa"/>
+              <w:left w:w="70" w:type="dxa"/>
+              <w:right w:w="70" w:type="dxa"/>
             </w:tcMar>
             <w:shd w:fill="0F294A"/>
             <w:vAlign w:val="center"/>
           </w:tcPr>
           <w:p>
             <w:pPr>
-              <w:spacing w:before="0" w:after="0" w:line="252" w:lineRule="auto"/>
+              <w:spacing w:before="0" w:after="0" w:line="259" w:lineRule="auto"/>
               <w:jc w:val="left"/>
             </w:pPr>
             <w:r>
@@ -3917,19 +3912,19 @@
         </w:tc>
         <w:tc>
           <w:tcPr>
-            <w:tcW w:type="dxa" w:w="1728"/>
+            <w:tcW w:type="dxa" w:w="1786"/>
             <w:tcMar>
               <w:top w:w="40" w:type="dxa"/>
               <w:bottom w:w="40" w:type="dxa"/>
-              <w:left w:w="80" w:type="dxa"/>
-              <w:right w:w="80" w:type="dxa"/>
+              <w:left w:w="70" w:type="dxa"/>
+              <w:right w:w="70" w:type="dxa"/>
             </w:tcMar>
             <w:shd w:fill="0F294A"/>
             <w:vAlign w:val="center"/>
           </w:tcPr>
           <w:p>
             <w:pPr>
-              <w:spacing w:before="0" w:after="0" w:line="252" w:lineRule="auto"/>
+              <w:spacing w:before="0" w:after="0" w:line="259" w:lineRule="auto"/>
               <w:jc w:val="left"/>
             </w:pPr>
             <w:r>
@@ -3950,16 +3945,16 @@
             <w:tcMar>
               <w:top w:w="40" w:type="dxa"/>
               <w:bottom w:w="40" w:type="dxa"/>
-              <w:left w:w="80" w:type="dxa"/>
-              <w:right w:w="80" w:type="dxa"/>
+              <w:left w:w="70" w:type="dxa"/>
+              <w:right w:w="70" w:type="dxa"/>
             </w:tcMar>
             <w:shd w:fill="0F294A"/>
             <w:vAlign w:val="center"/>
           </w:tcPr>
           <w:p>
             <w:pPr>
-              <w:spacing w:before="0" w:after="0" w:line="252" w:lineRule="auto"/>
-              <w:jc w:val="left"/>
+              <w:spacing w:before="0" w:after="0" w:line="259" w:lineRule="auto"/>
+              <w:jc w:val="center"/>
             </w:pPr>
             <w:r>
               <w:rPr>
@@ -3981,16 +3976,16 @@
             <w:tcMar>
               <w:top w:w="40" w:type="dxa"/>
               <w:bottom w:w="40" w:type="dxa"/>
-              <w:left w:w="80" w:type="dxa"/>
-              <w:right w:w="80" w:type="dxa"/>
+              <w:left w:w="70" w:type="dxa"/>
+              <w:right w:w="70" w:type="dxa"/>
             </w:tcMar>
             <w:shd w:fill="FFFFFF"/>
             <w:vAlign w:val="center"/>
           </w:tcPr>
           <w:p>
             <w:pPr>
-              <w:spacing w:before="0" w:after="0" w:line="252" w:lineRule="auto"/>
-              <w:jc w:val="left"/>
+              <w:spacing w:before="0" w:after="0" w:line="259" w:lineRule="auto"/>
+              <w:jc w:val="center"/>
             </w:pPr>
             <w:r>
               <w:rPr>
@@ -4010,16 +4005,16 @@
             <w:tcMar>
               <w:top w:w="40" w:type="dxa"/>
               <w:bottom w:w="40" w:type="dxa"/>
-              <w:left w:w="80" w:type="dxa"/>
-              <w:right w:w="80" w:type="dxa"/>
+              <w:left w:w="70" w:type="dxa"/>
+              <w:right w:w="70" w:type="dxa"/>
             </w:tcMar>
             <w:shd w:fill="FFFFFF"/>
             <w:vAlign w:val="center"/>
           </w:tcPr>
           <w:p>
             <w:pPr>
-              <w:spacing w:before="0" w:after="0" w:line="252" w:lineRule="auto"/>
-              <w:jc w:val="left"/>
+              <w:spacing w:before="0" w:after="0" w:line="259" w:lineRule="auto"/>
+              <w:jc w:val="center"/>
             </w:pPr>
             <w:r>
               <w:rPr>
@@ -4039,15 +4034,15 @@
             <w:tcMar>
               <w:top w:w="40" w:type="dxa"/>
               <w:bottom w:w="40" w:type="dxa"/>
-              <w:left w:w="80" w:type="dxa"/>
-              <w:right w:w="80" w:type="dxa"/>
+              <w:left w:w="70" w:type="dxa"/>
+              <w:right w:w="70" w:type="dxa"/>
             </w:tcMar>
             <w:shd w:fill="FFFFFF"/>
             <w:vAlign w:val="center"/>
           </w:tcPr>
           <w:p>
             <w:pPr>
-              <w:spacing w:before="0" w:after="0" w:line="252" w:lineRule="auto"/>
+              <w:spacing w:before="0" w:after="0" w:line="259" w:lineRule="auto"/>
               <w:jc w:val="left"/>
             </w:pPr>
             <w:r>
@@ -4068,15 +4063,15 @@
             <w:tcMar>
               <w:top w:w="40" w:type="dxa"/>
               <w:bottom w:w="40" w:type="dxa"/>
-              <w:left w:w="80" w:type="dxa"/>
-              <w:right w:w="80" w:type="dxa"/>
+              <w:left w:w="70" w:type="dxa"/>
+              <w:right w:w="70" w:type="dxa"/>
             </w:tcMar>
             <w:shd w:fill="FFFFFF"/>
             <w:vAlign w:val="center"/>
           </w:tcPr>
           <w:p>
             <w:pPr>
-              <w:spacing w:before="0" w:after="0" w:line="252" w:lineRule="auto"/>
+              <w:spacing w:before="0" w:after="0" w:line="259" w:lineRule="auto"/>
               <w:jc w:val="left"/>
             </w:pPr>
             <w:r>
@@ -4093,19 +4088,19 @@
         </w:tc>
         <w:tc>
           <w:tcPr>
-            <w:tcW w:type="dxa" w:w="1728"/>
+            <w:tcW w:type="dxa" w:w="1786"/>
             <w:tcMar>
               <w:top w:w="40" w:type="dxa"/>
               <w:bottom w:w="40" w:type="dxa"/>
-              <w:left w:w="80" w:type="dxa"/>
-              <w:right w:w="80" w:type="dxa"/>
+              <w:left w:w="70" w:type="dxa"/>
+              <w:right w:w="70" w:type="dxa"/>
             </w:tcMar>
             <w:shd w:fill="FFFFFF"/>
             <w:vAlign w:val="center"/>
           </w:tcPr>
           <w:p>
             <w:pPr>
-              <w:spacing w:before="0" w:after="0" w:line="252" w:lineRule="auto"/>
+              <w:spacing w:before="0" w:after="0" w:line="259" w:lineRule="auto"/>
               <w:jc w:val="left"/>
             </w:pPr>
             <w:r>
@@ -4126,16 +4121,16 @@
             <w:tcMar>
               <w:top w:w="40" w:type="dxa"/>
               <w:bottom w:w="40" w:type="dxa"/>
-              <w:left w:w="80" w:type="dxa"/>
-              <w:right w:w="80" w:type="dxa"/>
+              <w:left w:w="70" w:type="dxa"/>
+              <w:right w:w="70" w:type="dxa"/>
             </w:tcMar>
             <w:shd w:fill="FFFFFF"/>
             <w:vAlign w:val="center"/>
           </w:tcPr>
           <w:p>
             <w:pPr>
-              <w:spacing w:before="0" w:after="0" w:line="252" w:lineRule="auto"/>
-              <w:jc w:val="left"/>
+              <w:spacing w:before="0" w:after="0" w:line="259" w:lineRule="auto"/>
+              <w:jc w:val="center"/>
             </w:pPr>
             <w:r>
               <w:rPr>
@@ -4159,16 +4154,16 @@
             <w:tcMar>
               <w:top w:w="40" w:type="dxa"/>
               <w:bottom w:w="40" w:type="dxa"/>
-              <w:left w:w="80" w:type="dxa"/>
-              <w:right w:w="80" w:type="dxa"/>
+              <w:left w:w="70" w:type="dxa"/>
+              <w:right w:w="70" w:type="dxa"/>
             </w:tcMar>
             <w:shd w:fill="F8FAFC"/>
             <w:vAlign w:val="center"/>
           </w:tcPr>
           <w:p>
             <w:pPr>
-              <w:spacing w:before="0" w:after="0" w:line="252" w:lineRule="auto"/>
-              <w:jc w:val="left"/>
+              <w:spacing w:before="0" w:after="0" w:line="259" w:lineRule="auto"/>
+              <w:jc w:val="center"/>
             </w:pPr>
             <w:r>
               <w:rPr>
@@ -4188,16 +4183,16 @@
             <w:tcMar>
               <w:top w:w="40" w:type="dxa"/>
               <w:bottom w:w="40" w:type="dxa"/>
-              <w:left w:w="80" w:type="dxa"/>
-              <w:right w:w="80" w:type="dxa"/>
+              <w:left w:w="70" w:type="dxa"/>
+              <w:right w:w="70" w:type="dxa"/>
             </w:tcMar>
             <w:shd w:fill="F8FAFC"/>
             <w:vAlign w:val="center"/>
           </w:tcPr>
           <w:p>
             <w:pPr>
-              <w:spacing w:before="0" w:after="0" w:line="252" w:lineRule="auto"/>
-              <w:jc w:val="left"/>
+              <w:spacing w:before="0" w:after="0" w:line="259" w:lineRule="auto"/>
+              <w:jc w:val="center"/>
             </w:pPr>
             <w:r>
               <w:rPr>
@@ -4217,15 +4212,15 @@
             <w:tcMar>
               <w:top w:w="40" w:type="dxa"/>
               <w:bottom w:w="40" w:type="dxa"/>
-              <w:left w:w="80" w:type="dxa"/>
-              <w:right w:w="80" w:type="dxa"/>
+              <w:left w:w="70" w:type="dxa"/>
+              <w:right w:w="70" w:type="dxa"/>
             </w:tcMar>
             <w:shd w:fill="F8FAFC"/>
             <w:vAlign w:val="center"/>
           </w:tcPr>
           <w:p>
             <w:pPr>
-              <w:spacing w:before="0" w:after="0" w:line="252" w:lineRule="auto"/>
+              <w:spacing w:before="0" w:after="0" w:line="259" w:lineRule="auto"/>
               <w:jc w:val="left"/>
             </w:pPr>
             <w:r>
@@ -4246,15 +4241,15 @@
             <w:tcMar>
               <w:top w:w="40" w:type="dxa"/>
               <w:bottom w:w="40" w:type="dxa"/>
-              <w:left w:w="80" w:type="dxa"/>
-              <w:right w:w="80" w:type="dxa"/>
+              <w:left w:w="70" w:type="dxa"/>
+              <w:right w:w="70" w:type="dxa"/>
             </w:tcMar>
             <w:shd w:fill="F8FAFC"/>
             <w:vAlign w:val="center"/>
           </w:tcPr>
           <w:p>
             <w:pPr>
-              <w:spacing w:before="0" w:after="0" w:line="252" w:lineRule="auto"/>
+              <w:spacing w:before="0" w:after="0" w:line="259" w:lineRule="auto"/>
               <w:jc w:val="left"/>
             </w:pPr>
             <w:r>
@@ -4271,19 +4266,19 @@
         </w:tc>
         <w:tc>
           <w:tcPr>
-            <w:tcW w:type="dxa" w:w="1728"/>
+            <w:tcW w:type="dxa" w:w="1786"/>
             <w:tcMar>
               <w:top w:w="40" w:type="dxa"/>
               <w:bottom w:w="40" w:type="dxa"/>
-              <w:left w:w="80" w:type="dxa"/>
-              <w:right w:w="80" w:type="dxa"/>
+              <w:left w:w="70" w:type="dxa"/>
+              <w:right w:w="70" w:type="dxa"/>
             </w:tcMar>
             <w:shd w:fill="F8FAFC"/>
             <w:vAlign w:val="center"/>
           </w:tcPr>
           <w:p>
             <w:pPr>
-              <w:spacing w:before="0" w:after="0" w:line="252" w:lineRule="auto"/>
+              <w:spacing w:before="0" w:after="0" w:line="259" w:lineRule="auto"/>
               <w:jc w:val="left"/>
             </w:pPr>
             <w:r>
@@ -4304,16 +4299,16 @@
             <w:tcMar>
               <w:top w:w="40" w:type="dxa"/>
               <w:bottom w:w="40" w:type="dxa"/>
-              <w:left w:w="80" w:type="dxa"/>
-              <w:right w:w="80" w:type="dxa"/>
+              <w:left w:w="70" w:type="dxa"/>
+              <w:right w:w="70" w:type="dxa"/>
             </w:tcMar>
             <w:shd w:fill="F8FAFC"/>
             <w:vAlign w:val="center"/>
           </w:tcPr>
           <w:p>
             <w:pPr>
-              <w:spacing w:before="0" w:after="0" w:line="252" w:lineRule="auto"/>
-              <w:jc w:val="left"/>
+              <w:spacing w:before="0" w:after="0" w:line="259" w:lineRule="auto"/>
+              <w:jc w:val="center"/>
             </w:pPr>
             <w:r>
               <w:rPr>
@@ -4337,16 +4332,16 @@
             <w:tcMar>
               <w:top w:w="40" w:type="dxa"/>
               <w:bottom w:w="40" w:type="dxa"/>
-              <w:left w:w="80" w:type="dxa"/>
-              <w:right w:w="80" w:type="dxa"/>
+              <w:left w:w="70" w:type="dxa"/>
+              <w:right w:w="70" w:type="dxa"/>
             </w:tcMar>
             <w:shd w:fill="FFFFFF"/>
             <w:vAlign w:val="center"/>
           </w:tcPr>
           <w:p>
             <w:pPr>
-              <w:spacing w:before="0" w:after="0" w:line="252" w:lineRule="auto"/>
-              <w:jc w:val="left"/>
+              <w:spacing w:before="0" w:after="0" w:line="259" w:lineRule="auto"/>
+              <w:jc w:val="center"/>
             </w:pPr>
             <w:r>
               <w:rPr>
@@ -4366,16 +4361,16 @@
             <w:tcMar>
               <w:top w:w="40" w:type="dxa"/>
               <w:bottom w:w="40" w:type="dxa"/>
-              <w:left w:w="80" w:type="dxa"/>
-              <w:right w:w="80" w:type="dxa"/>
+              <w:left w:w="70" w:type="dxa"/>
+              <w:right w:w="70" w:type="dxa"/>
             </w:tcMar>
             <w:shd w:fill="FFFFFF"/>
             <w:vAlign w:val="center"/>
           </w:tcPr>
           <w:p>
             <w:pPr>
-              <w:spacing w:before="0" w:after="0" w:line="252" w:lineRule="auto"/>
-              <w:jc w:val="left"/>
+              <w:spacing w:before="0" w:after="0" w:line="259" w:lineRule="auto"/>
+              <w:jc w:val="center"/>
             </w:pPr>
             <w:r>
               <w:rPr>
@@ -4395,15 +4390,15 @@
             <w:tcMar>
               <w:top w:w="40" w:type="dxa"/>
               <w:bottom w:w="40" w:type="dxa"/>
-              <w:left w:w="80" w:type="dxa"/>
-              <w:right w:w="80" w:type="dxa"/>
+              <w:left w:w="70" w:type="dxa"/>
+              <w:right w:w="70" w:type="dxa"/>
             </w:tcMar>
             <w:shd w:fill="FFFFFF"/>
             <w:vAlign w:val="center"/>
           </w:tcPr>
           <w:p>
             <w:pPr>
-              <w:spacing w:before="0" w:after="0" w:line="252" w:lineRule="auto"/>
+              <w:spacing w:before="0" w:after="0" w:line="259" w:lineRule="auto"/>
               <w:jc w:val="left"/>
             </w:pPr>
             <w:r>
@@ -4424,15 +4419,15 @@
             <w:tcMar>
               <w:top w:w="40" w:type="dxa"/>
               <w:bottom w:w="40" w:type="dxa"/>
-              <w:left w:w="80" w:type="dxa"/>
-              <w:right w:w="80" w:type="dxa"/>
+              <w:left w:w="70" w:type="dxa"/>
+              <w:right w:w="70" w:type="dxa"/>
             </w:tcMar>
             <w:shd w:fill="FFFFFF"/>
             <w:vAlign w:val="center"/>
           </w:tcPr>
           <w:p>
             <w:pPr>
-              <w:spacing w:before="0" w:after="0" w:line="252" w:lineRule="auto"/>
+              <w:spacing w:before="0" w:after="0" w:line="259" w:lineRule="auto"/>
               <w:jc w:val="left"/>
             </w:pPr>
             <w:r>
@@ -4449,19 +4444,19 @@
         </w:tc>
         <w:tc>
           <w:tcPr>
-            <w:tcW w:type="dxa" w:w="1728"/>
+            <w:tcW w:type="dxa" w:w="1786"/>
             <w:tcMar>
               <w:top w:w="40" w:type="dxa"/>
               <w:bottom w:w="40" w:type="dxa"/>
-              <w:left w:w="80" w:type="dxa"/>
-              <w:right w:w="80" w:type="dxa"/>
+              <w:left w:w="70" w:type="dxa"/>
+              <w:right w:w="70" w:type="dxa"/>
             </w:tcMar>
             <w:shd w:fill="FFFFFF"/>
             <w:vAlign w:val="center"/>
           </w:tcPr>
           <w:p>
             <w:pPr>
-              <w:spacing w:before="0" w:after="0" w:line="252" w:lineRule="auto"/>
+              <w:spacing w:before="0" w:after="0" w:line="259" w:lineRule="auto"/>
               <w:jc w:val="left"/>
             </w:pPr>
             <w:r>
@@ -4482,16 +4477,16 @@
             <w:tcMar>
               <w:top w:w="40" w:type="dxa"/>
               <w:bottom w:w="40" w:type="dxa"/>
-              <w:left w:w="80" w:type="dxa"/>
-              <w:right w:w="80" w:type="dxa"/>
+              <w:left w:w="70" w:type="dxa"/>
+              <w:right w:w="70" w:type="dxa"/>
             </w:tcMar>
             <w:shd w:fill="FFFFFF"/>
             <w:vAlign w:val="center"/>
           </w:tcPr>
           <w:p>
             <w:pPr>
-              <w:spacing w:before="0" w:after="0" w:line="252" w:lineRule="auto"/>
-              <w:jc w:val="left"/>
+              <w:spacing w:before="0" w:after="0" w:line="259" w:lineRule="auto"/>
+              <w:jc w:val="center"/>
             </w:pPr>
             <w:r>
               <w:rPr>
@@ -4618,11 +4613,11 @@
         </w:tblBorders>
       </w:tblPr>
       <w:tblGrid>
-        <w:gridCol w:w="2151"/>
-        <w:gridCol w:w="2151"/>
-        <w:gridCol w:w="2151"/>
-        <w:gridCol w:w="2151"/>
-        <w:gridCol w:w="2151"/>
+        <w:gridCol w:w="2163"/>
+        <w:gridCol w:w="2163"/>
+        <w:gridCol w:w="2163"/>
+        <w:gridCol w:w="2163"/>
+        <w:gridCol w:w="2163"/>
       </w:tblGrid>
       <w:tr>
         <w:tc>
@@ -4631,16 +4626,16 @@
             <w:tcMar>
               <w:top w:w="40" w:type="dxa"/>
               <w:bottom w:w="40" w:type="dxa"/>
-              <w:left w:w="80" w:type="dxa"/>
-              <w:right w:w="80" w:type="dxa"/>
+              <w:left w:w="70" w:type="dxa"/>
+              <w:right w:w="70" w:type="dxa"/>
             </w:tcMar>
             <w:shd w:fill="0F294A"/>
             <w:vAlign w:val="center"/>
           </w:tcPr>
           <w:p>
             <w:pPr>
-              <w:spacing w:before="0" w:after="0" w:line="252" w:lineRule="auto"/>
-              <w:jc w:val="left"/>
+              <w:spacing w:before="0" w:after="0" w:line="259" w:lineRule="auto"/>
+              <w:jc w:val="center"/>
             </w:pPr>
             <w:r>
               <w:rPr>
@@ -4660,15 +4655,15 @@
             <w:tcMar>
               <w:top w:w="40" w:type="dxa"/>
               <w:bottom w:w="40" w:type="dxa"/>
-              <w:left w:w="80" w:type="dxa"/>
-              <w:right w:w="80" w:type="dxa"/>
+              <w:left w:w="70" w:type="dxa"/>
+              <w:right w:w="70" w:type="dxa"/>
             </w:tcMar>
             <w:shd w:fill="0F294A"/>
             <w:vAlign w:val="center"/>
           </w:tcPr>
           <w:p>
             <w:pPr>
-              <w:spacing w:before="0" w:after="0" w:line="252" w:lineRule="auto"/>
+              <w:spacing w:before="0" w:after="0" w:line="259" w:lineRule="auto"/>
               <w:jc w:val="left"/>
             </w:pPr>
             <w:r>
@@ -4689,15 +4684,15 @@
             <w:tcMar>
               <w:top w:w="40" w:type="dxa"/>
               <w:bottom w:w="40" w:type="dxa"/>
-              <w:left w:w="80" w:type="dxa"/>
-              <w:right w:w="80" w:type="dxa"/>
+              <w:left w:w="70" w:type="dxa"/>
+              <w:right w:w="70" w:type="dxa"/>
             </w:tcMar>
             <w:shd w:fill="0F294A"/>
             <w:vAlign w:val="center"/>
           </w:tcPr>
           <w:p>
             <w:pPr>
-              <w:spacing w:before="0" w:after="0" w:line="252" w:lineRule="auto"/>
+              <w:spacing w:before="0" w:after="0" w:line="259" w:lineRule="auto"/>
               <w:jc w:val="left"/>
             </w:pPr>
             <w:r>
@@ -4718,15 +4713,15 @@
             <w:tcMar>
               <w:top w:w="40" w:type="dxa"/>
               <w:bottom w:w="40" w:type="dxa"/>
-              <w:left w:w="80" w:type="dxa"/>
-              <w:right w:w="80" w:type="dxa"/>
+              <w:left w:w="70" w:type="dxa"/>
+              <w:right w:w="70" w:type="dxa"/>
             </w:tcMar>
             <w:shd w:fill="0F294A"/>
             <w:vAlign w:val="center"/>
           </w:tcPr>
           <w:p>
             <w:pPr>
-              <w:spacing w:before="0" w:after="0" w:line="252" w:lineRule="auto"/>
+              <w:spacing w:before="0" w:after="0" w:line="259" w:lineRule="auto"/>
               <w:jc w:val="left"/>
             </w:pPr>
             <w:r>
@@ -4743,19 +4738,19 @@
         </w:tc>
         <w:tc>
           <w:tcPr>
-            <w:tcW w:type="dxa" w:w="2549"/>
+            <w:tcW w:type="dxa" w:w="2606"/>
             <w:tcMar>
               <w:top w:w="40" w:type="dxa"/>
               <w:bottom w:w="40" w:type="dxa"/>
-              <w:left w:w="80" w:type="dxa"/>
-              <w:right w:w="80" w:type="dxa"/>
+              <w:left w:w="70" w:type="dxa"/>
+              <w:right w:w="70" w:type="dxa"/>
             </w:tcMar>
             <w:shd w:fill="0F294A"/>
             <w:vAlign w:val="center"/>
           </w:tcPr>
           <w:p>
             <w:pPr>
-              <w:spacing w:before="0" w:after="0" w:line="252" w:lineRule="auto"/>
+              <w:spacing w:before="0" w:after="0" w:line="259" w:lineRule="auto"/>
               <w:jc w:val="left"/>
             </w:pPr>
             <w:r>
@@ -4778,16 +4773,16 @@
             <w:tcMar>
               <w:top w:w="40" w:type="dxa"/>
               <w:bottom w:w="40" w:type="dxa"/>
-              <w:left w:w="80" w:type="dxa"/>
-              <w:right w:w="80" w:type="dxa"/>
+              <w:left w:w="70" w:type="dxa"/>
+              <w:right w:w="70" w:type="dxa"/>
             </w:tcMar>
             <w:shd w:fill="FFFFFF"/>
             <w:vAlign w:val="center"/>
           </w:tcPr>
           <w:p>
             <w:pPr>
-              <w:spacing w:before="0" w:after="0" w:line="252" w:lineRule="auto"/>
-              <w:jc w:val="left"/>
+              <w:spacing w:before="0" w:after="0" w:line="259" w:lineRule="auto"/>
+              <w:jc w:val="center"/>
             </w:pPr>
             <w:r>
               <w:rPr>
@@ -4807,15 +4802,15 @@
             <w:tcMar>
               <w:top w:w="40" w:type="dxa"/>
               <w:bottom w:w="40" w:type="dxa"/>
-              <w:left w:w="80" w:type="dxa"/>
-              <w:right w:w="80" w:type="dxa"/>
+              <w:left w:w="70" w:type="dxa"/>
+              <w:right w:w="70" w:type="dxa"/>
             </w:tcMar>
             <w:shd w:fill="FFFFFF"/>
             <w:vAlign w:val="center"/>
           </w:tcPr>
           <w:p>
             <w:pPr>
-              <w:spacing w:before="0" w:after="0" w:line="252" w:lineRule="auto"/>
+              <w:spacing w:before="0" w:after="0" w:line="259" w:lineRule="auto"/>
               <w:jc w:val="left"/>
             </w:pPr>
             <w:r>
@@ -4838,15 +4833,15 @@
             <w:tcMar>
               <w:top w:w="40" w:type="dxa"/>
               <w:bottom w:w="40" w:type="dxa"/>
-              <w:left w:w="80" w:type="dxa"/>
-              <w:right w:w="80" w:type="dxa"/>
+              <w:left w:w="70" w:type="dxa"/>
+              <w:right w:w="70" w:type="dxa"/>
             </w:tcMar>
             <w:shd w:fill="FFFFFF"/>
             <w:vAlign w:val="center"/>
           </w:tcPr>
           <w:p>
             <w:pPr>
-              <w:spacing w:before="0" w:after="0" w:line="252" w:lineRule="auto"/>
+              <w:spacing w:before="0" w:after="0" w:line="259" w:lineRule="auto"/>
               <w:jc w:val="left"/>
             </w:pPr>
             <w:r>
@@ -4871,15 +4866,15 @@
             <w:tcMar>
               <w:top w:w="40" w:type="dxa"/>
               <w:bottom w:w="40" w:type="dxa"/>
-              <w:left w:w="80" w:type="dxa"/>
-              <w:right w:w="80" w:type="dxa"/>
+              <w:left w:w="70" w:type="dxa"/>
+              <w:right w:w="70" w:type="dxa"/>
             </w:tcMar>
             <w:shd w:fill="FFFFFF"/>
             <w:vAlign w:val="center"/>
           </w:tcPr>
           <w:p>
             <w:pPr>
-              <w:spacing w:before="0" w:after="0" w:line="252" w:lineRule="auto"/>
+              <w:spacing w:before="0" w:after="0" w:line="259" w:lineRule="auto"/>
               <w:jc w:val="left"/>
             </w:pPr>
             <w:r>
@@ -4898,19 +4893,19 @@
         </w:tc>
         <w:tc>
           <w:tcPr>
-            <w:tcW w:type="dxa" w:w="2549"/>
+            <w:tcW w:type="dxa" w:w="2606"/>
             <w:tcMar>
               <w:top w:w="40" w:type="dxa"/>
               <w:bottom w:w="40" w:type="dxa"/>
-              <w:left w:w="80" w:type="dxa"/>
-              <w:right w:w="80" w:type="dxa"/>
+              <w:left w:w="70" w:type="dxa"/>
+              <w:right w:w="70" w:type="dxa"/>
             </w:tcMar>
             <w:shd w:fill="FFFFFF"/>
             <w:vAlign w:val="center"/>
           </w:tcPr>
           <w:p>
             <w:pPr>
-              <w:spacing w:before="0" w:after="0" w:line="252" w:lineRule="auto"/>
+              <w:spacing w:before="0" w:after="0" w:line="259" w:lineRule="auto"/>
               <w:jc w:val="left"/>
             </w:pPr>
             <w:r>
@@ -4937,16 +4932,16 @@
             <w:tcMar>
               <w:top w:w="40" w:type="dxa"/>
               <w:bottom w:w="40" w:type="dxa"/>
-              <w:left w:w="80" w:type="dxa"/>
-              <w:right w:w="80" w:type="dxa"/>
+              <w:left w:w="70" w:type="dxa"/>
+              <w:right w:w="70" w:type="dxa"/>
             </w:tcMar>
             <w:shd w:fill="F8FAFC"/>
             <w:vAlign w:val="center"/>
           </w:tcPr>
           <w:p>
             <w:pPr>
-              <w:spacing w:before="0" w:after="0" w:line="252" w:lineRule="auto"/>
-              <w:jc w:val="left"/>
+              <w:spacing w:before="0" w:after="0" w:line="259" w:lineRule="auto"/>
+              <w:jc w:val="center"/>
             </w:pPr>
             <w:r>
               <w:rPr>
@@ -4966,15 +4961,15 @@
             <w:tcMar>
               <w:top w:w="40" w:type="dxa"/>
               <w:bottom w:w="40" w:type="dxa"/>
-              <w:left w:w="80" w:type="dxa"/>
-              <w:right w:w="80" w:type="dxa"/>
+              <w:left w:w="70" w:type="dxa"/>
+              <w:right w:w="70" w:type="dxa"/>
             </w:tcMar>
             <w:shd w:fill="F8FAFC"/>
             <w:vAlign w:val="center"/>
           </w:tcPr>
           <w:p>
             <w:pPr>
-              <w:spacing w:before="0" w:after="0" w:line="252" w:lineRule="auto"/>
+              <w:spacing w:before="0" w:after="0" w:line="259" w:lineRule="auto"/>
               <w:jc w:val="left"/>
             </w:pPr>
             <w:r>
@@ -4997,15 +4992,15 @@
             <w:tcMar>
               <w:top w:w="40" w:type="dxa"/>
               <w:bottom w:w="40" w:type="dxa"/>
-              <w:left w:w="80" w:type="dxa"/>
-              <w:right w:w="80" w:type="dxa"/>
+              <w:left w:w="70" w:type="dxa"/>
+              <w:right w:w="70" w:type="dxa"/>
             </w:tcMar>
             <w:shd w:fill="F8FAFC"/>
             <w:vAlign w:val="center"/>
           </w:tcPr>
           <w:p>
             <w:pPr>
-              <w:spacing w:before="0" w:after="0" w:line="252" w:lineRule="auto"/>
+              <w:spacing w:before="0" w:after="0" w:line="259" w:lineRule="auto"/>
               <w:jc w:val="left"/>
             </w:pPr>
             <w:r>
@@ -5026,15 +5021,15 @@
             <w:tcMar>
               <w:top w:w="40" w:type="dxa"/>
               <w:bottom w:w="40" w:type="dxa"/>
-              <w:left w:w="80" w:type="dxa"/>
-              <w:right w:w="80" w:type="dxa"/>
+              <w:left w:w="70" w:type="dxa"/>
+              <w:right w:w="70" w:type="dxa"/>
             </w:tcMar>
             <w:shd w:fill="F8FAFC"/>
             <w:vAlign w:val="center"/>
           </w:tcPr>
           <w:p>
             <w:pPr>
-              <w:spacing w:before="0" w:after="0" w:line="252" w:lineRule="auto"/>
+              <w:spacing w:before="0" w:after="0" w:line="259" w:lineRule="auto"/>
               <w:jc w:val="left"/>
             </w:pPr>
             <w:r>
@@ -5053,19 +5048,19 @@
         </w:tc>
         <w:tc>
           <w:tcPr>
-            <w:tcW w:type="dxa" w:w="2549"/>
+            <w:tcW w:type="dxa" w:w="2606"/>
             <w:tcMar>
               <w:top w:w="40" w:type="dxa"/>
               <w:bottom w:w="40" w:type="dxa"/>
-              <w:left w:w="80" w:type="dxa"/>
-              <w:right w:w="80" w:type="dxa"/>
+              <w:left w:w="70" w:type="dxa"/>
+              <w:right w:w="70" w:type="dxa"/>
             </w:tcMar>
             <w:shd w:fill="F8FAFC"/>
             <w:vAlign w:val="center"/>
           </w:tcPr>
           <w:p>
             <w:pPr>
-              <w:spacing w:before="0" w:after="0" w:line="252" w:lineRule="auto"/>
+              <w:spacing w:before="0" w:after="0" w:line="259" w:lineRule="auto"/>
               <w:jc w:val="left"/>
             </w:pPr>
             <w:r>
@@ -5116,10 +5111,10 @@
         </w:tblBorders>
       </w:tblPr>
       <w:tblGrid>
-        <w:gridCol w:w="2689"/>
-        <w:gridCol w:w="2689"/>
-        <w:gridCol w:w="2689"/>
-        <w:gridCol w:w="2689"/>
+        <w:gridCol w:w="2704"/>
+        <w:gridCol w:w="2704"/>
+        <w:gridCol w:w="2704"/>
+        <w:gridCol w:w="2704"/>
       </w:tblGrid>
       <w:tr>
         <w:tc>
@@ -5128,15 +5123,15 @@
             <w:tcMar>
               <w:top w:w="35" w:type="dxa"/>
               <w:bottom w:w="35" w:type="dxa"/>
-              <w:left w:w="80" w:type="dxa"/>
-              <w:right w:w="80" w:type="dxa"/>
+              <w:left w:w="70" w:type="dxa"/>
+              <w:right w:w="70" w:type="dxa"/>
             </w:tcMar>
             <w:shd w:fill="0F294A"/>
             <w:vAlign w:val="center"/>
           </w:tcPr>
           <w:p>
             <w:pPr>
-              <w:spacing w:before="0" w:after="0" w:line="252" w:lineRule="auto"/>
+              <w:spacing w:before="0" w:after="0" w:line="259" w:lineRule="auto"/>
               <w:jc w:val="left"/>
             </w:pPr>
             <w:r>
@@ -5157,16 +5152,16 @@
             <w:tcMar>
               <w:top w:w="35" w:type="dxa"/>
               <w:bottom w:w="35" w:type="dxa"/>
-              <w:left w:w="80" w:type="dxa"/>
-              <w:right w:w="80" w:type="dxa"/>
+              <w:left w:w="70" w:type="dxa"/>
+              <w:right w:w="70" w:type="dxa"/>
             </w:tcMar>
             <w:shd w:fill="0F294A"/>
             <w:vAlign w:val="center"/>
           </w:tcPr>
           <w:p>
             <w:pPr>
-              <w:spacing w:before="0" w:after="0" w:line="252" w:lineRule="auto"/>
-              <w:jc w:val="left"/>
+              <w:spacing w:before="0" w:after="0" w:line="259" w:lineRule="auto"/>
+              <w:jc w:val="center"/>
             </w:pPr>
             <w:r>
               <w:rPr>
@@ -5186,16 +5181,16 @@
             <w:tcMar>
               <w:top w:w="35" w:type="dxa"/>
               <w:bottom w:w="35" w:type="dxa"/>
-              <w:left w:w="80" w:type="dxa"/>
-              <w:right w:w="80" w:type="dxa"/>
+              <w:left w:w="70" w:type="dxa"/>
+              <w:right w:w="70" w:type="dxa"/>
             </w:tcMar>
             <w:shd w:fill="0F294A"/>
             <w:vAlign w:val="center"/>
           </w:tcPr>
           <w:p>
             <w:pPr>
-              <w:spacing w:before="0" w:after="0" w:line="252" w:lineRule="auto"/>
-              <w:jc w:val="left"/>
+              <w:spacing w:before="0" w:after="0" w:line="259" w:lineRule="auto"/>
+              <w:jc w:val="center"/>
             </w:pPr>
             <w:r>
               <w:rPr>
@@ -5211,19 +5206,19 @@
         </w:tc>
         <w:tc>
           <w:tcPr>
-            <w:tcW w:type="dxa" w:w="6581"/>
+            <w:tcW w:type="dxa" w:w="6638"/>
             <w:tcMar>
               <w:top w:w="35" w:type="dxa"/>
               <w:bottom w:w="35" w:type="dxa"/>
-              <w:left w:w="80" w:type="dxa"/>
-              <w:right w:w="80" w:type="dxa"/>
+              <w:left w:w="70" w:type="dxa"/>
+              <w:right w:w="70" w:type="dxa"/>
             </w:tcMar>
             <w:shd w:fill="0F294A"/>
             <w:vAlign w:val="center"/>
           </w:tcPr>
           <w:p>
             <w:pPr>
-              <w:spacing w:before="0" w:after="0" w:line="252" w:lineRule="auto"/>
+              <w:spacing w:before="0" w:after="0" w:line="259" w:lineRule="auto"/>
               <w:jc w:val="left"/>
             </w:pPr>
             <w:r>
@@ -5246,15 +5241,15 @@
             <w:tcMar>
               <w:top w:w="40" w:type="dxa"/>
               <w:bottom w:w="40" w:type="dxa"/>
-              <w:left w:w="80" w:type="dxa"/>
-              <w:right w:w="80" w:type="dxa"/>
+              <w:left w:w="70" w:type="dxa"/>
+              <w:right w:w="70" w:type="dxa"/>
             </w:tcMar>
             <w:shd w:fill="FFFFFF"/>
             <w:vAlign w:val="center"/>
           </w:tcPr>
           <w:p>
             <w:pPr>
-              <w:spacing w:before="0" w:after="0" w:line="252" w:lineRule="auto"/>
+              <w:spacing w:before="0" w:after="0" w:line="259" w:lineRule="auto"/>
               <w:jc w:val="left"/>
             </w:pPr>
             <w:r>
@@ -5275,16 +5270,16 @@
             <w:tcMar>
               <w:top w:w="40" w:type="dxa"/>
               <w:bottom w:w="40" w:type="dxa"/>
-              <w:left w:w="80" w:type="dxa"/>
-              <w:right w:w="80" w:type="dxa"/>
+              <w:left w:w="70" w:type="dxa"/>
+              <w:right w:w="70" w:type="dxa"/>
             </w:tcMar>
             <w:shd w:fill="FFFFFF"/>
             <w:vAlign w:val="center"/>
           </w:tcPr>
           <w:p>
             <w:pPr>
-              <w:spacing w:before="0" w:after="0" w:line="252" w:lineRule="auto"/>
-              <w:jc w:val="left"/>
+              <w:spacing w:before="0" w:after="0" w:line="259" w:lineRule="auto"/>
+              <w:jc w:val="center"/>
             </w:pPr>
             <w:r>
               <w:rPr>
@@ -5304,16 +5299,16 @@
             <w:tcMar>
               <w:top w:w="40" w:type="dxa"/>
               <w:bottom w:w="40" w:type="dxa"/>
-              <w:left w:w="80" w:type="dxa"/>
-              <w:right w:w="80" w:type="dxa"/>
+              <w:left w:w="70" w:type="dxa"/>
+              <w:right w:w="70" w:type="dxa"/>
             </w:tcMar>
             <w:shd w:fill="FFFFFF"/>
             <w:vAlign w:val="center"/>
           </w:tcPr>
           <w:p>
             <w:pPr>
-              <w:spacing w:before="0" w:after="0" w:line="252" w:lineRule="auto"/>
-              <w:jc w:val="left"/>
+              <w:spacing w:before="0" w:after="0" w:line="259" w:lineRule="auto"/>
+              <w:jc w:val="center"/>
             </w:pPr>
             <w:r>
               <w:rPr>
@@ -5329,19 +5324,19 @@
         </w:tc>
         <w:tc>
           <w:tcPr>
-            <w:tcW w:type="dxa" w:w="6581"/>
+            <w:tcW w:type="dxa" w:w="6638"/>
             <w:tcMar>
               <w:top w:w="40" w:type="dxa"/>
               <w:bottom w:w="40" w:type="dxa"/>
-              <w:left w:w="80" w:type="dxa"/>
-              <w:right w:w="80" w:type="dxa"/>
+              <w:left w:w="70" w:type="dxa"/>
+              <w:right w:w="70" w:type="dxa"/>
             </w:tcMar>
             <w:shd w:fill="FFFFFF"/>
             <w:vAlign w:val="center"/>
           </w:tcPr>
           <w:p>
             <w:pPr>
-              <w:spacing w:before="0" w:after="0" w:line="252" w:lineRule="auto"/>
+              <w:spacing w:before="0" w:after="0" w:line="259" w:lineRule="auto"/>
               <w:jc w:val="left"/>
             </w:pPr>
             <w:r>
@@ -5364,15 +5359,15 @@
             <w:tcMar>
               <w:top w:w="40" w:type="dxa"/>
               <w:bottom w:w="40" w:type="dxa"/>
-              <w:left w:w="80" w:type="dxa"/>
-              <w:right w:w="80" w:type="dxa"/>
+              <w:left w:w="70" w:type="dxa"/>
+              <w:right w:w="70" w:type="dxa"/>
             </w:tcMar>
             <w:shd w:fill="F8FAFC"/>
             <w:vAlign w:val="center"/>
           </w:tcPr>
           <w:p>
             <w:pPr>
-              <w:spacing w:before="0" w:after="0" w:line="252" w:lineRule="auto"/>
+              <w:spacing w:before="0" w:after="0" w:line="259" w:lineRule="auto"/>
               <w:jc w:val="left"/>
             </w:pPr>
             <w:r>
@@ -5393,16 +5388,16 @@
             <w:tcMar>
               <w:top w:w="40" w:type="dxa"/>
               <w:bottom w:w="40" w:type="dxa"/>
-              <w:left w:w="80" w:type="dxa"/>
-              <w:right w:w="80" w:type="dxa"/>
+              <w:left w:w="70" w:type="dxa"/>
+              <w:right w:w="70" w:type="dxa"/>
             </w:tcMar>
             <w:shd w:fill="F8FAFC"/>
             <w:vAlign w:val="center"/>
           </w:tcPr>
           <w:p>
             <w:pPr>
-              <w:spacing w:before="0" w:after="0" w:line="252" w:lineRule="auto"/>
-              <w:jc w:val="left"/>
+              <w:spacing w:before="0" w:after="0" w:line="259" w:lineRule="auto"/>
+              <w:jc w:val="center"/>
             </w:pPr>
             <w:r>
               <w:rPr>
@@ -5422,16 +5417,16 @@
             <w:tcMar>
               <w:top w:w="40" w:type="dxa"/>
               <w:bottom w:w="40" w:type="dxa"/>
-              <w:left w:w="80" w:type="dxa"/>
-              <w:right w:w="80" w:type="dxa"/>
+              <w:left w:w="70" w:type="dxa"/>
+              <w:right w:w="70" w:type="dxa"/>
             </w:tcMar>
             <w:shd w:fill="F8FAFC"/>
             <w:vAlign w:val="center"/>
           </w:tcPr>
           <w:p>
             <w:pPr>
-              <w:spacing w:before="0" w:after="0" w:line="252" w:lineRule="auto"/>
-              <w:jc w:val="left"/>
+              <w:spacing w:before="0" w:after="0" w:line="259" w:lineRule="auto"/>
+              <w:jc w:val="center"/>
             </w:pPr>
             <w:r>
               <w:rPr>
@@ -5447,19 +5442,19 @@
         </w:tc>
         <w:tc>
           <w:tcPr>
-            <w:tcW w:type="dxa" w:w="6581"/>
+            <w:tcW w:type="dxa" w:w="6638"/>
             <w:tcMar>
               <w:top w:w="40" w:type="dxa"/>
               <w:bottom w:w="40" w:type="dxa"/>
-              <w:left w:w="80" w:type="dxa"/>
-              <w:right w:w="80" w:type="dxa"/>
+              <w:left w:w="70" w:type="dxa"/>
+              <w:right w:w="70" w:type="dxa"/>
             </w:tcMar>
             <w:shd w:fill="F8FAFC"/>
             <w:vAlign w:val="center"/>
           </w:tcPr>
           <w:p>
             <w:pPr>
-              <w:spacing w:before="0" w:after="0" w:line="252" w:lineRule="auto"/>
+              <w:spacing w:before="0" w:after="0" w:line="259" w:lineRule="auto"/>
               <w:jc w:val="left"/>
             </w:pPr>
             <w:r>
@@ -5482,15 +5477,15 @@
             <w:tcMar>
               <w:top w:w="40" w:type="dxa"/>
               <w:bottom w:w="40" w:type="dxa"/>
-              <w:left w:w="80" w:type="dxa"/>
-              <w:right w:w="80" w:type="dxa"/>
+              <w:left w:w="70" w:type="dxa"/>
+              <w:right w:w="70" w:type="dxa"/>
             </w:tcMar>
             <w:shd w:fill="FFFFFF"/>
             <w:vAlign w:val="center"/>
           </w:tcPr>
           <w:p>
             <w:pPr>
-              <w:spacing w:before="0" w:after="0" w:line="252" w:lineRule="auto"/>
+              <w:spacing w:before="0" w:after="0" w:line="259" w:lineRule="auto"/>
               <w:jc w:val="left"/>
             </w:pPr>
             <w:r>
@@ -5511,16 +5506,16 @@
             <w:tcMar>
               <w:top w:w="40" w:type="dxa"/>
               <w:bottom w:w="40" w:type="dxa"/>
-              <w:left w:w="80" w:type="dxa"/>
-              <w:right w:w="80" w:type="dxa"/>
+              <w:left w:w="70" w:type="dxa"/>
+              <w:right w:w="70" w:type="dxa"/>
             </w:tcMar>
             <w:shd w:fill="FFFFFF"/>
             <w:vAlign w:val="center"/>
           </w:tcPr>
           <w:p>
             <w:pPr>
-              <w:spacing w:before="0" w:after="0" w:line="252" w:lineRule="auto"/>
-              <w:jc w:val="left"/>
+              <w:spacing w:before="0" w:after="0" w:line="259" w:lineRule="auto"/>
+              <w:jc w:val="center"/>
             </w:pPr>
             <w:r>
               <w:rPr>
@@ -5540,16 +5535,16 @@
             <w:tcMar>
               <w:top w:w="40" w:type="dxa"/>
               <w:bottom w:w="40" w:type="dxa"/>
-              <w:left w:w="80" w:type="dxa"/>
-              <w:right w:w="80" w:type="dxa"/>
+              <w:left w:w="70" w:type="dxa"/>
+              <w:right w:w="70" w:type="dxa"/>
             </w:tcMar>
             <w:shd w:fill="FFFFFF"/>
             <w:vAlign w:val="center"/>
           </w:tcPr>
           <w:p>
             <w:pPr>
-              <w:spacing w:before="0" w:after="0" w:line="252" w:lineRule="auto"/>
-              <w:jc w:val="left"/>
+              <w:spacing w:before="0" w:after="0" w:line="259" w:lineRule="auto"/>
+              <w:jc w:val="center"/>
             </w:pPr>
             <w:r>
               <w:rPr>
@@ -5565,19 +5560,19 @@
         </w:tc>
         <w:tc>
           <w:tcPr>
-            <w:tcW w:type="dxa" w:w="6581"/>
+            <w:tcW w:type="dxa" w:w="6638"/>
             <w:tcMar>
               <w:top w:w="40" w:type="dxa"/>
               <w:bottom w:w="40" w:type="dxa"/>
-              <w:left w:w="80" w:type="dxa"/>
-              <w:right w:w="80" w:type="dxa"/>
+              <w:left w:w="70" w:type="dxa"/>
+              <w:right w:w="70" w:type="dxa"/>
             </w:tcMar>
             <w:shd w:fill="FFFFFF"/>
             <w:vAlign w:val="center"/>
           </w:tcPr>
           <w:p>
             <w:pPr>
-              <w:spacing w:before="0" w:after="0" w:line="252" w:lineRule="auto"/>
+              <w:spacing w:before="0" w:after="0" w:line="259" w:lineRule="auto"/>
               <w:jc w:val="left"/>
             </w:pPr>
             <w:r>
@@ -5600,15 +5595,15 @@
             <w:tcMar>
               <w:top w:w="40" w:type="dxa"/>
               <w:bottom w:w="40" w:type="dxa"/>
-              <w:left w:w="80" w:type="dxa"/>
-              <w:right w:w="80" w:type="dxa"/>
+              <w:left w:w="70" w:type="dxa"/>
+              <w:right w:w="70" w:type="dxa"/>
             </w:tcMar>
             <w:shd w:fill="F8FAFC"/>
             <w:vAlign w:val="center"/>
           </w:tcPr>
           <w:p>
             <w:pPr>
-              <w:spacing w:before="0" w:after="0" w:line="252" w:lineRule="auto"/>
+              <w:spacing w:before="0" w:after="0" w:line="259" w:lineRule="auto"/>
               <w:jc w:val="left"/>
             </w:pPr>
             <w:r>
@@ -5629,16 +5624,16 @@
             <w:tcMar>
               <w:top w:w="40" w:type="dxa"/>
               <w:bottom w:w="40" w:type="dxa"/>
-              <w:left w:w="80" w:type="dxa"/>
-              <w:right w:w="80" w:type="dxa"/>
+              <w:left w:w="70" w:type="dxa"/>
+              <w:right w:w="70" w:type="dxa"/>
             </w:tcMar>
             <w:shd w:fill="F8FAFC"/>
             <w:vAlign w:val="center"/>
           </w:tcPr>
           <w:p>
             <w:pPr>
-              <w:spacing w:before="0" w:after="0" w:line="252" w:lineRule="auto"/>
-              <w:jc w:val="left"/>
+              <w:spacing w:before="0" w:after="0" w:line="259" w:lineRule="auto"/>
+              <w:jc w:val="center"/>
             </w:pPr>
             <w:r>
               <w:rPr>
@@ -5658,16 +5653,16 @@
             <w:tcMar>
               <w:top w:w="40" w:type="dxa"/>
               <w:bottom w:w="40" w:type="dxa"/>
-              <w:left w:w="80" w:type="dxa"/>
-              <w:right w:w="80" w:type="dxa"/>
+              <w:left w:w="70" w:type="dxa"/>
+              <w:right w:w="70" w:type="dxa"/>
             </w:tcMar>
             <w:shd w:fill="F8FAFC"/>
             <w:vAlign w:val="center"/>
           </w:tcPr>
           <w:p>
             <w:pPr>
-              <w:spacing w:before="0" w:after="0" w:line="252" w:lineRule="auto"/>
-              <w:jc w:val="left"/>
+              <w:spacing w:before="0" w:after="0" w:line="259" w:lineRule="auto"/>
+              <w:jc w:val="center"/>
             </w:pPr>
             <w:r>
               <w:rPr>
@@ -5683,19 +5678,19 @@
         </w:tc>
         <w:tc>
           <w:tcPr>
-            <w:tcW w:type="dxa" w:w="6581"/>
+            <w:tcW w:type="dxa" w:w="6638"/>
             <w:tcMar>
               <w:top w:w="40" w:type="dxa"/>
               <w:bottom w:w="40" w:type="dxa"/>
-              <w:left w:w="80" w:type="dxa"/>
-              <w:right w:w="80" w:type="dxa"/>
+              <w:left w:w="70" w:type="dxa"/>
+              <w:right w:w="70" w:type="dxa"/>
             </w:tcMar>
             <w:shd w:fill="F8FAFC"/>
             <w:vAlign w:val="center"/>
           </w:tcPr>
           <w:p>
             <w:pPr>
-              <w:spacing w:before="0" w:after="0" w:line="252" w:lineRule="auto"/>
+              <w:spacing w:before="0" w:after="0" w:line="259" w:lineRule="auto"/>
               <w:jc w:val="left"/>
             </w:pPr>
             <w:r>
@@ -5718,15 +5713,15 @@
             <w:tcMar>
               <w:top w:w="40" w:type="dxa"/>
               <w:bottom w:w="40" w:type="dxa"/>
-              <w:left w:w="80" w:type="dxa"/>
-              <w:right w:w="80" w:type="dxa"/>
+              <w:left w:w="70" w:type="dxa"/>
+              <w:right w:w="70" w:type="dxa"/>
             </w:tcMar>
             <w:shd w:fill="FFFFFF"/>
             <w:vAlign w:val="center"/>
           </w:tcPr>
           <w:p>
             <w:pPr>
-              <w:spacing w:before="0" w:after="0" w:line="252" w:lineRule="auto"/>
+              <w:spacing w:before="0" w:after="0" w:line="259" w:lineRule="auto"/>
               <w:jc w:val="left"/>
             </w:pPr>
             <w:r>
@@ -5747,16 +5742,16 @@
             <w:tcMar>
               <w:top w:w="40" w:type="dxa"/>
               <w:bottom w:w="40" w:type="dxa"/>
-              <w:left w:w="80" w:type="dxa"/>
-              <w:right w:w="80" w:type="dxa"/>
+              <w:left w:w="70" w:type="dxa"/>
+              <w:right w:w="70" w:type="dxa"/>
             </w:tcMar>
             <w:shd w:fill="FFFFFF"/>
             <w:vAlign w:val="center"/>
           </w:tcPr>
           <w:p>
             <w:pPr>
-              <w:spacing w:before="0" w:after="0" w:line="252" w:lineRule="auto"/>
-              <w:jc w:val="left"/>
+              <w:spacing w:before="0" w:after="0" w:line="259" w:lineRule="auto"/>
+              <w:jc w:val="center"/>
             </w:pPr>
             <w:r>
               <w:rPr>
@@ -5776,16 +5771,16 @@
             <w:tcMar>
               <w:top w:w="40" w:type="dxa"/>
               <w:bottom w:w="40" w:type="dxa"/>
-              <w:left w:w="80" w:type="dxa"/>
-              <w:right w:w="80" w:type="dxa"/>
+              <w:left w:w="70" w:type="dxa"/>
+              <w:right w:w="70" w:type="dxa"/>
             </w:tcMar>
             <w:shd w:fill="FFFFFF"/>
             <w:vAlign w:val="center"/>
           </w:tcPr>
           <w:p>
             <w:pPr>
-              <w:spacing w:before="0" w:after="0" w:line="252" w:lineRule="auto"/>
-              <w:jc w:val="left"/>
+              <w:spacing w:before="0" w:after="0" w:line="259" w:lineRule="auto"/>
+              <w:jc w:val="center"/>
             </w:pPr>
             <w:r>
               <w:rPr>
@@ -5801,19 +5796,19 @@
         </w:tc>
         <w:tc>
           <w:tcPr>
-            <w:tcW w:type="dxa" w:w="6581"/>
+            <w:tcW w:type="dxa" w:w="6638"/>
             <w:tcMar>
               <w:top w:w="40" w:type="dxa"/>
               <w:bottom w:w="40" w:type="dxa"/>
-              <w:left w:w="80" w:type="dxa"/>
-              <w:right w:w="80" w:type="dxa"/>
+              <w:left w:w="70" w:type="dxa"/>
+              <w:right w:w="70" w:type="dxa"/>
             </w:tcMar>
             <w:shd w:fill="FFFFFF"/>
             <w:vAlign w:val="center"/>
           </w:tcPr>
           <w:p>
             <w:pPr>
-              <w:spacing w:before="0" w:after="0" w:line="252" w:lineRule="auto"/>
+              <w:spacing w:before="0" w:after="0" w:line="259" w:lineRule="auto"/>
               <w:jc w:val="left"/>
             </w:pPr>
             <w:r>
@@ -5836,15 +5831,15 @@
             <w:tcMar>
               <w:top w:w="40" w:type="dxa"/>
               <w:bottom w:w="40" w:type="dxa"/>
-              <w:left w:w="80" w:type="dxa"/>
-              <w:right w:w="80" w:type="dxa"/>
+              <w:left w:w="70" w:type="dxa"/>
+              <w:right w:w="70" w:type="dxa"/>
             </w:tcMar>
             <w:shd w:fill="F8FAFC"/>
             <w:vAlign w:val="center"/>
           </w:tcPr>
           <w:p>
             <w:pPr>
-              <w:spacing w:before="0" w:after="0" w:line="252" w:lineRule="auto"/>
+              <w:spacing w:before="0" w:after="0" w:line="259" w:lineRule="auto"/>
               <w:jc w:val="left"/>
             </w:pPr>
             <w:r>
@@ -5865,16 +5860,16 @@
             <w:tcMar>
               <w:top w:w="40" w:type="dxa"/>
               <w:bottom w:w="40" w:type="dxa"/>
-              <w:left w:w="80" w:type="dxa"/>
-              <w:right w:w="80" w:type="dxa"/>
+              <w:left w:w="70" w:type="dxa"/>
+              <w:right w:w="70" w:type="dxa"/>
             </w:tcMar>
             <w:shd w:fill="F8FAFC"/>
             <w:vAlign w:val="center"/>
           </w:tcPr>
           <w:p>
             <w:pPr>
-              <w:spacing w:before="0" w:after="0" w:line="252" w:lineRule="auto"/>
-              <w:jc w:val="left"/>
+              <w:spacing w:before="0" w:after="0" w:line="259" w:lineRule="auto"/>
+              <w:jc w:val="center"/>
             </w:pPr>
             <w:r>
               <w:rPr>
@@ -5894,16 +5889,16 @@
             <w:tcMar>
               <w:top w:w="40" w:type="dxa"/>
               <w:bottom w:w="40" w:type="dxa"/>
-              <w:left w:w="80" w:type="dxa"/>
-              <w:right w:w="80" w:type="dxa"/>
+              <w:left w:w="70" w:type="dxa"/>
+              <w:right w:w="70" w:type="dxa"/>
             </w:tcMar>
             <w:shd w:fill="F8FAFC"/>
             <w:vAlign w:val="center"/>
           </w:tcPr>
           <w:p>
             <w:pPr>
-              <w:spacing w:before="0" w:after="0" w:line="252" w:lineRule="auto"/>
-              <w:jc w:val="left"/>
+              <w:spacing w:before="0" w:after="0" w:line="259" w:lineRule="auto"/>
+              <w:jc w:val="center"/>
             </w:pPr>
             <w:r>
               <w:rPr>
@@ -5919,19 +5914,19 @@
         </w:tc>
         <w:tc>
           <w:tcPr>
-            <w:tcW w:type="dxa" w:w="6581"/>
+            <w:tcW w:type="dxa" w:w="6638"/>
             <w:tcMar>
               <w:top w:w="40" w:type="dxa"/>
               <w:bottom w:w="40" w:type="dxa"/>
-              <w:left w:w="80" w:type="dxa"/>
-              <w:right w:w="80" w:type="dxa"/>
+              <w:left w:w="70" w:type="dxa"/>
+              <w:right w:w="70" w:type="dxa"/>
             </w:tcMar>
             <w:shd w:fill="F8FAFC"/>
             <w:vAlign w:val="center"/>
           </w:tcPr>
           <w:p>
             <w:pPr>
-              <w:spacing w:before="0" w:after="0" w:line="252" w:lineRule="auto"/>
+              <w:spacing w:before="0" w:after="0" w:line="259" w:lineRule="auto"/>
               <w:jc w:val="left"/>
             </w:pPr>
             <w:r>
@@ -5954,15 +5949,15 @@
             <w:tcMar>
               <w:top w:w="40" w:type="dxa"/>
               <w:bottom w:w="40" w:type="dxa"/>
-              <w:left w:w="80" w:type="dxa"/>
-              <w:right w:w="80" w:type="dxa"/>
+              <w:left w:w="70" w:type="dxa"/>
+              <w:right w:w="70" w:type="dxa"/>
             </w:tcMar>
             <w:shd w:fill="FFFFFF"/>
             <w:vAlign w:val="center"/>
           </w:tcPr>
           <w:p>
             <w:pPr>
-              <w:spacing w:before="0" w:after="0" w:line="252" w:lineRule="auto"/>
+              <w:spacing w:before="0" w:after="0" w:line="259" w:lineRule="auto"/>
               <w:jc w:val="left"/>
             </w:pPr>
             <w:r>
@@ -5983,16 +5978,16 @@
             <w:tcMar>
               <w:top w:w="40" w:type="dxa"/>
               <w:bottom w:w="40" w:type="dxa"/>
-              <w:left w:w="80" w:type="dxa"/>
-              <w:right w:w="80" w:type="dxa"/>
+              <w:left w:w="70" w:type="dxa"/>
+              <w:right w:w="70" w:type="dxa"/>
             </w:tcMar>
             <w:shd w:fill="FFFFFF"/>
             <w:vAlign w:val="center"/>
           </w:tcPr>
           <w:p>
             <w:pPr>
-              <w:spacing w:before="0" w:after="0" w:line="252" w:lineRule="auto"/>
-              <w:jc w:val="left"/>
+              <w:spacing w:before="0" w:after="0" w:line="259" w:lineRule="auto"/>
+              <w:jc w:val="center"/>
             </w:pPr>
             <w:r>
               <w:rPr>
@@ -6012,16 +6007,16 @@
             <w:tcMar>
               <w:top w:w="40" w:type="dxa"/>
               <w:bottom w:w="40" w:type="dxa"/>
-              <w:left w:w="80" w:type="dxa"/>
-              <w:right w:w="80" w:type="dxa"/>
+              <w:left w:w="70" w:type="dxa"/>
+              <w:right w:w="70" w:type="dxa"/>
             </w:tcMar>
             <w:shd w:fill="FFFFFF"/>
             <w:vAlign w:val="center"/>
           </w:tcPr>
           <w:p>
             <w:pPr>
-              <w:spacing w:before="0" w:after="0" w:line="252" w:lineRule="auto"/>
-              <w:jc w:val="left"/>
+              <w:spacing w:before="0" w:after="0" w:line="259" w:lineRule="auto"/>
+              <w:jc w:val="center"/>
             </w:pPr>
             <w:r>
               <w:rPr>
@@ -6037,19 +6032,19 @@
         </w:tc>
         <w:tc>
           <w:tcPr>
-            <w:tcW w:type="dxa" w:w="6581"/>
+            <w:tcW w:type="dxa" w:w="6638"/>
             <w:tcMar>
               <w:top w:w="40" w:type="dxa"/>
               <w:bottom w:w="40" w:type="dxa"/>
-              <w:left w:w="80" w:type="dxa"/>
-              <w:right w:w="80" w:type="dxa"/>
+              <w:left w:w="70" w:type="dxa"/>
+              <w:right w:w="70" w:type="dxa"/>
             </w:tcMar>
             <w:shd w:fill="FFFFFF"/>
             <w:vAlign w:val="center"/>
           </w:tcPr>
           <w:p>
             <w:pPr>
-              <w:spacing w:before="0" w:after="0" w:line="252" w:lineRule="auto"/>
+              <w:spacing w:before="0" w:after="0" w:line="259" w:lineRule="auto"/>
               <w:jc w:val="left"/>
             </w:pPr>
             <w:r>
@@ -6072,15 +6067,15 @@
             <w:tcMar>
               <w:top w:w="40" w:type="dxa"/>
               <w:bottom w:w="40" w:type="dxa"/>
-              <w:left w:w="80" w:type="dxa"/>
-              <w:right w:w="80" w:type="dxa"/>
+              <w:left w:w="70" w:type="dxa"/>
+              <w:right w:w="70" w:type="dxa"/>
             </w:tcMar>
             <w:shd w:fill="F8FAFC"/>
             <w:vAlign w:val="center"/>
           </w:tcPr>
           <w:p>
             <w:pPr>
-              <w:spacing w:before="0" w:after="0" w:line="252" w:lineRule="auto"/>
+              <w:spacing w:before="0" w:after="0" w:line="259" w:lineRule="auto"/>
               <w:jc w:val="left"/>
             </w:pPr>
             <w:r>
@@ -6101,16 +6096,16 @@
             <w:tcMar>
               <w:top w:w="40" w:type="dxa"/>
               <w:bottom w:w="40" w:type="dxa"/>
-              <w:left w:w="80" w:type="dxa"/>
-              <w:right w:w="80" w:type="dxa"/>
+              <w:left w:w="70" w:type="dxa"/>
+              <w:right w:w="70" w:type="dxa"/>
             </w:tcMar>
             <w:shd w:fill="F8FAFC"/>
             <w:vAlign w:val="center"/>
           </w:tcPr>
           <w:p>
             <w:pPr>
-              <w:spacing w:before="0" w:after="0" w:line="252" w:lineRule="auto"/>
-              <w:jc w:val="left"/>
+              <w:spacing w:before="0" w:after="0" w:line="259" w:lineRule="auto"/>
+              <w:jc w:val="center"/>
             </w:pPr>
             <w:r>
               <w:rPr>
@@ -6130,16 +6125,16 @@
             <w:tcMar>
               <w:top w:w="40" w:type="dxa"/>
               <w:bottom w:w="40" w:type="dxa"/>
-              <w:left w:w="80" w:type="dxa"/>
-              <w:right w:w="80" w:type="dxa"/>
+              <w:left w:w="70" w:type="dxa"/>
+              <w:right w:w="70" w:type="dxa"/>
             </w:tcMar>
             <w:shd w:fill="F8FAFC"/>
             <w:vAlign w:val="center"/>
           </w:tcPr>
           <w:p>
             <w:pPr>
-              <w:spacing w:before="0" w:after="0" w:line="252" w:lineRule="auto"/>
-              <w:jc w:val="left"/>
+              <w:spacing w:before="0" w:after="0" w:line="259" w:lineRule="auto"/>
+              <w:jc w:val="center"/>
             </w:pPr>
             <w:r>
               <w:rPr>
@@ -6155,19 +6150,19 @@
         </w:tc>
         <w:tc>
           <w:tcPr>
-            <w:tcW w:type="dxa" w:w="6581"/>
+            <w:tcW w:type="dxa" w:w="6638"/>
             <w:tcMar>
               <w:top w:w="40" w:type="dxa"/>
               <w:bottom w:w="40" w:type="dxa"/>
-              <w:left w:w="80" w:type="dxa"/>
-              <w:right w:w="80" w:type="dxa"/>
+              <w:left w:w="70" w:type="dxa"/>
+              <w:right w:w="70" w:type="dxa"/>
             </w:tcMar>
             <w:shd w:fill="F8FAFC"/>
             <w:vAlign w:val="center"/>
           </w:tcPr>
           <w:p>
             <w:pPr>
-              <w:spacing w:before="0" w:after="0" w:line="252" w:lineRule="auto"/>
+              <w:spacing w:before="0" w:after="0" w:line="259" w:lineRule="auto"/>
               <w:jc w:val="left"/>
             </w:pPr>
             <w:r>
@@ -6190,15 +6185,15 @@
             <w:tcMar>
               <w:top w:w="40" w:type="dxa"/>
               <w:bottom w:w="40" w:type="dxa"/>
-              <w:left w:w="80" w:type="dxa"/>
-              <w:right w:w="80" w:type="dxa"/>
+              <w:left w:w="70" w:type="dxa"/>
+              <w:right w:w="70" w:type="dxa"/>
             </w:tcMar>
             <w:shd w:fill="FFFFFF"/>
             <w:vAlign w:val="center"/>
           </w:tcPr>
           <w:p>
             <w:pPr>
-              <w:spacing w:before="0" w:after="0" w:line="252" w:lineRule="auto"/>
+              <w:spacing w:before="0" w:after="0" w:line="259" w:lineRule="auto"/>
               <w:jc w:val="left"/>
             </w:pPr>
             <w:r>
@@ -6219,16 +6214,16 @@
             <w:tcMar>
               <w:top w:w="40" w:type="dxa"/>
               <w:bottom w:w="40" w:type="dxa"/>
-              <w:left w:w="80" w:type="dxa"/>
-              <w:right w:w="80" w:type="dxa"/>
+              <w:left w:w="70" w:type="dxa"/>
+              <w:right w:w="70" w:type="dxa"/>
             </w:tcMar>
             <w:shd w:fill="FFFFFF"/>
             <w:vAlign w:val="center"/>
           </w:tcPr>
           <w:p>
             <w:pPr>
-              <w:spacing w:before="0" w:after="0" w:line="252" w:lineRule="auto"/>
-              <w:jc w:val="left"/>
+              <w:spacing w:before="0" w:after="0" w:line="259" w:lineRule="auto"/>
+              <w:jc w:val="center"/>
             </w:pPr>
             <w:r>
               <w:rPr>
@@ -6248,16 +6243,16 @@
             <w:tcMar>
               <w:top w:w="40" w:type="dxa"/>
               <w:bottom w:w="40" w:type="dxa"/>
-              <w:left w:w="80" w:type="dxa"/>
-              <w:right w:w="80" w:type="dxa"/>
+              <w:left w:w="70" w:type="dxa"/>
+              <w:right w:w="70" w:type="dxa"/>
             </w:tcMar>
             <w:shd w:fill="FFFFFF"/>
             <w:vAlign w:val="center"/>
           </w:tcPr>
           <w:p>
             <w:pPr>
-              <w:spacing w:before="0" w:after="0" w:line="252" w:lineRule="auto"/>
-              <w:jc w:val="left"/>
+              <w:spacing w:before="0" w:after="0" w:line="259" w:lineRule="auto"/>
+              <w:jc w:val="center"/>
             </w:pPr>
             <w:r>
               <w:rPr>
@@ -6273,19 +6268,19 @@
         </w:tc>
         <w:tc>
           <w:tcPr>
-            <w:tcW w:type="dxa" w:w="6581"/>
+            <w:tcW w:type="dxa" w:w="6638"/>
             <w:tcMar>
               <w:top w:w="40" w:type="dxa"/>
               <w:bottom w:w="40" w:type="dxa"/>
-              <w:left w:w="80" w:type="dxa"/>
-              <w:right w:w="80" w:type="dxa"/>
+              <w:left w:w="70" w:type="dxa"/>
+              <w:right w:w="70" w:type="dxa"/>
             </w:tcMar>
             <w:shd w:fill="FFFFFF"/>
             <w:vAlign w:val="center"/>
           </w:tcPr>
           <w:p>
             <w:pPr>
-              <w:spacing w:before="0" w:after="0" w:line="252" w:lineRule="auto"/>
+              <w:spacing w:before="0" w:after="0" w:line="259" w:lineRule="auto"/>
               <w:jc w:val="left"/>
             </w:pPr>
             <w:r>
@@ -6308,15 +6303,15 @@
             <w:tcMar>
               <w:top w:w="40" w:type="dxa"/>
               <w:bottom w:w="40" w:type="dxa"/>
-              <w:left w:w="80" w:type="dxa"/>
-              <w:right w:w="80" w:type="dxa"/>
+              <w:left w:w="70" w:type="dxa"/>
+              <w:right w:w="70" w:type="dxa"/>
             </w:tcMar>
             <w:shd w:fill="F8FAFC"/>
             <w:vAlign w:val="center"/>
           </w:tcPr>
           <w:p>
             <w:pPr>
-              <w:spacing w:before="0" w:after="0" w:line="252" w:lineRule="auto"/>
+              <w:spacing w:before="0" w:after="0" w:line="259" w:lineRule="auto"/>
               <w:jc w:val="left"/>
             </w:pPr>
             <w:r>
@@ -6337,16 +6332,16 @@
             <w:tcMar>
               <w:top w:w="40" w:type="dxa"/>
               <w:bottom w:w="40" w:type="dxa"/>
-              <w:left w:w="80" w:type="dxa"/>
-              <w:right w:w="80" w:type="dxa"/>
+              <w:left w:w="70" w:type="dxa"/>
+              <w:right w:w="70" w:type="dxa"/>
             </w:tcMar>
             <w:shd w:fill="F8FAFC"/>
             <w:vAlign w:val="center"/>
           </w:tcPr>
           <w:p>
             <w:pPr>
-              <w:spacing w:before="0" w:after="0" w:line="252" w:lineRule="auto"/>
-              <w:jc w:val="left"/>
+              <w:spacing w:before="0" w:after="0" w:line="259" w:lineRule="auto"/>
+              <w:jc w:val="center"/>
             </w:pPr>
             <w:r>
               <w:rPr>
@@ -6366,16 +6361,16 @@
             <w:tcMar>
               <w:top w:w="40" w:type="dxa"/>
               <w:bottom w:w="40" w:type="dxa"/>
-              <w:left w:w="80" w:type="dxa"/>
-              <w:right w:w="80" w:type="dxa"/>
+              <w:left w:w="70" w:type="dxa"/>
+              <w:right w:w="70" w:type="dxa"/>
             </w:tcMar>
             <w:shd w:fill="F8FAFC"/>
             <w:vAlign w:val="center"/>
           </w:tcPr>
           <w:p>
             <w:pPr>
-              <w:spacing w:before="0" w:after="0" w:line="252" w:lineRule="auto"/>
-              <w:jc w:val="left"/>
+              <w:spacing w:before="0" w:after="0" w:line="259" w:lineRule="auto"/>
+              <w:jc w:val="center"/>
             </w:pPr>
             <w:r>
               <w:rPr>
@@ -6391,19 +6386,19 @@
         </w:tc>
         <w:tc>
           <w:tcPr>
-            <w:tcW w:type="dxa" w:w="6581"/>
+            <w:tcW w:type="dxa" w:w="6638"/>
             <w:tcMar>
               <w:top w:w="40" w:type="dxa"/>
               <w:bottom w:w="40" w:type="dxa"/>
-              <w:left w:w="80" w:type="dxa"/>
-              <w:right w:w="80" w:type="dxa"/>
+              <w:left w:w="70" w:type="dxa"/>
+              <w:right w:w="70" w:type="dxa"/>
             </w:tcMar>
             <w:shd w:fill="F8FAFC"/>
             <w:vAlign w:val="center"/>
           </w:tcPr>
           <w:p>
             <w:pPr>
-              <w:spacing w:before="0" w:after="0" w:line="252" w:lineRule="auto"/>
+              <w:spacing w:before="0" w:after="0" w:line="259" w:lineRule="auto"/>
               <w:jc w:val="left"/>
             </w:pPr>
             <w:r>
@@ -6426,15 +6421,15 @@
             <w:tcMar>
               <w:top w:w="40" w:type="dxa"/>
               <w:bottom w:w="40" w:type="dxa"/>
-              <w:left w:w="80" w:type="dxa"/>
-              <w:right w:w="80" w:type="dxa"/>
+              <w:left w:w="70" w:type="dxa"/>
+              <w:right w:w="70" w:type="dxa"/>
             </w:tcMar>
             <w:shd w:fill="FFFFFF"/>
             <w:vAlign w:val="center"/>
           </w:tcPr>
           <w:p>
             <w:pPr>
-              <w:spacing w:before="0" w:after="0" w:line="252" w:lineRule="auto"/>
+              <w:spacing w:before="0" w:after="0" w:line="259" w:lineRule="auto"/>
               <w:jc w:val="left"/>
             </w:pPr>
             <w:r>
@@ -6455,16 +6450,16 @@
             <w:tcMar>
               <w:top w:w="40" w:type="dxa"/>
               <w:bottom w:w="40" w:type="dxa"/>
-              <w:left w:w="80" w:type="dxa"/>
-              <w:right w:w="80" w:type="dxa"/>
+              <w:left w:w="70" w:type="dxa"/>
+              <w:right w:w="70" w:type="dxa"/>
             </w:tcMar>
             <w:shd w:fill="FFFFFF"/>
             <w:vAlign w:val="center"/>
           </w:tcPr>
           <w:p>
             <w:pPr>
-              <w:spacing w:before="0" w:after="0" w:line="252" w:lineRule="auto"/>
-              <w:jc w:val="left"/>
+              <w:spacing w:before="0" w:after="0" w:line="259" w:lineRule="auto"/>
+              <w:jc w:val="center"/>
             </w:pPr>
             <w:r>
               <w:rPr>
@@ -6484,16 +6479,16 @@
             <w:tcMar>
               <w:top w:w="40" w:type="dxa"/>
               <w:bottom w:w="40" w:type="dxa"/>
-              <w:left w:w="80" w:type="dxa"/>
-              <w:right w:w="80" w:type="dxa"/>
+              <w:left w:w="70" w:type="dxa"/>
+              <w:right w:w="70" w:type="dxa"/>
             </w:tcMar>
             <w:shd w:fill="FFFFFF"/>
             <w:vAlign w:val="center"/>
           </w:tcPr>
           <w:p>
             <w:pPr>
-              <w:spacing w:before="0" w:after="0" w:line="252" w:lineRule="auto"/>
-              <w:jc w:val="left"/>
+              <w:spacing w:before="0" w:after="0" w:line="259" w:lineRule="auto"/>
+              <w:jc w:val="center"/>
             </w:pPr>
             <w:r>
               <w:rPr>
@@ -6509,19 +6504,19 @@
         </w:tc>
         <w:tc>
           <w:tcPr>
-            <w:tcW w:type="dxa" w:w="6581"/>
+            <w:tcW w:type="dxa" w:w="6638"/>
             <w:tcMar>
               <w:top w:w="40" w:type="dxa"/>
               <w:bottom w:w="40" w:type="dxa"/>
-              <w:left w:w="80" w:type="dxa"/>
-              <w:right w:w="80" w:type="dxa"/>
+              <w:left w:w="70" w:type="dxa"/>
+              <w:right w:w="70" w:type="dxa"/>
             </w:tcMar>
             <w:shd w:fill="FFFFFF"/>
             <w:vAlign w:val="center"/>
           </w:tcPr>
           <w:p>
             <w:pPr>
-              <w:spacing w:before="0" w:after="0" w:line="252" w:lineRule="auto"/>
+              <w:spacing w:before="0" w:after="0" w:line="259" w:lineRule="auto"/>
               <w:jc w:val="left"/>
             </w:pPr>
             <w:r>
@@ -6568,10 +6563,10 @@
         </w:tblBorders>
       </w:tblPr>
       <w:tblGrid>
-        <w:gridCol w:w="2689"/>
-        <w:gridCol w:w="2689"/>
-        <w:gridCol w:w="2689"/>
-        <w:gridCol w:w="2689"/>
+        <w:gridCol w:w="2704"/>
+        <w:gridCol w:w="2704"/>
+        <w:gridCol w:w="2704"/>
+        <w:gridCol w:w="2704"/>
       </w:tblGrid>
       <w:tr>
         <w:tc>
@@ -6580,15 +6575,15 @@
             <w:tcMar>
               <w:top w:w="40" w:type="dxa"/>
               <w:bottom w:w="40" w:type="dxa"/>
-              <w:left w:w="80" w:type="dxa"/>
-              <w:right w:w="80" w:type="dxa"/>
+              <w:left w:w="70" w:type="dxa"/>
+              <w:right w:w="70" w:type="dxa"/>
             </w:tcMar>
             <w:shd w:fill="0F294A"/>
             <w:vAlign w:val="center"/>
           </w:tcPr>
           <w:p>
             <w:pPr>
-              <w:spacing w:before="0" w:after="0" w:line="252" w:lineRule="auto"/>
+              <w:spacing w:before="0" w:after="0" w:line="259" w:lineRule="auto"/>
               <w:jc w:val="left"/>
             </w:pPr>
             <w:r>
@@ -6609,16 +6604,16 @@
             <w:tcMar>
               <w:top w:w="40" w:type="dxa"/>
               <w:bottom w:w="40" w:type="dxa"/>
-              <w:left w:w="80" w:type="dxa"/>
-              <w:right w:w="80" w:type="dxa"/>
+              <w:left w:w="70" w:type="dxa"/>
+              <w:right w:w="70" w:type="dxa"/>
             </w:tcMar>
             <w:shd w:fill="0F294A"/>
             <w:vAlign w:val="center"/>
           </w:tcPr>
           <w:p>
             <w:pPr>
-              <w:spacing w:before="0" w:after="0" w:line="252" w:lineRule="auto"/>
-              <w:jc w:val="left"/>
+              <w:spacing w:before="0" w:after="0" w:line="259" w:lineRule="auto"/>
+              <w:jc w:val="center"/>
             </w:pPr>
             <w:r>
               <w:rPr>
@@ -6638,15 +6633,15 @@
             <w:tcMar>
               <w:top w:w="40" w:type="dxa"/>
               <w:bottom w:w="40" w:type="dxa"/>
-              <w:left w:w="80" w:type="dxa"/>
-              <w:right w:w="80" w:type="dxa"/>
+              <w:left w:w="70" w:type="dxa"/>
+              <w:right w:w="70" w:type="dxa"/>
             </w:tcMar>
             <w:shd w:fill="0F294A"/>
             <w:vAlign w:val="center"/>
           </w:tcPr>
           <w:p>
             <w:pPr>
-              <w:spacing w:before="0" w:after="0" w:line="252" w:lineRule="auto"/>
+              <w:spacing w:before="0" w:after="0" w:line="259" w:lineRule="auto"/>
               <w:jc w:val="left"/>
             </w:pPr>
             <w:r>
@@ -6663,19 +6658,19 @@
         </w:tc>
         <w:tc>
           <w:tcPr>
-            <w:tcW w:type="dxa" w:w="3341"/>
+            <w:tcW w:type="dxa" w:w="3398"/>
             <w:tcMar>
               <w:top w:w="40" w:type="dxa"/>
               <w:bottom w:w="40" w:type="dxa"/>
-              <w:left w:w="80" w:type="dxa"/>
-              <w:right w:w="80" w:type="dxa"/>
+              <w:left w:w="70" w:type="dxa"/>
+              <w:right w:w="70" w:type="dxa"/>
             </w:tcMar>
             <w:shd w:fill="0F294A"/>
             <w:vAlign w:val="center"/>
           </w:tcPr>
           <w:p>
             <w:pPr>
-              <w:spacing w:before="0" w:after="0" w:line="252" w:lineRule="auto"/>
+              <w:spacing w:before="0" w:after="0" w:line="259" w:lineRule="auto"/>
               <w:jc w:val="left"/>
             </w:pPr>
             <w:r>
@@ -6698,15 +6693,15 @@
             <w:tcMar>
               <w:top w:w="40" w:type="dxa"/>
               <w:bottom w:w="40" w:type="dxa"/>
-              <w:left w:w="80" w:type="dxa"/>
-              <w:right w:w="80" w:type="dxa"/>
+              <w:left w:w="70" w:type="dxa"/>
+              <w:right w:w="70" w:type="dxa"/>
             </w:tcMar>
             <w:shd w:fill="FFFFFF"/>
             <w:vAlign w:val="center"/>
           </w:tcPr>
           <w:p>
             <w:pPr>
-              <w:spacing w:before="0" w:after="0" w:line="252" w:lineRule="auto"/>
+              <w:spacing w:before="0" w:after="0" w:line="259" w:lineRule="auto"/>
               <w:jc w:val="left"/>
             </w:pPr>
             <w:r>
@@ -6727,16 +6722,16 @@
             <w:tcMar>
               <w:top w:w="40" w:type="dxa"/>
               <w:bottom w:w="40" w:type="dxa"/>
-              <w:left w:w="80" w:type="dxa"/>
-              <w:right w:w="80" w:type="dxa"/>
+              <w:left w:w="70" w:type="dxa"/>
+              <w:right w:w="70" w:type="dxa"/>
             </w:tcMar>
             <w:shd w:fill="FFFFFF"/>
             <w:vAlign w:val="center"/>
           </w:tcPr>
           <w:p>
             <w:pPr>
-              <w:spacing w:before="0" w:after="0" w:line="252" w:lineRule="auto"/>
-              <w:jc w:val="left"/>
+              <w:spacing w:before="0" w:after="0" w:line="259" w:lineRule="auto"/>
+              <w:jc w:val="center"/>
             </w:pPr>
             <w:r>
               <w:rPr>
@@ -6756,15 +6751,15 @@
             <w:tcMar>
               <w:top w:w="40" w:type="dxa"/>
               <w:bottom w:w="40" w:type="dxa"/>
-              <w:left w:w="80" w:type="dxa"/>
-              <w:right w:w="80" w:type="dxa"/>
+              <w:left w:w="70" w:type="dxa"/>
+              <w:right w:w="70" w:type="dxa"/>
             </w:tcMar>
             <w:shd w:fill="FFFFFF"/>
             <w:vAlign w:val="center"/>
           </w:tcPr>
           <w:p>
             <w:pPr>
-              <w:spacing w:before="0" w:after="0" w:line="252" w:lineRule="auto"/>
+              <w:spacing w:before="0" w:after="0" w:line="259" w:lineRule="auto"/>
               <w:jc w:val="left"/>
             </w:pPr>
             <w:r>
@@ -6781,19 +6776,19 @@
         </w:tc>
         <w:tc>
           <w:tcPr>
-            <w:tcW w:type="dxa" w:w="3341"/>
+            <w:tcW w:type="dxa" w:w="3398"/>
             <w:tcMar>
               <w:top w:w="40" w:type="dxa"/>
               <w:bottom w:w="40" w:type="dxa"/>
-              <w:left w:w="80" w:type="dxa"/>
-              <w:right w:w="80" w:type="dxa"/>
+              <w:left w:w="70" w:type="dxa"/>
+              <w:right w:w="70" w:type="dxa"/>
             </w:tcMar>
             <w:shd w:fill="FFFFFF"/>
             <w:vAlign w:val="center"/>
           </w:tcPr>
           <w:p>
             <w:pPr>
-              <w:spacing w:before="0" w:after="0" w:line="252" w:lineRule="auto"/>
+              <w:spacing w:before="0" w:after="0" w:line="259" w:lineRule="auto"/>
               <w:jc w:val="left"/>
             </w:pPr>
             <w:r>
@@ -6816,15 +6811,15 @@
             <w:tcMar>
               <w:top w:w="40" w:type="dxa"/>
               <w:bottom w:w="40" w:type="dxa"/>
-              <w:left w:w="80" w:type="dxa"/>
-              <w:right w:w="80" w:type="dxa"/>
+              <w:left w:w="70" w:type="dxa"/>
+              <w:right w:w="70" w:type="dxa"/>
             </w:tcMar>
             <w:shd w:fill="F8FAFC"/>
             <w:vAlign w:val="center"/>
           </w:tcPr>
           <w:p>
             <w:pPr>
-              <w:spacing w:before="0" w:after="0" w:line="252" w:lineRule="auto"/>
+              <w:spacing w:before="0" w:after="0" w:line="259" w:lineRule="auto"/>
               <w:jc w:val="left"/>
             </w:pPr>
             <w:r>
@@ -6845,16 +6840,16 @@
             <w:tcMar>
               <w:top w:w="40" w:type="dxa"/>
               <w:bottom w:w="40" w:type="dxa"/>
-              <w:left w:w="80" w:type="dxa"/>
-              <w:right w:w="80" w:type="dxa"/>
+              <w:left w:w="70" w:type="dxa"/>
+              <w:right w:w="70" w:type="dxa"/>
             </w:tcMar>
             <w:shd w:fill="F8FAFC"/>
             <w:vAlign w:val="center"/>
           </w:tcPr>
           <w:p>
             <w:pPr>
-              <w:spacing w:before="0" w:after="0" w:line="252" w:lineRule="auto"/>
-              <w:jc w:val="left"/>
+              <w:spacing w:before="0" w:after="0" w:line="259" w:lineRule="auto"/>
+              <w:jc w:val="center"/>
             </w:pPr>
             <w:r>
               <w:rPr>
@@ -6874,15 +6869,15 @@
             <w:tcMar>
               <w:top w:w="40" w:type="dxa"/>
               <w:bottom w:w="40" w:type="dxa"/>
-              <w:left w:w="80" w:type="dxa"/>
-              <w:right w:w="80" w:type="dxa"/>
+              <w:left w:w="70" w:type="dxa"/>
+              <w:right w:w="70" w:type="dxa"/>
             </w:tcMar>
             <w:shd w:fill="F8FAFC"/>
             <w:vAlign w:val="center"/>
           </w:tcPr>
           <w:p>
             <w:pPr>
-              <w:spacing w:before="0" w:after="0" w:line="252" w:lineRule="auto"/>
+              <w:spacing w:before="0" w:after="0" w:line="259" w:lineRule="auto"/>
               <w:jc w:val="left"/>
             </w:pPr>
             <w:r>
@@ -6899,19 +6894,19 @@
         </w:tc>
         <w:tc>
           <w:tcPr>
-            <w:tcW w:type="dxa" w:w="3341"/>
+            <w:tcW w:type="dxa" w:w="3398"/>
             <w:tcMar>
               <w:top w:w="40" w:type="dxa"/>
               <w:bottom w:w="40" w:type="dxa"/>
-              <w:left w:w="80" w:type="dxa"/>
-              <w:right w:w="80" w:type="dxa"/>
+              <w:left w:w="70" w:type="dxa"/>
+              <w:right w:w="70" w:type="dxa"/>
             </w:tcMar>
             <w:shd w:fill="F8FAFC"/>
             <w:vAlign w:val="center"/>
           </w:tcPr>
           <w:p>
             <w:pPr>
-              <w:spacing w:before="0" w:after="0" w:line="252" w:lineRule="auto"/>
+              <w:spacing w:before="0" w:after="0" w:line="259" w:lineRule="auto"/>
               <w:jc w:val="left"/>
             </w:pPr>
             <w:r>
@@ -6934,15 +6929,15 @@
             <w:tcMar>
               <w:top w:w="40" w:type="dxa"/>
               <w:bottom w:w="40" w:type="dxa"/>
-              <w:left w:w="80" w:type="dxa"/>
-              <w:right w:w="80" w:type="dxa"/>
+              <w:left w:w="70" w:type="dxa"/>
+              <w:right w:w="70" w:type="dxa"/>
             </w:tcMar>
             <w:shd w:fill="FFFFFF"/>
             <w:vAlign w:val="center"/>
           </w:tcPr>
           <w:p>
             <w:pPr>
-              <w:spacing w:before="0" w:after="0" w:line="252" w:lineRule="auto"/>
+              <w:spacing w:before="0" w:after="0" w:line="259" w:lineRule="auto"/>
               <w:jc w:val="left"/>
             </w:pPr>
             <w:r>
@@ -6963,16 +6958,16 @@
             <w:tcMar>
               <w:top w:w="40" w:type="dxa"/>
               <w:bottom w:w="40" w:type="dxa"/>
-              <w:left w:w="80" w:type="dxa"/>
-              <w:right w:w="80" w:type="dxa"/>
+              <w:left w:w="70" w:type="dxa"/>
+              <w:right w:w="70" w:type="dxa"/>
             </w:tcMar>
             <w:shd w:fill="FFFFFF"/>
             <w:vAlign w:val="center"/>
           </w:tcPr>
           <w:p>
             <w:pPr>
-              <w:spacing w:before="0" w:after="0" w:line="252" w:lineRule="auto"/>
-              <w:jc w:val="left"/>
+              <w:spacing w:before="0" w:after="0" w:line="259" w:lineRule="auto"/>
+              <w:jc w:val="center"/>
             </w:pPr>
             <w:r>
               <w:rPr>
@@ -6992,15 +6987,15 @@
             <w:tcMar>
               <w:top w:w="40" w:type="dxa"/>
               <w:bottom w:w="40" w:type="dxa"/>
-              <w:left w:w="80" w:type="dxa"/>
-              <w:right w:w="80" w:type="dxa"/>
+              <w:left w:w="70" w:type="dxa"/>
+              <w:right w:w="70" w:type="dxa"/>
             </w:tcMar>
             <w:shd w:fill="FFFFFF"/>
             <w:vAlign w:val="center"/>
           </w:tcPr>
           <w:p>
             <w:pPr>
-              <w:spacing w:before="0" w:after="0" w:line="252" w:lineRule="auto"/>
+              <w:spacing w:before="0" w:after="0" w:line="259" w:lineRule="auto"/>
               <w:jc w:val="left"/>
             </w:pPr>
             <w:r>
@@ -7017,19 +7012,19 @@
         </w:tc>
         <w:tc>
           <w:tcPr>
-            <w:tcW w:type="dxa" w:w="3341"/>
+            <w:tcW w:type="dxa" w:w="3398"/>
             <w:tcMar>
               <w:top w:w="40" w:type="dxa"/>
               <w:bottom w:w="40" w:type="dxa"/>
-              <w:left w:w="80" w:type="dxa"/>
-              <w:right w:w="80" w:type="dxa"/>
+              <w:left w:w="70" w:type="dxa"/>
+              <w:right w:w="70" w:type="dxa"/>
             </w:tcMar>
             <w:shd w:fill="FFFFFF"/>
             <w:vAlign w:val="center"/>
           </w:tcPr>
           <w:p>
             <w:pPr>
-              <w:spacing w:before="0" w:after="0" w:line="252" w:lineRule="auto"/>
+              <w:spacing w:before="0" w:after="0" w:line="259" w:lineRule="auto"/>
               <w:jc w:val="left"/>
             </w:pPr>
             <w:r>
@@ -7048,7 +7043,7 @@
     </w:tbl>
     <w:sectPr>
       <w:pgSz w:w="11909" w:h="16834"/>
-      <w:pgMar w:top="504" w:right="576" w:bottom="504" w:left="576" w:header="720" w:footer="720" w:gutter="0"/>
+      <w:pgMar w:top="504" w:right="547" w:bottom="504" w:left="547" w:header="720" w:footer="720" w:gutter="0"/>
       <w:cols w:space="720"/>
       <w:docGrid w:linePitch="360"/>
     </w:sectPr>

</xml_diff>